<commit_message>
Lesson 66 Out of stock check in CodesWear.com
</commit_message>
<xml_diff>
--- a/Notes3.docx
+++ b/Notes3.docx
@@ -4883,12 +4883,793 @@
       </w:r>
     </w:p>
     <w:p>
-      <w:pPr>
-        <w:rPr>
-          <w:lang w:val="en-US"/>
-        </w:rPr>
-      </w:pPr>
-    </w:p>
+      <w:r>
+        <w:t xml:space="preserve">If you keep inventory of </w:t>
+      </w:r>
+      <w:r>
+        <w:t>things then there is a high chance that after some time the thi</w:t>
+      </w:r>
+      <w:r>
+        <w:t>ng</w:t>
+      </w:r>
+      <w:r>
+        <w:t>s got out of stock.</w:t>
+      </w:r>
+      <w:r>
+        <w:t xml:space="preserve"> If everything got sold </w:t>
+      </w:r>
+      <w:proofErr w:type="gramStart"/>
+      <w:r>
+        <w:t>our</w:t>
+      </w:r>
+      <w:proofErr w:type="gramEnd"/>
+      <w:r>
+        <w:t xml:space="preserve"> then off course it will be out of stock. </w:t>
+      </w:r>
+      <w:r>
+        <w:t xml:space="preserve">And in such cases of you are still showing the items </w:t>
+      </w:r>
+      <w:r>
+        <w:t>and people are still able to buying it</w:t>
+      </w:r>
+      <w:r>
+        <w:t xml:space="preserve"> then it is a very big problem because </w:t>
+      </w:r>
+      <w:r>
+        <w:t xml:space="preserve">you will not have stock </w:t>
+      </w:r>
+      <w:r>
+        <w:t xml:space="preserve">and user will put the order and if you cancel everything then it will not be good for </w:t>
+      </w:r>
+      <w:r>
+        <w:t>user</w:t>
+      </w:r>
+      <w:r>
+        <w:t xml:space="preserve">.  As the user is buying items </w:t>
+      </w:r>
+      <w:r>
+        <w:t>and we will</w:t>
+      </w:r>
+      <w:r>
+        <w:t xml:space="preserve"> </w:t>
+      </w:r>
+      <w:r>
+        <w:t xml:space="preserve">deduct from one available </w:t>
+      </w:r>
+      <w:r>
+        <w:t xml:space="preserve">quantity </w:t>
+      </w:r>
+      <w:r>
+        <w:t xml:space="preserve">whatever number they have bought </w:t>
+      </w:r>
+      <w:r>
+        <w:t>and if available quan</w:t>
+      </w:r>
+      <w:r>
+        <w:t xml:space="preserve">tity is </w:t>
+      </w:r>
+      <w:r>
+        <w:t xml:space="preserve">0 then </w:t>
+      </w:r>
+      <w:r>
+        <w:t>w</w:t>
+      </w:r>
+      <w:r>
+        <w:t xml:space="preserve">e will show </w:t>
+      </w:r>
+      <w:proofErr w:type="gramStart"/>
+      <w:r>
+        <w:t>our</w:t>
+      </w:r>
+      <w:proofErr w:type="gramEnd"/>
+      <w:r>
+        <w:t xml:space="preserve"> of stock</w:t>
+      </w:r>
+      <w:r>
+        <w:t xml:space="preserve"> in ou</w:t>
+      </w:r>
+      <w:r>
+        <w:t>r</w:t>
+      </w:r>
+      <w:r>
+        <w:t xml:space="preserve"> product page. </w:t>
+      </w:r>
+    </w:p>
+    <w:p>
+      <w:pPr>
+        <w:rPr>
+          <w:b/>
+          <w:bCs/>
+          <w:color w:val="EE0000"/>
+        </w:rPr>
+      </w:pPr>
+      <w:r>
+        <w:rPr>
+          <w:b/>
+          <w:bCs/>
+          <w:color w:val="EE0000"/>
+        </w:rPr>
+        <w:t xml:space="preserve">If any person </w:t>
+      </w:r>
+      <w:proofErr w:type="gramStart"/>
+      <w:r>
+        <w:rPr>
+          <w:b/>
+          <w:bCs/>
+          <w:color w:val="EE0000"/>
+        </w:rPr>
+        <w:t>try</w:t>
+      </w:r>
+      <w:proofErr w:type="gramEnd"/>
+      <w:r>
+        <w:rPr>
+          <w:b/>
+          <w:bCs/>
+          <w:color w:val="EE0000"/>
+        </w:rPr>
+        <w:t xml:space="preserve"> to tamper the data in local storage or </w:t>
+      </w:r>
+      <w:r>
+        <w:rPr>
+          <w:b/>
+          <w:bCs/>
+          <w:color w:val="EE0000"/>
+        </w:rPr>
+        <w:t>the price get changed in backend for some genuin</w:t>
+      </w:r>
+      <w:r>
+        <w:rPr>
+          <w:b/>
+          <w:bCs/>
+          <w:color w:val="EE0000"/>
+        </w:rPr>
+        <w:t>e reason (maybe backend changed by the</w:t>
+      </w:r>
+      <w:r>
+        <w:rPr>
+          <w:b/>
+          <w:bCs/>
+          <w:color w:val="EE0000"/>
+        </w:rPr>
+        <w:t xml:space="preserve"> </w:t>
+      </w:r>
+      <w:proofErr w:type="gramStart"/>
+      <w:r>
+        <w:rPr>
+          <w:b/>
+          <w:bCs/>
+          <w:color w:val="EE0000"/>
+        </w:rPr>
+        <w:t>merchant(</w:t>
+      </w:r>
+      <w:proofErr w:type="gramEnd"/>
+      <w:r>
+        <w:rPr>
+          <w:b/>
+          <w:bCs/>
+          <w:color w:val="EE0000"/>
+        </w:rPr>
+        <w:t>who knows)</w:t>
+      </w:r>
+      <w:r>
+        <w:rPr>
+          <w:b/>
+          <w:bCs/>
+          <w:color w:val="EE0000"/>
+        </w:rPr>
+        <w:t>)</w:t>
+      </w:r>
+      <w:r>
+        <w:rPr>
+          <w:b/>
+          <w:bCs/>
+          <w:color w:val="EE0000"/>
+        </w:rPr>
+        <w:t xml:space="preserve"> then we will clear the cart from local storage</w:t>
+      </w:r>
+    </w:p>
+    <w:p>
+      <w:r>
+        <w:t>On</w:t>
+      </w:r>
+      <w:r>
+        <w:t>e</w:t>
+      </w:r>
+      <w:r>
+        <w:t xml:space="preserve"> thing to notice if we buy with some other email then it will not e </w:t>
+      </w:r>
+      <w:proofErr w:type="spellStart"/>
+      <w:r>
+        <w:t>showin</w:t>
+      </w:r>
+      <w:proofErr w:type="spellEnd"/>
+      <w:r>
+        <w:t xml:space="preserve"> in orders </w:t>
+      </w:r>
+      <w:r>
+        <w:t>and the user will not be able to t</w:t>
+      </w:r>
+      <w:r>
+        <w:t>r</w:t>
+      </w:r>
+      <w:r>
+        <w:t xml:space="preserve">ack from their </w:t>
+      </w:r>
+      <w:r>
+        <w:t xml:space="preserve">email </w:t>
+      </w:r>
+      <w:r>
+        <w:t xml:space="preserve">id </w:t>
+      </w:r>
+      <w:r>
+        <w:t xml:space="preserve">So what we will do is that if the person is logged in then email value will not change </w:t>
+      </w:r>
+    </w:p>
+    <w:p>
+      <w:pPr>
+        <w:rPr>
+          <w:b/>
+          <w:bCs/>
+        </w:rPr>
+      </w:pPr>
+      <w:proofErr w:type="gramStart"/>
+      <w:r>
+        <w:rPr>
+          <w:b/>
+          <w:bCs/>
+        </w:rPr>
+        <w:t>so</w:t>
+      </w:r>
+      <w:proofErr w:type="gramEnd"/>
+      <w:r>
+        <w:rPr>
+          <w:b/>
+          <w:bCs/>
+        </w:rPr>
+        <w:t xml:space="preserve"> child useEffect runs first(</w:t>
+      </w:r>
+      <w:proofErr w:type="spellStart"/>
+      <w:r>
+        <w:rPr>
+          <w:b/>
+          <w:bCs/>
+        </w:rPr>
+        <w:t>onelienr</w:t>
+      </w:r>
+      <w:proofErr w:type="spellEnd"/>
+      <w:r>
+        <w:rPr>
+          <w:b/>
+          <w:bCs/>
+        </w:rPr>
+        <w:t>)</w:t>
+      </w:r>
+    </w:p>
+    <w:p>
+      <w:r>
+        <w:rPr>
+          <w:rFonts w:ascii="Segoe UI Emoji" w:hAnsi="Segoe UI Emoji" w:cs="Segoe UI Emoji"/>
+        </w:rPr>
+        <w:t>✔️</w:t>
+      </w:r>
+      <w:r>
+        <w:t xml:space="preserve"> Yes—after rendering, useEffect of child components runs before the parent’s useEffect.</w:t>
+      </w:r>
+    </w:p>
+    <w:p>
+      <w:pPr>
+        <w:rPr>
+          <w:b/>
+          <w:bCs/>
+        </w:rPr>
+      </w:pPr>
+      <w:proofErr w:type="gramStart"/>
+      <w:r>
+        <w:rPr>
+          <w:b/>
+          <w:bCs/>
+        </w:rPr>
+        <w:t>so</w:t>
+      </w:r>
+      <w:proofErr w:type="gramEnd"/>
+      <w:r>
+        <w:rPr>
+          <w:b/>
+          <w:bCs/>
+        </w:rPr>
+        <w:t xml:space="preserve"> order matters here(</w:t>
+      </w:r>
+      <w:proofErr w:type="spellStart"/>
+      <w:r>
+        <w:rPr>
+          <w:b/>
+          <w:bCs/>
+        </w:rPr>
+        <w:t>oneliner</w:t>
+      </w:r>
+      <w:proofErr w:type="spellEnd"/>
+      <w:r>
+        <w:rPr>
+          <w:b/>
+          <w:bCs/>
+        </w:rPr>
+        <w:t>)</w:t>
+      </w:r>
+    </w:p>
+    <w:p>
+      <w:r>
+        <w:rPr>
+          <w:rFonts w:ascii="Segoe UI Emoji" w:hAnsi="Segoe UI Emoji" w:cs="Segoe UI Emoji"/>
+        </w:rPr>
+        <w:t>✔️</w:t>
+      </w:r>
+      <w:r>
+        <w:t xml:space="preserve"> Yes—the component hierarchy/order matters, so child useEffect runs before parent useEffect.</w:t>
+      </w:r>
+    </w:p>
+    <w:p>
+      <w:pPr>
+        <w:rPr>
+          <w:b/>
+          <w:bCs/>
+        </w:rPr>
+      </w:pPr>
+      <w:r>
+        <w:rPr>
+          <w:b/>
+          <w:bCs/>
+        </w:rPr>
+        <w:t>i</w:t>
+      </w:r>
+      <w:r>
+        <w:rPr>
+          <w:b/>
+          <w:bCs/>
+        </w:rPr>
+        <w:t>f</w:t>
+      </w:r>
+      <w:r>
+        <w:rPr>
+          <w:b/>
+          <w:bCs/>
+        </w:rPr>
+        <w:t xml:space="preserve"> the compon</w:t>
+      </w:r>
+      <w:r>
+        <w:rPr>
+          <w:b/>
+          <w:bCs/>
+        </w:rPr>
+        <w:t>e</w:t>
+      </w:r>
+      <w:r>
+        <w:rPr>
+          <w:b/>
+          <w:bCs/>
+        </w:rPr>
+        <w:t>n</w:t>
+      </w:r>
+      <w:r>
+        <w:rPr>
+          <w:b/>
+          <w:bCs/>
+        </w:rPr>
+        <w:t>t</w:t>
+      </w:r>
+      <w:r>
+        <w:rPr>
+          <w:b/>
+          <w:bCs/>
+        </w:rPr>
+        <w:t xml:space="preserve"> </w:t>
+      </w:r>
+      <w:proofErr w:type="gramStart"/>
+      <w:r>
+        <w:rPr>
+          <w:b/>
+          <w:bCs/>
+        </w:rPr>
+        <w:t>get</w:t>
+      </w:r>
+      <w:proofErr w:type="gramEnd"/>
+      <w:r>
+        <w:rPr>
+          <w:b/>
+          <w:bCs/>
+        </w:rPr>
+        <w:t xml:space="preserve"> re</w:t>
+      </w:r>
+      <w:r>
+        <w:rPr>
+          <w:b/>
+          <w:bCs/>
+        </w:rPr>
+        <w:t xml:space="preserve"> </w:t>
+      </w:r>
+      <w:r>
+        <w:rPr>
+          <w:b/>
+          <w:bCs/>
+        </w:rPr>
+        <w:t>executed then state value shou</w:t>
+      </w:r>
+      <w:r>
+        <w:rPr>
+          <w:b/>
+          <w:bCs/>
+        </w:rPr>
+        <w:t>l</w:t>
+      </w:r>
+      <w:r>
+        <w:rPr>
+          <w:b/>
+          <w:bCs/>
+        </w:rPr>
+        <w:t>d be default (</w:t>
+      </w:r>
+      <w:proofErr w:type="spellStart"/>
+      <w:r>
+        <w:rPr>
+          <w:b/>
+          <w:bCs/>
+        </w:rPr>
+        <w:t>onelin</w:t>
+      </w:r>
+      <w:r>
+        <w:rPr>
+          <w:b/>
+          <w:bCs/>
+        </w:rPr>
+        <w:t>er</w:t>
+      </w:r>
+      <w:proofErr w:type="spellEnd"/>
+      <w:r>
+        <w:rPr>
+          <w:b/>
+          <w:bCs/>
+        </w:rPr>
+        <w:t>)</w:t>
+      </w:r>
+    </w:p>
+    <w:p>
+      <w:r>
+        <w:rPr>
+          <w:rFonts w:ascii="Segoe UI Emoji" w:hAnsi="Segoe UI Emoji" w:cs="Segoe UI Emoji"/>
+        </w:rPr>
+        <w:t>❌</w:t>
+      </w:r>
+      <w:r>
+        <w:t xml:space="preserve"> No—on re-render the component function re-executes, but React preserves the existing state instead of resetting it to the default value.</w:t>
+      </w:r>
+    </w:p>
+    <w:p>
+      <w:pPr>
+        <w:rPr>
+          <w:b/>
+          <w:bCs/>
+        </w:rPr>
+      </w:pPr>
+      <w:r>
+        <w:rPr>
+          <w:b/>
+          <w:bCs/>
+        </w:rPr>
+        <w:t>i</w:t>
+      </w:r>
+      <w:r>
+        <w:rPr>
+          <w:b/>
+          <w:bCs/>
+        </w:rPr>
+        <w:t>s</w:t>
+      </w:r>
+      <w:r>
+        <w:rPr>
+          <w:b/>
+          <w:bCs/>
+        </w:rPr>
+        <w:t xml:space="preserve"> child compon</w:t>
+      </w:r>
+      <w:r>
+        <w:rPr>
+          <w:b/>
+          <w:bCs/>
+        </w:rPr>
+        <w:t>en</w:t>
+      </w:r>
+      <w:r>
+        <w:rPr>
+          <w:b/>
+          <w:bCs/>
+        </w:rPr>
+        <w:t>t render first then how they ger props</w:t>
+      </w:r>
+    </w:p>
+    <w:p>
+      <w:r>
+        <w:t xml:space="preserve">You caught an important distinction </w:t>
+      </w:r>
+      <w:r>
+        <w:rPr>
+          <w:rFonts w:ascii="Segoe UI Emoji" w:hAnsi="Segoe UI Emoji" w:cs="Segoe UI Emoji"/>
+        </w:rPr>
+        <w:t>👍</w:t>
+      </w:r>
+    </w:p>
+    <w:p>
+      <w:pPr>
+        <w:rPr>
+          <w:b/>
+          <w:bCs/>
+        </w:rPr>
+      </w:pPr>
+      <w:r>
+        <w:rPr>
+          <w:rFonts w:ascii="Segoe UI Emoji" w:hAnsi="Segoe UI Emoji" w:cs="Segoe UI Emoji"/>
+          <w:b/>
+          <w:bCs/>
+        </w:rPr>
+        <w:t>🧠</w:t>
+      </w:r>
+      <w:r>
+        <w:rPr>
+          <w:b/>
+          <w:bCs/>
+        </w:rPr>
+        <w:t xml:space="preserve"> Correct order</w:t>
+      </w:r>
+    </w:p>
+    <w:p>
+      <w:pPr>
+        <w:rPr>
+          <w:b/>
+          <w:bCs/>
+        </w:rPr>
+      </w:pPr>
+      <w:r>
+        <w:rPr>
+          <w:rFonts w:ascii="Segoe UI Emoji" w:hAnsi="Segoe UI Emoji" w:cs="Segoe UI Emoji"/>
+          <w:b/>
+          <w:bCs/>
+        </w:rPr>
+        <w:t>✔️</w:t>
+      </w:r>
+      <w:r>
+        <w:rPr>
+          <w:b/>
+          <w:bCs/>
+        </w:rPr>
+        <w:t xml:space="preserve"> Rendering phase</w:t>
+      </w:r>
+    </w:p>
+    <w:p>
+      <w:r>
+        <w:t>Parent renders first → then child renders</w:t>
+      </w:r>
+    </w:p>
+    <w:p>
+      <w:r>
+        <w:pict w14:anchorId="6F474905">
+          <v:rect id="_x0000_i1076" style="width:0;height:1.5pt" o:hralign="center" o:hrstd="t" o:hr="t" fillcolor="#a0a0a0" stroked="f"/>
+        </w:pict>
+      </w:r>
+    </w:p>
+    <w:p>
+      <w:pPr>
+        <w:rPr>
+          <w:b/>
+          <w:bCs/>
+        </w:rPr>
+      </w:pPr>
+      <w:r>
+        <w:rPr>
+          <w:rFonts w:ascii="Segoe UI Emoji" w:hAnsi="Segoe UI Emoji" w:cs="Segoe UI Emoji"/>
+          <w:b/>
+          <w:bCs/>
+        </w:rPr>
+        <w:t>✔️</w:t>
+      </w:r>
+      <w:r>
+        <w:rPr>
+          <w:b/>
+          <w:bCs/>
+        </w:rPr>
+        <w:t xml:space="preserve"> useEffect phase</w:t>
+      </w:r>
+    </w:p>
+    <w:p>
+      <w:r>
+        <w:t>Child useEffect runs before parent useEffect</w:t>
+      </w:r>
+    </w:p>
+    <w:p>
+      <w:r>
+        <w:pict w14:anchorId="1CC944F2">
+          <v:rect id="_x0000_i1077" style="width:0;height:1.5pt" o:hralign="center" o:hrstd="t" o:hr="t" fillcolor="#a0a0a0" stroked="f"/>
+        </w:pict>
+      </w:r>
+    </w:p>
+    <w:p>
+      <w:pPr>
+        <w:rPr>
+          <w:b/>
+          <w:bCs/>
+        </w:rPr>
+      </w:pPr>
+      <w:r>
+        <w:rPr>
+          <w:rFonts w:ascii="Segoe UI Emoji" w:hAnsi="Segoe UI Emoji" w:cs="Segoe UI Emoji"/>
+          <w:b/>
+          <w:bCs/>
+        </w:rPr>
+        <w:t>🎯</w:t>
+      </w:r>
+      <w:r>
+        <w:rPr>
+          <w:b/>
+          <w:bCs/>
+        </w:rPr>
+        <w:t xml:space="preserve"> So earlier statement meant</w:t>
+      </w:r>
+    </w:p>
+    <w:p>
+      <w:r>
+        <w:t>I was talking about:</w:t>
+      </w:r>
+    </w:p>
+    <w:p>
+      <w:r>
+        <w:t>useEffect order</w:t>
+      </w:r>
+    </w:p>
+    <w:p>
+      <w:r>
+        <w:lastRenderedPageBreak/>
+        <w:t>NOT:</w:t>
+      </w:r>
+    </w:p>
+    <w:p>
+      <w:r>
+        <w:t>render order</w:t>
+      </w:r>
+    </w:p>
+    <w:p>
+      <w:r>
+        <w:pict w14:anchorId="7066C2C4">
+          <v:rect id="_x0000_i1078" style="width:0;height:1.5pt" o:hralign="center" o:hrstd="t" o:hr="t" fillcolor="#a0a0a0" stroked="f"/>
+        </w:pict>
+      </w:r>
+    </w:p>
+    <w:p>
+      <w:pPr>
+        <w:rPr>
+          <w:b/>
+          <w:bCs/>
+        </w:rPr>
+      </w:pPr>
+      <w:r>
+        <w:rPr>
+          <w:rFonts w:ascii="Segoe UI Emoji" w:hAnsi="Segoe UI Emoji" w:cs="Segoe UI Emoji"/>
+          <w:b/>
+          <w:bCs/>
+        </w:rPr>
+        <w:t>🧾</w:t>
+      </w:r>
+      <w:r>
+        <w:rPr>
+          <w:b/>
+          <w:bCs/>
+        </w:rPr>
+        <w:t xml:space="preserve"> Final order</w:t>
+      </w:r>
+    </w:p>
+    <w:p>
+      <w:r>
+        <w:t>1. Parent render</w:t>
+      </w:r>
+    </w:p>
+    <w:p>
+      <w:r>
+        <w:t>2. Child render</w:t>
+      </w:r>
+    </w:p>
+    <w:p>
+      <w:r>
+        <w:t>3. Child useEffect</w:t>
+      </w:r>
+    </w:p>
+    <w:p>
+      <w:r>
+        <w:t>4. Parent useEffect</w:t>
+      </w:r>
+    </w:p>
+    <w:p>
+      <w:r>
+        <w:pict w14:anchorId="314AC4A7">
+          <v:rect id="_x0000_i1079" style="width:0;height:1.5pt" o:hralign="center" o:hrstd="t" o:hr="t" fillcolor="#a0a0a0" stroked="f"/>
+        </w:pict>
+      </w:r>
+    </w:p>
+    <w:p>
+      <w:pPr>
+        <w:rPr>
+          <w:b/>
+          <w:bCs/>
+        </w:rPr>
+      </w:pPr>
+      <w:r>
+        <w:rPr>
+          <w:rFonts w:ascii="Segoe UI Emoji" w:hAnsi="Segoe UI Emoji" w:cs="Segoe UI Emoji"/>
+          <w:b/>
+          <w:bCs/>
+        </w:rPr>
+        <w:t>🚀</w:t>
+      </w:r>
+      <w:r>
+        <w:rPr>
+          <w:b/>
+          <w:bCs/>
+        </w:rPr>
+        <w:t xml:space="preserve"> One-line answer</w:t>
+      </w:r>
+    </w:p>
+    <w:p>
+      <w:r>
+        <w:t>Parent renders first and passes props to child, but child’s useEffect runs before parent’s useEffect.</w:t>
+      </w:r>
+    </w:p>
+    <w:p>
+      <w:pPr>
+        <w:rPr>
+          <w:b/>
+          <w:bCs/>
+        </w:rPr>
+      </w:pPr>
+      <w:proofErr w:type="gramStart"/>
+      <w:r>
+        <w:rPr>
+          <w:b/>
+          <w:bCs/>
+        </w:rPr>
+        <w:t>so</w:t>
+      </w:r>
+      <w:proofErr w:type="gramEnd"/>
+      <w:r>
+        <w:rPr>
+          <w:b/>
+          <w:bCs/>
+        </w:rPr>
+        <w:t xml:space="preserve"> in props </w:t>
+      </w:r>
+      <w:proofErr w:type="spellStart"/>
+      <w:r>
+        <w:rPr>
+          <w:b/>
+          <w:bCs/>
+        </w:rPr>
+        <w:t>intial</w:t>
+      </w:r>
+      <w:proofErr w:type="spellEnd"/>
+      <w:r>
+        <w:rPr>
+          <w:b/>
+          <w:bCs/>
+        </w:rPr>
+        <w:t xml:space="preserve"> value will be sent</w:t>
+      </w:r>
+    </w:p>
+    <w:p>
+      <w:r>
+        <w:rPr>
+          <w:rFonts w:ascii="Segoe UI Emoji" w:hAnsi="Segoe UI Emoji" w:cs="Segoe UI Emoji"/>
+        </w:rPr>
+        <w:t>✔️</w:t>
+      </w:r>
+      <w:r>
+        <w:t xml:space="preserve"> Yes—during the first render, the child receives the parent’s current (initial) prop values.</w:t>
+      </w:r>
+    </w:p>
+    <w:p/>
     <w:sectPr>
       <w:pgSz w:w="11906" w:h="16838"/>
       <w:pgMar w:top="1440" w:right="1440" w:bottom="1440" w:left="1440" w:header="708" w:footer="708" w:gutter="0"/>
@@ -7027,7 +7808,6 @@
   <w:style w:type="character" w:default="1" w:styleId="DefaultParagraphFont">
     <w:name w:val="Default Paragraph Font"/>
     <w:uiPriority w:val="1"/>
-    <w:semiHidden/>
     <w:unhideWhenUsed/>
   </w:style>
   <w:style w:type="table" w:default="1" w:styleId="TableNormal">

</xml_diff>

<commit_message>
Lesson 68 Showing Sidebar only for few pages
</commit_message>
<xml_diff>
--- a/Notes3.docx
+++ b/Notes3.docx
@@ -5659,6 +5659,11 @@
       </w:r>
     </w:p>
     <w:p>
+      <w:pPr>
+        <w:pBdr>
+          <w:bottom w:val="single" w:sz="12" w:space="1" w:color="auto"/>
+        </w:pBdr>
+      </w:pPr>
       <w:r>
         <w:rPr>
           <w:rFonts w:ascii="Segoe UI Emoji" w:hAnsi="Segoe UI Emoji" w:cs="Segoe UI Emoji"/>
@@ -5671,41 +5676,48 @@
     </w:p>
     <w:p>
       <w:r>
-        <w:t xml:space="preserve">In future we </w:t>
+        <w:t xml:space="preserve">In future </w:t>
+      </w:r>
+      <w:r>
+        <w:t xml:space="preserve">lessons </w:t>
+      </w:r>
+      <w:r>
+        <w:t>we wil</w:t>
+      </w:r>
+      <w:r>
+        <w:t>l</w:t>
+      </w:r>
+      <w:r>
+        <w:t xml:space="preserve"> learn how to do checksum tampering of </w:t>
       </w:r>
       <w:proofErr w:type="spellStart"/>
       <w:r>
-        <w:t>wil</w:t>
+        <w:t>payt</w:t>
+      </w:r>
+      <w:r>
+        <w:t>m</w:t>
       </w:r>
       <w:proofErr w:type="spellEnd"/>
       <w:r>
-        <w:t xml:space="preserve"> learn how to do checksum tampering of </w:t>
+        <w:t xml:space="preserve"> maybe it means anybody can send order success other than </w:t>
       </w:r>
       <w:proofErr w:type="spellStart"/>
       <w:r>
-        <w:t>payt</w:t>
-      </w:r>
-      <w:r>
-        <w:t>m</w:t>
+        <w:t>p</w:t>
+      </w:r>
+      <w:r>
+        <w:t>aytm</w:t>
       </w:r>
       <w:proofErr w:type="spellEnd"/>
       <w:r>
-        <w:t xml:space="preserve"> maybe it means anybody can send order success other than </w:t>
+        <w:t xml:space="preserve"> otherwise anybody can </w:t>
       </w:r>
       <w:proofErr w:type="spellStart"/>
       <w:r>
-        <w:t>paytm</w:t>
+        <w:t>expoit</w:t>
       </w:r>
       <w:proofErr w:type="spellEnd"/>
       <w:r>
-        <w:t xml:space="preserve"> otherwise anybody can </w:t>
-      </w:r>
-      <w:proofErr w:type="spellStart"/>
-      <w:r>
-        <w:t>expoit</w:t>
-      </w:r>
-      <w:proofErr w:type="spellEnd"/>
-      <w:r>
         <w:t xml:space="preserve"> the system</w:t>
       </w:r>
       <w:r>
@@ -5718,6 +5730,82 @@
       <w:proofErr w:type="gramEnd"/>
       <w:r>
         <w:t>who knows).</w:t>
+      </w:r>
+    </w:p>
+    <w:p>
+      <w:r>
+        <w:t xml:space="preserve">We will see why to check tampering </w:t>
+      </w:r>
+      <w:r>
+        <w:t>nu checksum</w:t>
+      </w:r>
+      <w:r>
+        <w:t xml:space="preserve"> and what is all this we will learn in upcoming lesson</w:t>
+      </w:r>
+    </w:p>
+    <w:p>
+      <w:pPr>
+        <w:rPr>
+          <w:b/>
+          <w:bCs/>
+        </w:rPr>
+      </w:pPr>
+      <w:r>
+        <w:rPr>
+          <w:b/>
+          <w:bCs/>
+        </w:rPr>
+        <w:t xml:space="preserve">New Lesson </w:t>
+      </w:r>
+    </w:p>
+    <w:p>
+      <w:r>
+        <w:t xml:space="preserve">We </w:t>
+      </w:r>
+      <w:r>
+        <w:t xml:space="preserve">can exclude certain pages from </w:t>
+      </w:r>
+      <w:r>
+        <w:t xml:space="preserve">showing </w:t>
+      </w:r>
+      <w:r>
+        <w:t xml:space="preserve">the sidebar </w:t>
+      </w:r>
+    </w:p>
+    <w:p>
+      <w:r>
+        <w:t xml:space="preserve">We could use set &amp;&amp; </w:t>
+      </w:r>
+      <w:proofErr w:type="gramStart"/>
+      <w:r>
+        <w:t>to  run</w:t>
+      </w:r>
+      <w:proofErr w:type="gramEnd"/>
+      <w:r>
+        <w:t xml:space="preserve"> an instruction on </w:t>
+      </w:r>
+      <w:r>
+        <w:t>t</w:t>
+      </w:r>
+      <w:r>
+        <w:t>he s</w:t>
+      </w:r>
+      <w:r>
+        <w:t>u</w:t>
+      </w:r>
+      <w:r>
+        <w:t xml:space="preserve">ccess of the left condition and </w:t>
+      </w:r>
+      <w:r>
+        <w:t>on right side statement executed</w:t>
+      </w:r>
+    </w:p>
+    <w:p>
+      <w:r>
+        <w:t xml:space="preserve">And in || if left condition did not work then right instruction runs if left runs then </w:t>
+      </w:r>
+      <w:r>
+        <w:t>eight instruction will not work.</w:t>
       </w:r>
     </w:p>
     <w:p/>

</xml_diff>

<commit_message>
Lesson 69 PayTM checksum Tampering check
</commit_message>
<xml_diff>
--- a/Notes3.docx
+++ b/Notes3.docx
@@ -5806,6 +5806,545 @@
       </w:r>
       <w:r>
         <w:t>eight instruction will not work.</w:t>
+      </w:r>
+    </w:p>
+    <w:p>
+      <w:pPr>
+        <w:rPr>
+          <w:b/>
+          <w:bCs/>
+        </w:rPr>
+      </w:pPr>
+      <w:r>
+        <w:rPr>
+          <w:b/>
+          <w:bCs/>
+        </w:rPr>
+        <w:t>New Lesso</w:t>
+      </w:r>
+      <w:r>
+        <w:rPr>
+          <w:b/>
+          <w:bCs/>
+        </w:rPr>
+        <w:t>n</w:t>
+      </w:r>
+    </w:p>
+    <w:p>
+      <w:r>
+        <w:t xml:space="preserve">There is a possibility where hackers will try that </w:t>
+      </w:r>
+      <w:r>
+        <w:t xml:space="preserve">in </w:t>
+      </w:r>
+      <w:r>
+        <w:t xml:space="preserve">your </w:t>
+      </w:r>
+      <w:r>
+        <w:t xml:space="preserve">final </w:t>
+      </w:r>
+      <w:r>
+        <w:t>orders.js</w:t>
+      </w:r>
+      <w:r>
+        <w:t xml:space="preserve"> order</w:t>
+      </w:r>
+      <w:r>
+        <w:t xml:space="preserve"> </w:t>
+      </w:r>
+      <w:r>
+        <w:t xml:space="preserve">will be </w:t>
+      </w:r>
+      <w:r>
+        <w:t>confirmed</w:t>
+      </w:r>
+      <w:r>
+        <w:t xml:space="preserve">. </w:t>
+      </w:r>
+      <w:r>
+        <w:t>I</w:t>
+      </w:r>
+      <w:r>
+        <w:t>n</w:t>
+      </w:r>
+      <w:r>
+        <w:t xml:space="preserve"> </w:t>
+      </w:r>
+      <w:r>
+        <w:t>s</w:t>
+      </w:r>
+      <w:r>
+        <w:t xml:space="preserve">uch cases we will use Paytm checksum tampering </w:t>
+      </w:r>
+      <w:r>
+        <w:t xml:space="preserve">check. </w:t>
+      </w:r>
+      <w:r>
+        <w:t>We will see that have someone done the tampering</w:t>
+      </w:r>
+      <w:r>
+        <w:t>.</w:t>
+      </w:r>
+      <w:r>
+        <w:t xml:space="preserve"> It should not be like that </w:t>
+      </w:r>
+      <w:proofErr w:type="gramStart"/>
+      <w:r>
+        <w:t>a  user</w:t>
+      </w:r>
+      <w:proofErr w:type="gramEnd"/>
+      <w:r>
+        <w:t xml:space="preserve"> some in </w:t>
+      </w:r>
+      <w:proofErr w:type="spellStart"/>
+      <w:r>
+        <w:t>out</w:t>
+      </w:r>
+      <w:proofErr w:type="spellEnd"/>
+      <w:r>
+        <w:t xml:space="preserve"> site </w:t>
+      </w:r>
+      <w:r>
+        <w:t xml:space="preserve">without </w:t>
+      </w:r>
+      <w:r>
+        <w:t>d</w:t>
+      </w:r>
+      <w:r>
+        <w:t xml:space="preserve">oing any payment </w:t>
+      </w:r>
+      <w:r>
+        <w:t xml:space="preserve">that he will directly generate order </w:t>
+      </w:r>
+      <w:proofErr w:type="gramStart"/>
+      <w:r>
+        <w:t>page(</w:t>
+      </w:r>
+      <w:proofErr w:type="gramEnd"/>
+      <w:r>
+        <w:t>by redirecting aften order payment success)</w:t>
+      </w:r>
+      <w:r>
+        <w:t xml:space="preserve"> that’s why Paytm give us checksum </w:t>
+      </w:r>
+      <w:r>
+        <w:t>logic</w:t>
+      </w:r>
+      <w:r>
+        <w:t xml:space="preserve">. </w:t>
+      </w:r>
+      <w:r>
+        <w:t xml:space="preserve">How all </w:t>
+      </w:r>
+      <w:proofErr w:type="gramStart"/>
+      <w:r>
+        <w:t>these work</w:t>
+      </w:r>
+      <w:proofErr w:type="gramEnd"/>
+      <w:r>
+        <w:t xml:space="preserve"> how we can save ou</w:t>
+      </w:r>
+      <w:r>
+        <w:t>r site from hacking we will see.</w:t>
+      </w:r>
+    </w:p>
+    <w:p>
+      <w:r>
+        <w:t xml:space="preserve">Now we will see how to do </w:t>
+      </w:r>
+      <w:r>
+        <w:t>P</w:t>
+      </w:r>
+      <w:r>
+        <w:t xml:space="preserve">aytm tampering check </w:t>
+      </w:r>
+      <w:r>
+        <w:t xml:space="preserve">and what about its meaning </w:t>
+      </w:r>
+      <w:r>
+        <w:t>we will see.</w:t>
+      </w:r>
+    </w:p>
+    <w:p>
+      <w:r>
+        <w:t xml:space="preserve">Till Now we have applied all the steps </w:t>
+      </w:r>
+      <w:r>
+        <w:t xml:space="preserve">of </w:t>
+      </w:r>
+      <w:r>
+        <w:t>P</w:t>
+      </w:r>
+      <w:r>
+        <w:t>aytm g</w:t>
+      </w:r>
+      <w:r>
+        <w:t>a</w:t>
+      </w:r>
+      <w:r>
+        <w:t>teway.</w:t>
+      </w:r>
+      <w:r>
+        <w:t xml:space="preserve"> Read the docs as it is important for the safety point of view </w:t>
+      </w:r>
+      <w:r>
+        <w:t xml:space="preserve">and </w:t>
+      </w:r>
+      <w:r>
+        <w:t>obvio</w:t>
+      </w:r>
+      <w:r>
+        <w:t>u</w:t>
+      </w:r>
+      <w:r>
+        <w:t>s</w:t>
+      </w:r>
+      <w:r>
+        <w:t xml:space="preserve">ly important for </w:t>
+      </w:r>
+      <w:r>
+        <w:t xml:space="preserve">implementation </w:t>
+      </w:r>
+      <w:r>
+        <w:t xml:space="preserve">There is a final check in </w:t>
+      </w:r>
+      <w:r>
+        <w:t xml:space="preserve">the </w:t>
+      </w:r>
+      <w:proofErr w:type="spellStart"/>
+      <w:r>
+        <w:t>paytm</w:t>
+      </w:r>
+      <w:proofErr w:type="spellEnd"/>
+      <w:r>
+        <w:t xml:space="preserve"> paymen</w:t>
+      </w:r>
+      <w:r>
+        <w:t xml:space="preserve">t that is validation checksum. </w:t>
+      </w:r>
+    </w:p>
+    <w:p>
+      <w:pPr>
+        <w:jc w:val="center"/>
+      </w:pPr>
+      <w:r>
+        <w:lastRenderedPageBreak/>
+        <w:drawing>
+          <wp:inline distT="0" distB="0" distL="0" distR="0" wp14:anchorId="37E8385E" wp14:editId="632538FB">
+            <wp:extent cx="5731510" cy="3687445"/>
+            <wp:effectExtent l="0" t="0" r="2540" b="8255"/>
+            <wp:docPr id="607429152" name="Picture 1"/>
+            <wp:cNvGraphicFramePr>
+              <a:graphicFrameLocks xmlns:a="http://schemas.openxmlformats.org/drawingml/2006/main" noChangeAspect="1"/>
+            </wp:cNvGraphicFramePr>
+            <a:graphic xmlns:a="http://schemas.openxmlformats.org/drawingml/2006/main">
+              <a:graphicData uri="http://schemas.openxmlformats.org/drawingml/2006/picture">
+                <pic:pic xmlns:pic="http://schemas.openxmlformats.org/drawingml/2006/picture">
+                  <pic:nvPicPr>
+                    <pic:cNvPr id="607429152" name=""/>
+                    <pic:cNvPicPr/>
+                  </pic:nvPicPr>
+                  <pic:blipFill>
+                    <a:blip r:embed="rId6"/>
+                    <a:stretch>
+                      <a:fillRect/>
+                    </a:stretch>
+                  </pic:blipFill>
+                  <pic:spPr>
+                    <a:xfrm>
+                      <a:off x="0" y="0"/>
+                      <a:ext cx="5731510" cy="3687445"/>
+                    </a:xfrm>
+                    <a:prstGeom prst="rect">
+                      <a:avLst/>
+                    </a:prstGeom>
+                  </pic:spPr>
+                </pic:pic>
+              </a:graphicData>
+            </a:graphic>
+          </wp:inline>
+        </w:drawing>
+      </w:r>
+    </w:p>
+    <w:p>
+      <w:pPr>
+        <w:rPr>
+          <w:b/>
+          <w:bCs/>
+        </w:rPr>
+      </w:pPr>
+      <w:r>
+        <w:rPr>
+          <w:b/>
+          <w:bCs/>
+        </w:rPr>
+        <w:t>(</w:t>
+      </w:r>
+      <w:r>
+        <w:rPr>
+          <w:b/>
+          <w:bCs/>
+        </w:rPr>
+        <w:t>Old docs</w:t>
+      </w:r>
+      <w:r>
+        <w:rPr>
+          <w:b/>
+          <w:bCs/>
+        </w:rPr>
+        <w:t>)</w:t>
+      </w:r>
+    </w:p>
+    <w:p>
+      <w:r>
+        <w:t xml:space="preserve">It means its should not be like that </w:t>
+      </w:r>
+      <w:r>
+        <w:t xml:space="preserve">when the data go from </w:t>
+      </w:r>
+      <w:r>
+        <w:t>P</w:t>
+      </w:r>
+      <w:r>
+        <w:t>aytm and reach the server</w:t>
+      </w:r>
+      <w:r>
+        <w:t xml:space="preserve"> then in middle (or </w:t>
+      </w:r>
+      <w:r>
+        <w:t>so</w:t>
+      </w:r>
+      <w:r>
+        <w:t xml:space="preserve">meone giving fake </w:t>
+      </w:r>
+      <w:r>
+        <w:t>request</w:t>
+      </w:r>
+      <w:r>
+        <w:t xml:space="preserve"> </w:t>
+      </w:r>
+      <w:r>
+        <w:t>g</w:t>
+      </w:r>
+      <w:r>
+        <w:t>iven fake data</w:t>
+      </w:r>
+      <w:r>
+        <w:t>)</w:t>
+      </w:r>
+      <w:r>
+        <w:t xml:space="preserve"> someone do something with that data </w:t>
+      </w:r>
+      <w:r>
+        <w:t xml:space="preserve">that is coming with request </w:t>
+      </w:r>
+      <w:r>
+        <w:t>or response and change the payment status</w:t>
+      </w:r>
+      <w:r>
+        <w:t xml:space="preserve"> from unpaid </w:t>
+      </w:r>
+      <w:r>
+        <w:t>to paid.</w:t>
+      </w:r>
+      <w:r>
+        <w:t xml:space="preserve"> </w:t>
+      </w:r>
+      <w:proofErr w:type="gramStart"/>
+      <w:r>
+        <w:t>So</w:t>
+      </w:r>
+      <w:proofErr w:type="gramEnd"/>
+      <w:r>
+        <w:t xml:space="preserve"> there will be loss for you</w:t>
+      </w:r>
+      <w:r>
+        <w:t xml:space="preserve"> and you would not want to bear the loss.</w:t>
+      </w:r>
+      <w:r>
+        <w:t xml:space="preserve"> </w:t>
+      </w:r>
+      <w:proofErr w:type="gramStart"/>
+      <w:r>
+        <w:t>So</w:t>
+      </w:r>
+      <w:proofErr w:type="gramEnd"/>
+      <w:r>
+        <w:t xml:space="preserve"> what we will do is that when data rea</w:t>
+      </w:r>
+      <w:r>
+        <w:t>c</w:t>
+      </w:r>
+      <w:r>
+        <w:t xml:space="preserve">h our server from </w:t>
+      </w:r>
+      <w:r>
+        <w:t>P</w:t>
+      </w:r>
+      <w:r>
+        <w:t>aytm</w:t>
+      </w:r>
+      <w:r>
+        <w:t xml:space="preserve"> we will validate it.</w:t>
+      </w:r>
+      <w:r>
+        <w:t xml:space="preserve"> </w:t>
+      </w:r>
+      <w:r>
+        <w:t xml:space="preserve">and we will validate is it the data that the </w:t>
+      </w:r>
+      <w:r>
+        <w:t>P</w:t>
+      </w:r>
+      <w:r>
+        <w:t xml:space="preserve">aytm </w:t>
+      </w:r>
+      <w:proofErr w:type="gramStart"/>
+      <w:r>
+        <w:t xml:space="preserve">sent </w:t>
+      </w:r>
+      <w:r>
+        <w:t xml:space="preserve"> or</w:t>
+      </w:r>
+      <w:proofErr w:type="gramEnd"/>
+      <w:r>
+        <w:t xml:space="preserve"> someone in middle </w:t>
+      </w:r>
+      <w:r>
+        <w:t>changed it.</w:t>
+      </w:r>
+      <w:r>
+        <w:t xml:space="preserve"> </w:t>
+      </w:r>
+      <w:r>
+        <w:t xml:space="preserve">that’s why people </w:t>
+      </w:r>
+      <w:proofErr w:type="gramStart"/>
+      <w:r>
+        <w:t>uses</w:t>
+      </w:r>
+      <w:proofErr w:type="gramEnd"/>
+      <w:r>
+        <w:t xml:space="preserve"> checksum.</w:t>
+      </w:r>
+      <w:r>
+        <w:t xml:space="preserve"> </w:t>
+      </w:r>
+      <w:proofErr w:type="gramStart"/>
+      <w:r>
+        <w:t>The</w:t>
+      </w:r>
+      <w:proofErr w:type="gramEnd"/>
+      <w:r>
+        <w:t xml:space="preserve"> basic code look like below</w:t>
+      </w:r>
+    </w:p>
+    <w:p>
+      <w:pPr>
+        <w:jc w:val="center"/>
+      </w:pPr>
+      <w:r>
+        <w:drawing>
+          <wp:inline distT="0" distB="0" distL="0" distR="0" wp14:anchorId="6FC6685C" wp14:editId="4249BCDC">
+            <wp:extent cx="4714875" cy="3111212"/>
+            <wp:effectExtent l="0" t="0" r="0" b="0"/>
+            <wp:docPr id="1156166626" name="Picture 1"/>
+            <wp:cNvGraphicFramePr>
+              <a:graphicFrameLocks xmlns:a="http://schemas.openxmlformats.org/drawingml/2006/main" noChangeAspect="1"/>
+            </wp:cNvGraphicFramePr>
+            <a:graphic xmlns:a="http://schemas.openxmlformats.org/drawingml/2006/main">
+              <a:graphicData uri="http://schemas.openxmlformats.org/drawingml/2006/picture">
+                <pic:pic xmlns:pic="http://schemas.openxmlformats.org/drawingml/2006/picture">
+                  <pic:nvPicPr>
+                    <pic:cNvPr id="1156166626" name=""/>
+                    <pic:cNvPicPr/>
+                  </pic:nvPicPr>
+                  <pic:blipFill>
+                    <a:blip r:embed="rId7"/>
+                    <a:stretch>
+                      <a:fillRect/>
+                    </a:stretch>
+                  </pic:blipFill>
+                  <pic:spPr>
+                    <a:xfrm>
+                      <a:off x="0" y="0"/>
+                      <a:ext cx="4716280" cy="3112139"/>
+                    </a:xfrm>
+                    <a:prstGeom prst="rect">
+                      <a:avLst/>
+                    </a:prstGeom>
+                  </pic:spPr>
+                </pic:pic>
+              </a:graphicData>
+            </a:graphic>
+          </wp:inline>
+        </w:drawing>
+      </w:r>
+    </w:p>
+    <w:p>
+      <w:r>
+        <w:lastRenderedPageBreak/>
+        <w:t>but we come to the conclusion that we are getting problems in the data string version but we are not getting any problem with a normal object literal.</w:t>
+      </w:r>
+    </w:p>
+    <w:p>
+      <w:proofErr w:type="gramStart"/>
+      <w:r>
+        <w:t>So</w:t>
+      </w:r>
+      <w:proofErr w:type="gramEnd"/>
+      <w:r>
+        <w:t xml:space="preserve"> we will use only object literal version of the body (the data we g</w:t>
+      </w:r>
+      <w:r>
+        <w:t>o</w:t>
+      </w:r>
+      <w:r>
+        <w:t>t</w:t>
+      </w:r>
+      <w:r>
+        <w:t xml:space="preserve"> from </w:t>
+      </w:r>
+      <w:proofErr w:type="spellStart"/>
+      <w:r>
+        <w:t>paytm</w:t>
+      </w:r>
+      <w:proofErr w:type="spellEnd"/>
+      <w:r>
+        <w:t>)</w:t>
+      </w:r>
+    </w:p>
+    <w:p>
+      <w:r>
+        <w:t>We se</w:t>
+      </w:r>
+      <w:r>
+        <w:t>n</w:t>
+      </w:r>
+      <w:r>
+        <w:t>d a</w:t>
+      </w:r>
+      <w:r>
+        <w:t xml:space="preserve"> </w:t>
+      </w:r>
+      <w:r>
+        <w:t xml:space="preserve">text response by return </w:t>
+      </w:r>
+      <w:proofErr w:type="gramStart"/>
+      <w:r>
+        <w:t>Response(</w:t>
+      </w:r>
+      <w:proofErr w:type="gramEnd"/>
+      <w:r>
+        <w:t>“text message</w:t>
+      </w:r>
+      <w:proofErr w:type="gramStart"/>
+      <w:r>
+        <w:t>”,{</w:t>
+      </w:r>
+      <w:proofErr w:type="gramEnd"/>
+      <w:r>
+        <w:t>status:&lt;status&gt;})</w:t>
       </w:r>
     </w:p>
     <w:p/>
@@ -7947,7 +8486,6 @@
   <w:style w:type="character" w:default="1" w:styleId="DefaultParagraphFont">
     <w:name w:val="Default Paragraph Font"/>
     <w:uiPriority w:val="1"/>
-    <w:semiHidden/>
     <w:unhideWhenUsed/>
   </w:style>
   <w:style w:type="table" w:default="1" w:styleId="TableNormal">

</xml_diff>

<commit_message>
Lesson 70 Displaying out of stock items
</commit_message>
<xml_diff>
--- a/Notes3.docx
+++ b/Notes3.docx
@@ -6345,6 +6345,485 @@
       <w:proofErr w:type="gramEnd"/>
       <w:r>
         <w:t>status:&lt;status&gt;})</w:t>
+      </w:r>
+    </w:p>
+    <w:p>
+      <w:r>
+        <w:t xml:space="preserve">There is </w:t>
+      </w:r>
+      <w:r>
+        <w:t xml:space="preserve">a </w:t>
+      </w:r>
+      <w:r>
+        <w:t>custom component</w:t>
+      </w:r>
+      <w:r>
+        <w:t xml:space="preserve"> </w:t>
+      </w:r>
+      <w:r>
+        <w:t>in Next js for showing errors on a page they are as shown below</w:t>
+      </w:r>
+    </w:p>
+    <w:p>
+      <w:pPr>
+        <w:jc w:val="center"/>
+      </w:pPr>
+      <w:r>
+        <w:drawing>
+          <wp:inline distT="0" distB="0" distL="0" distR="0" wp14:anchorId="39933502" wp14:editId="5F655B5A">
+            <wp:extent cx="5334744" cy="3896269"/>
+            <wp:effectExtent l="0" t="0" r="0" b="9525"/>
+            <wp:docPr id="577608234" name="Picture 1"/>
+            <wp:cNvGraphicFramePr>
+              <a:graphicFrameLocks xmlns:a="http://schemas.openxmlformats.org/drawingml/2006/main" noChangeAspect="1"/>
+            </wp:cNvGraphicFramePr>
+            <a:graphic xmlns:a="http://schemas.openxmlformats.org/drawingml/2006/main">
+              <a:graphicData uri="http://schemas.openxmlformats.org/drawingml/2006/picture">
+                <pic:pic xmlns:pic="http://schemas.openxmlformats.org/drawingml/2006/picture">
+                  <pic:nvPicPr>
+                    <pic:cNvPr id="577608234" name=""/>
+                    <pic:cNvPicPr/>
+                  </pic:nvPicPr>
+                  <pic:blipFill>
+                    <a:blip r:embed="rId8"/>
+                    <a:stretch>
+                      <a:fillRect/>
+                    </a:stretch>
+                  </pic:blipFill>
+                  <pic:spPr>
+                    <a:xfrm>
+                      <a:off x="0" y="0"/>
+                      <a:ext cx="5334744" cy="3896269"/>
+                    </a:xfrm>
+                    <a:prstGeom prst="rect">
+                      <a:avLst/>
+                    </a:prstGeom>
+                  </pic:spPr>
+                </pic:pic>
+              </a:graphicData>
+            </a:graphic>
+          </wp:inline>
+        </w:drawing>
+      </w:r>
+    </w:p>
+    <w:p>
+      <w:pPr>
+        <w:rPr>
+          <w:b/>
+          <w:bCs/>
+        </w:rPr>
+      </w:pPr>
+      <w:r>
+        <w:rPr>
+          <w:b/>
+          <w:bCs/>
+        </w:rPr>
+        <w:t>(old code)</w:t>
+      </w:r>
+    </w:p>
+    <w:p>
+      <w:r>
+        <w:t xml:space="preserve">And one thing we noticed that </w:t>
+      </w:r>
+      <w:r>
+        <w:t>we can return any time in a fun</w:t>
+      </w:r>
+      <w:r>
+        <w:t>c</w:t>
+      </w:r>
+      <w:r>
+        <w:t>ti</w:t>
+      </w:r>
+      <w:r>
+        <w:t>o</w:t>
+      </w:r>
+      <w:r>
+        <w:t>nal compon</w:t>
+      </w:r>
+      <w:r>
+        <w:t>e</w:t>
+      </w:r>
+      <w:r>
+        <w:t>n</w:t>
+      </w:r>
+      <w:r>
+        <w:t>t</w:t>
+      </w:r>
+      <w:r>
+        <w:t xml:space="preserve"> as it is a function at the end of the day and whatever </w:t>
+      </w:r>
+      <w:proofErr w:type="spellStart"/>
+      <w:r>
+        <w:t>J</w:t>
+      </w:r>
+      <w:r>
+        <w:t>sx</w:t>
+      </w:r>
+      <w:proofErr w:type="spellEnd"/>
+      <w:r>
+        <w:t xml:space="preserve"> we will return will be shown on the screen</w:t>
+      </w:r>
+      <w:r>
+        <w:t xml:space="preserve"> </w:t>
+      </w:r>
+      <w:r>
+        <w:t>we can even pu</w:t>
+      </w:r>
+      <w:r>
+        <w:t>t</w:t>
+      </w:r>
+      <w:r>
+        <w:t xml:space="preserve"> con</w:t>
+      </w:r>
+      <w:r>
+        <w:t>d</w:t>
+      </w:r>
+      <w:r>
+        <w:t xml:space="preserve">ition on return by if else as component </w:t>
+      </w:r>
+      <w:r>
+        <w:t xml:space="preserve">as </w:t>
+      </w:r>
+      <w:r>
+        <w:t xml:space="preserve">at the end of the day </w:t>
+      </w:r>
+      <w:r>
+        <w:t xml:space="preserve">it </w:t>
+      </w:r>
+      <w:r>
+        <w:t>is a function</w:t>
+      </w:r>
+      <w:r>
+        <w:t xml:space="preserve">. </w:t>
+      </w:r>
+    </w:p>
+    <w:p>
+      <w:pPr>
+        <w:rPr>
+          <w:b/>
+          <w:bCs/>
+          <w:color w:val="EE0000"/>
+        </w:rPr>
+      </w:pPr>
+      <w:r>
+        <w:rPr>
+          <w:b/>
+          <w:bCs/>
+          <w:color w:val="EE0000"/>
+        </w:rPr>
+        <w:t xml:space="preserve">There is a </w:t>
+      </w:r>
+      <w:r>
+        <w:rPr>
+          <w:b/>
+          <w:bCs/>
+          <w:color w:val="EE0000"/>
+        </w:rPr>
+        <w:t>technique in</w:t>
+      </w:r>
+      <w:r>
+        <w:rPr>
+          <w:b/>
+          <w:bCs/>
+          <w:color w:val="EE0000"/>
+        </w:rPr>
+        <w:t xml:space="preserve"> the</w:t>
+      </w:r>
+      <w:r>
+        <w:rPr>
+          <w:b/>
+          <w:bCs/>
+          <w:color w:val="EE0000"/>
+        </w:rPr>
+        <w:t xml:space="preserve"> frame work </w:t>
+      </w:r>
+      <w:r>
+        <w:rPr>
+          <w:b/>
+          <w:bCs/>
+          <w:color w:val="EE0000"/>
+        </w:rPr>
+        <w:t>for pages that could not be found</w:t>
+      </w:r>
+      <w:r>
+        <w:rPr>
+          <w:b/>
+          <w:bCs/>
+          <w:color w:val="EE0000"/>
+        </w:rPr>
+        <w:t xml:space="preserve"> after a particular slug</w:t>
+      </w:r>
+      <w:r>
+        <w:rPr>
+          <w:b/>
+          <w:bCs/>
+          <w:color w:val="EE0000"/>
+        </w:rPr>
+        <w:t xml:space="preserve"> such </w:t>
+      </w:r>
+      <w:r>
+        <w:rPr>
+          <w:b/>
+          <w:bCs/>
+          <w:color w:val="EE0000"/>
+        </w:rPr>
+        <w:t xml:space="preserve">that if we place </w:t>
+      </w:r>
+      <w:r>
+        <w:rPr>
+          <w:b/>
+          <w:bCs/>
+          <w:color w:val="EE0000"/>
+        </w:rPr>
+        <w:t>not-found</w:t>
+      </w:r>
+      <w:r>
+        <w:rPr>
+          <w:b/>
+          <w:bCs/>
+          <w:color w:val="EE0000"/>
+        </w:rPr>
+        <w:t xml:space="preserve"> name jsx file</w:t>
+      </w:r>
+      <w:r>
+        <w:rPr>
+          <w:b/>
+          <w:bCs/>
+          <w:color w:val="EE0000"/>
+        </w:rPr>
+        <w:t xml:space="preserve"> in the folder </w:t>
+      </w:r>
+      <w:r>
+        <w:rPr>
+          <w:b/>
+          <w:bCs/>
+          <w:color w:val="EE0000"/>
+        </w:rPr>
+        <w:t xml:space="preserve">or subfolder </w:t>
+      </w:r>
+      <w:r>
+        <w:rPr>
+          <w:b/>
+          <w:bCs/>
+          <w:color w:val="EE0000"/>
+        </w:rPr>
+        <w:t>(</w:t>
+      </w:r>
+      <w:r>
+        <w:rPr>
+          <w:b/>
+          <w:bCs/>
+          <w:color w:val="EE0000"/>
+        </w:rPr>
+        <w:t xml:space="preserve">representing </w:t>
+      </w:r>
+      <w:r>
+        <w:rPr>
+          <w:b/>
+          <w:bCs/>
+          <w:color w:val="EE0000"/>
+        </w:rPr>
+        <w:t>the</w:t>
+      </w:r>
+      <w:r>
+        <w:rPr>
+          <w:b/>
+          <w:bCs/>
+          <w:color w:val="EE0000"/>
+        </w:rPr>
+        <w:t xml:space="preserve"> slug</w:t>
+      </w:r>
+      <w:r>
+        <w:rPr>
+          <w:b/>
+          <w:bCs/>
+          <w:color w:val="EE0000"/>
+        </w:rPr>
+        <w:t xml:space="preserve">) </w:t>
+      </w:r>
+      <w:r>
+        <w:rPr>
+          <w:b/>
+          <w:bCs/>
+          <w:color w:val="EE0000"/>
+        </w:rPr>
+        <w:t xml:space="preserve">in </w:t>
+      </w:r>
+      <w:r>
+        <w:rPr>
+          <w:b/>
+          <w:bCs/>
+          <w:color w:val="EE0000"/>
+        </w:rPr>
+        <w:t>the</w:t>
+      </w:r>
+      <w:r>
+        <w:rPr>
+          <w:b/>
+          <w:bCs/>
+          <w:color w:val="EE0000"/>
+        </w:rPr>
+        <w:t xml:space="preserve"> app router</w:t>
+      </w:r>
+      <w:r>
+        <w:rPr>
+          <w:b/>
+          <w:bCs/>
+          <w:color w:val="EE0000"/>
+        </w:rPr>
+        <w:t xml:space="preserve"> folder </w:t>
+      </w:r>
+      <w:r>
+        <w:rPr>
+          <w:b/>
+          <w:bCs/>
+          <w:color w:val="EE0000"/>
+        </w:rPr>
+        <w:t>such that after that slug</w:t>
+      </w:r>
+      <w:r>
+        <w:rPr>
+          <w:b/>
+          <w:bCs/>
+          <w:color w:val="EE0000"/>
+        </w:rPr>
+        <w:t xml:space="preserve"> if</w:t>
+      </w:r>
+      <w:r>
+        <w:rPr>
+          <w:b/>
+          <w:bCs/>
+          <w:color w:val="EE0000"/>
+        </w:rPr>
+        <w:t xml:space="preserve"> we enter</w:t>
+      </w:r>
+      <w:r>
+        <w:rPr>
+          <w:b/>
+          <w:bCs/>
+          <w:color w:val="EE0000"/>
+        </w:rPr>
+        <w:t xml:space="preserve"> ran</w:t>
+      </w:r>
+      <w:r>
+        <w:rPr>
+          <w:b/>
+          <w:bCs/>
+          <w:color w:val="EE0000"/>
+        </w:rPr>
+        <w:t>d</w:t>
+      </w:r>
+      <w:r>
+        <w:rPr>
+          <w:b/>
+          <w:bCs/>
+          <w:color w:val="EE0000"/>
+        </w:rPr>
+        <w:t>om</w:t>
+      </w:r>
+      <w:r>
+        <w:rPr>
+          <w:b/>
+          <w:bCs/>
+          <w:color w:val="EE0000"/>
+        </w:rPr>
+        <w:t xml:space="preserve"> letters</w:t>
+      </w:r>
+      <w:r>
+        <w:rPr>
+          <w:b/>
+          <w:bCs/>
+          <w:color w:val="EE0000"/>
+        </w:rPr>
+        <w:t xml:space="preserve"> </w:t>
+      </w:r>
+      <w:r>
+        <w:rPr>
+          <w:b/>
+          <w:bCs/>
+          <w:color w:val="EE0000"/>
+        </w:rPr>
+        <w:t xml:space="preserve">whose folder does not exist </w:t>
+      </w:r>
+      <w:r>
+        <w:rPr>
+          <w:b/>
+          <w:bCs/>
+          <w:color w:val="EE0000"/>
+        </w:rPr>
+        <w:t>in the app router</w:t>
+      </w:r>
+      <w:r>
+        <w:rPr>
+          <w:b/>
+          <w:bCs/>
+          <w:color w:val="EE0000"/>
+        </w:rPr>
+        <w:t xml:space="preserve"> </w:t>
+      </w:r>
+      <w:r>
+        <w:rPr>
+          <w:b/>
+          <w:bCs/>
+          <w:color w:val="EE0000"/>
+        </w:rPr>
+        <w:t>t</w:t>
+      </w:r>
+      <w:r>
+        <w:rPr>
+          <w:b/>
+          <w:bCs/>
+          <w:color w:val="EE0000"/>
+        </w:rPr>
+        <w:t>hen</w:t>
+      </w:r>
+      <w:r>
+        <w:rPr>
+          <w:b/>
+          <w:bCs/>
+          <w:color w:val="EE0000"/>
+        </w:rPr>
+        <w:t xml:space="preserve"> </w:t>
+      </w:r>
+      <w:r>
+        <w:rPr>
+          <w:b/>
+          <w:bCs/>
+          <w:color w:val="EE0000"/>
+        </w:rPr>
+        <w:t>we</w:t>
+      </w:r>
+      <w:r>
+        <w:rPr>
+          <w:b/>
+          <w:bCs/>
+          <w:color w:val="EE0000"/>
+        </w:rPr>
+        <w:t xml:space="preserve"> will go to 404 error</w:t>
+      </w:r>
+      <w:r>
+        <w:rPr>
+          <w:b/>
+          <w:bCs/>
+          <w:color w:val="EE0000"/>
+        </w:rPr>
+        <w:t xml:space="preserve"> page</w:t>
+      </w:r>
+      <w:r>
+        <w:rPr>
+          <w:b/>
+          <w:bCs/>
+          <w:color w:val="EE0000"/>
+        </w:rPr>
+        <w:t xml:space="preserve"> of that slug.</w:t>
+      </w:r>
+      <w:r>
+        <w:rPr>
+          <w:b/>
+          <w:bCs/>
+          <w:color w:val="EE0000"/>
+        </w:rPr>
+        <w:t xml:space="preserve"> </w:t>
       </w:r>
     </w:p>
     <w:p/>

</xml_diff>

<commit_message>
Lesson 71 PinCodes json + avoiding non serviceable Locations
</commit_message>
<xml_diff>
--- a/Notes3.docx
+++ b/Notes3.docx
@@ -6028,6 +6028,9 @@
         <w:jc w:val="center"/>
       </w:pPr>
       <w:r>
+        <w:rPr>
+          <w:noProof/>
+        </w:rPr>
         <w:lastRenderedPageBreak/>
         <w:drawing>
           <wp:inline distT="0" distB="0" distL="0" distR="0" wp14:anchorId="37E8385E" wp14:editId="632538FB">
@@ -6230,13 +6233,16 @@
       <w:r>
         <w:t xml:space="preserve"> </w:t>
       </w:r>
+      <w:r>
+        <w:t xml:space="preserve">The basic code </w:t>
+      </w:r>
       <w:proofErr w:type="gramStart"/>
       <w:r>
-        <w:t>The</w:t>
+        <w:t>look</w:t>
       </w:r>
       <w:proofErr w:type="gramEnd"/>
       <w:r>
-        <w:t xml:space="preserve"> basic code look like below</w:t>
+        <w:t xml:space="preserve"> like below</w:t>
       </w:r>
     </w:p>
     <w:p>
@@ -6244,6 +6250,9 @@
         <w:jc w:val="center"/>
       </w:pPr>
       <w:r>
+        <w:rPr>
+          <w:noProof/>
+        </w:rPr>
         <w:drawing>
           <wp:inline distT="0" distB="0" distL="0" distR="0" wp14:anchorId="6FC6685C" wp14:editId="4249BCDC">
             <wp:extent cx="4714875" cy="3111212"/>
@@ -6369,6 +6378,9 @@
         <w:jc w:val="center"/>
       </w:pPr>
       <w:r>
+        <w:rPr>
+          <w:noProof/>
+        </w:rPr>
         <w:drawing>
           <wp:inline distT="0" distB="0" distL="0" distR="0" wp14:anchorId="39933502" wp14:editId="5F655B5A">
             <wp:extent cx="5334744" cy="3896269"/>
@@ -6826,6 +6838,1962 @@
         <w:t xml:space="preserve"> </w:t>
       </w:r>
     </w:p>
+    <w:p>
+      <w:pPr>
+        <w:rPr>
+          <w:b/>
+          <w:bCs/>
+        </w:rPr>
+      </w:pPr>
+      <w:r>
+        <w:rPr>
+          <w:b/>
+          <w:bCs/>
+        </w:rPr>
+        <w:t xml:space="preserve">if we put a </w:t>
+      </w:r>
+      <w:proofErr w:type="spellStart"/>
+      <w:r>
+        <w:rPr>
+          <w:b/>
+          <w:bCs/>
+        </w:rPr>
+        <w:t>json</w:t>
+      </w:r>
+      <w:proofErr w:type="spellEnd"/>
+      <w:r>
+        <w:rPr>
+          <w:b/>
+          <w:bCs/>
+        </w:rPr>
+        <w:t xml:space="preserve"> file in a server then and hit it with an end point then will it mean that the </w:t>
+      </w:r>
+      <w:proofErr w:type="spellStart"/>
+      <w:r>
+        <w:rPr>
+          <w:b/>
+          <w:bCs/>
+        </w:rPr>
+        <w:t>json</w:t>
+      </w:r>
+      <w:proofErr w:type="spellEnd"/>
+      <w:r>
+        <w:rPr>
+          <w:b/>
+          <w:bCs/>
+        </w:rPr>
+        <w:t xml:space="preserve"> will reach browser as an API</w:t>
+      </w:r>
+    </w:p>
+    <w:p>
+      <w:r>
+        <w:t>Yes — essentially that’s what happens.</w:t>
+      </w:r>
+    </w:p>
+    <w:p>
+      <w:r>
+        <w:t>If a server exposes a JSON file through an endpoint like:</w:t>
+      </w:r>
+    </w:p>
+    <w:p>
+      <w:r>
+        <w:t>/</w:t>
+      </w:r>
+      <w:proofErr w:type="spellStart"/>
+      <w:r>
+        <w:t>api</w:t>
+      </w:r>
+      <w:proofErr w:type="spellEnd"/>
+      <w:r>
+        <w:t>/products</w:t>
+      </w:r>
+    </w:p>
+    <w:p>
+      <w:r>
+        <w:t>and the response is:</w:t>
+      </w:r>
+    </w:p>
+    <w:p>
+      <w:r>
+        <w:lastRenderedPageBreak/>
+        <w:t>[</w:t>
+      </w:r>
+    </w:p>
+    <w:p>
+      <w:r>
+        <w:t xml:space="preserve">  </w:t>
+      </w:r>
+      <w:proofErr w:type="gramStart"/>
+      <w:r>
+        <w:t>{ "</w:t>
+      </w:r>
+      <w:proofErr w:type="gramEnd"/>
+      <w:r>
+        <w:t>name": "</w:t>
+      </w:r>
+      <w:proofErr w:type="spellStart"/>
+      <w:r>
+        <w:t>Tshirt</w:t>
+      </w:r>
+      <w:proofErr w:type="spellEnd"/>
+      <w:r>
+        <w:t xml:space="preserve">", "price": </w:t>
+      </w:r>
+      <w:proofErr w:type="gramStart"/>
+      <w:r>
+        <w:t>499 }</w:t>
+      </w:r>
+      <w:proofErr w:type="gramEnd"/>
+      <w:r>
+        <w:t>,</w:t>
+      </w:r>
+    </w:p>
+    <w:p>
+      <w:r>
+        <w:t xml:space="preserve">  </w:t>
+      </w:r>
+      <w:proofErr w:type="gramStart"/>
+      <w:r>
+        <w:t>{ "</w:t>
+      </w:r>
+      <w:proofErr w:type="gramEnd"/>
+      <w:r>
+        <w:t xml:space="preserve">name": "Hoodie", "price": </w:t>
+      </w:r>
+      <w:proofErr w:type="gramStart"/>
+      <w:r>
+        <w:t>999 }</w:t>
+      </w:r>
+      <w:proofErr w:type="gramEnd"/>
+    </w:p>
+    <w:p>
+      <w:r>
+        <w:t>]</w:t>
+      </w:r>
+    </w:p>
+    <w:p>
+      <w:r>
+        <w:t>then:</w:t>
+      </w:r>
+    </w:p>
+    <w:p>
+      <w:r>
+        <w:rPr>
+          <w:rFonts w:ascii="Segoe UI Emoji" w:hAnsi="Segoe UI Emoji" w:cs="Segoe UI Emoji"/>
+        </w:rPr>
+        <w:t>✅</w:t>
+      </w:r>
+      <w:r>
+        <w:t xml:space="preserve"> The browser receives that JSON as an API response.</w:t>
+      </w:r>
+    </w:p>
+    <w:p>
+      <w:r>
+        <w:pict w14:anchorId="1B276EE5">
+          <v:rect id="_x0000_i1098" style="width:0;height:1.5pt" o:hralign="center" o:hrstd="t" o:hr="t" fillcolor="#a0a0a0" stroked="f"/>
+        </w:pict>
+      </w:r>
+    </w:p>
+    <w:p>
+      <w:pPr>
+        <w:rPr>
+          <w:b/>
+          <w:bCs/>
+        </w:rPr>
+      </w:pPr>
+      <w:r>
+        <w:rPr>
+          <w:rFonts w:ascii="Segoe UI Emoji" w:hAnsi="Segoe UI Emoji" w:cs="Segoe UI Emoji"/>
+          <w:b/>
+          <w:bCs/>
+        </w:rPr>
+        <w:t>🧠</w:t>
+      </w:r>
+      <w:r>
+        <w:rPr>
+          <w:b/>
+          <w:bCs/>
+        </w:rPr>
+        <w:t xml:space="preserve"> Important distinction</w:t>
+      </w:r>
+    </w:p>
+    <w:p>
+      <w:r>
+        <w:t>A JSON file itself is just a file.</w:t>
+      </w:r>
+    </w:p>
+    <w:p>
+      <w:r>
+        <w:t>It becomes an “API response” when:</w:t>
+      </w:r>
+    </w:p>
+    <w:p>
+      <w:pPr>
+        <w:numPr>
+          <w:ilvl w:val="0"/>
+          <w:numId w:val="11"/>
+        </w:numPr>
+      </w:pPr>
+      <w:r>
+        <w:t>A client (browser/frontend) sends an HTTP request</w:t>
+      </w:r>
+    </w:p>
+    <w:p>
+      <w:pPr>
+        <w:numPr>
+          <w:ilvl w:val="0"/>
+          <w:numId w:val="11"/>
+        </w:numPr>
+      </w:pPr>
+      <w:r>
+        <w:t>Server responds with JSON data</w:t>
+      </w:r>
+    </w:p>
+    <w:p>
+      <w:r>
+        <w:pict w14:anchorId="52D5FB44">
+          <v:rect id="_x0000_i1099" style="width:0;height:1.5pt" o:hralign="center" o:hrstd="t" o:hr="t" fillcolor="#a0a0a0" stroked="f"/>
+        </w:pict>
+      </w:r>
+    </w:p>
+    <w:p>
+      <w:pPr>
+        <w:rPr>
+          <w:b/>
+          <w:bCs/>
+        </w:rPr>
+      </w:pPr>
+      <w:r>
+        <w:rPr>
+          <w:b/>
+          <w:bCs/>
+        </w:rPr>
+        <w:t>Example</w:t>
+      </w:r>
+    </w:p>
+    <w:p>
+      <w:pPr>
+        <w:rPr>
+          <w:b/>
+          <w:bCs/>
+        </w:rPr>
+      </w:pPr>
+      <w:r>
+        <w:rPr>
+          <w:b/>
+          <w:bCs/>
+        </w:rPr>
+        <w:t>Server</w:t>
+      </w:r>
+    </w:p>
+    <w:p>
+      <w:proofErr w:type="spellStart"/>
+      <w:proofErr w:type="gramStart"/>
+      <w:r>
+        <w:t>app.get</w:t>
+      </w:r>
+      <w:proofErr w:type="spellEnd"/>
+      <w:r>
+        <w:t>(</w:t>
+      </w:r>
+      <w:proofErr w:type="gramEnd"/>
+      <w:r>
+        <w:t>"/</w:t>
+      </w:r>
+      <w:proofErr w:type="spellStart"/>
+      <w:r>
+        <w:t>api</w:t>
+      </w:r>
+      <w:proofErr w:type="spellEnd"/>
+      <w:r>
+        <w:t>/products", (</w:t>
+      </w:r>
+      <w:proofErr w:type="spellStart"/>
+      <w:r>
+        <w:t>req</w:t>
+      </w:r>
+      <w:proofErr w:type="spellEnd"/>
+      <w:r>
+        <w:t>, res) =&gt; {</w:t>
+      </w:r>
+    </w:p>
+    <w:p>
+      <w:r>
+        <w:t xml:space="preserve">  </w:t>
+      </w:r>
+      <w:proofErr w:type="spellStart"/>
+      <w:proofErr w:type="gramStart"/>
+      <w:r>
+        <w:t>res.json</w:t>
+      </w:r>
+      <w:proofErr w:type="spellEnd"/>
+      <w:proofErr w:type="gramEnd"/>
+      <w:r>
+        <w:t>(products)</w:t>
+      </w:r>
+    </w:p>
+    <w:p>
+      <w:r>
+        <w:t>})</w:t>
+      </w:r>
+    </w:p>
+    <w:p>
+      <w:pPr>
+        <w:rPr>
+          <w:b/>
+          <w:bCs/>
+        </w:rPr>
+      </w:pPr>
+      <w:r>
+        <w:rPr>
+          <w:b/>
+          <w:bCs/>
+        </w:rPr>
+        <w:t>Browser</w:t>
+      </w:r>
+    </w:p>
+    <w:p>
+      <w:r>
+        <w:t>fetch("/</w:t>
+      </w:r>
+      <w:proofErr w:type="spellStart"/>
+      <w:r>
+        <w:t>api</w:t>
+      </w:r>
+      <w:proofErr w:type="spellEnd"/>
+      <w:r>
+        <w:t>/products")</w:t>
+      </w:r>
+    </w:p>
+    <w:p>
+      <w:pPr>
+        <w:rPr>
+          <w:b/>
+          <w:bCs/>
+        </w:rPr>
+      </w:pPr>
+      <w:r>
+        <w:rPr>
+          <w:b/>
+          <w:bCs/>
+        </w:rPr>
+        <w:t>Result</w:t>
+      </w:r>
+    </w:p>
+    <w:p>
+      <w:r>
+        <w:t>Browser receives:</w:t>
+      </w:r>
+    </w:p>
+    <w:p>
+      <w:r>
+        <w:t>[</w:t>
+      </w:r>
+    </w:p>
+    <w:p>
+      <w:r>
+        <w:t xml:space="preserve">  </w:t>
+      </w:r>
+      <w:proofErr w:type="gramStart"/>
+      <w:r>
+        <w:t>{ "</w:t>
+      </w:r>
+      <w:proofErr w:type="gramEnd"/>
+      <w:r>
+        <w:t>name": "</w:t>
+      </w:r>
+      <w:proofErr w:type="spellStart"/>
+      <w:r>
+        <w:t>Tshirt</w:t>
+      </w:r>
+      <w:proofErr w:type="spellEnd"/>
+      <w:r>
+        <w:t xml:space="preserve">", "price": </w:t>
+      </w:r>
+      <w:proofErr w:type="gramStart"/>
+      <w:r>
+        <w:t>499 }</w:t>
+      </w:r>
+      <w:proofErr w:type="gramEnd"/>
+    </w:p>
+    <w:p>
+      <w:r>
+        <w:t>]</w:t>
+      </w:r>
+    </w:p>
+    <w:p>
+      <w:r>
+        <w:t>So yes:</w:t>
+      </w:r>
+    </w:p>
+    <w:p>
+      <w:r>
+        <w:t xml:space="preserve">JSON </w:t>
+      </w:r>
+      <w:proofErr w:type="spellStart"/>
+      <w:r>
+        <w:t>traveled</w:t>
+      </w:r>
+      <w:proofErr w:type="spellEnd"/>
+      <w:r>
+        <w:t xml:space="preserve"> from server → browser through HTTP</w:t>
+      </w:r>
+      <w:r>
+        <w:br/>
+        <w:t>therefore it behaved as an API response.</w:t>
+      </w:r>
+    </w:p>
+    <w:p>
+      <w:r>
+        <w:pict w14:anchorId="761542C1">
+          <v:rect id="_x0000_i1100" style="width:0;height:1.5pt" o:hralign="center" o:hrstd="t" o:hr="t" fillcolor="#a0a0a0" stroked="f"/>
+        </w:pict>
+      </w:r>
+    </w:p>
+    <w:p>
+      <w:pPr>
+        <w:rPr>
+          <w:b/>
+          <w:bCs/>
+        </w:rPr>
+      </w:pPr>
+      <w:r>
+        <w:rPr>
+          <w:rFonts w:ascii="Segoe UI Emoji" w:hAnsi="Segoe UI Emoji" w:cs="Segoe UI Emoji"/>
+          <w:b/>
+          <w:bCs/>
+        </w:rPr>
+        <w:t>📦</w:t>
+      </w:r>
+      <w:r>
+        <w:rPr>
+          <w:b/>
+          <w:bCs/>
+        </w:rPr>
+        <w:t xml:space="preserve"> Static JSON file case</w:t>
+      </w:r>
+    </w:p>
+    <w:p>
+      <w:r>
+        <w:t>Suppose you place:</w:t>
+      </w:r>
+    </w:p>
+    <w:p>
+      <w:r>
+        <w:lastRenderedPageBreak/>
+        <w:t>public/</w:t>
+      </w:r>
+      <w:proofErr w:type="spellStart"/>
+      <w:r>
+        <w:t>products.json</w:t>
+      </w:r>
+      <w:proofErr w:type="spellEnd"/>
+    </w:p>
+    <w:p>
+      <w:r>
+        <w:t>in a Next.js app.</w:t>
+      </w:r>
+    </w:p>
+    <w:p>
+      <w:r>
+        <w:t>Then browser can directly access:</w:t>
+      </w:r>
+    </w:p>
+    <w:p>
+      <w:r>
+        <w:t>http://localhost:3000/products.json</w:t>
+      </w:r>
+    </w:p>
+    <w:p>
+      <w:r>
+        <w:t>and receive raw JSON.</w:t>
+      </w:r>
+    </w:p>
+    <w:p>
+      <w:r>
+        <w:t>That is also effectively an API-style response, even though:</w:t>
+      </w:r>
+    </w:p>
+    <w:p>
+      <w:pPr>
+        <w:numPr>
+          <w:ilvl w:val="0"/>
+          <w:numId w:val="12"/>
+        </w:numPr>
+      </w:pPr>
+      <w:r>
+        <w:t>no backend logic ran</w:t>
+      </w:r>
+    </w:p>
+    <w:p>
+      <w:pPr>
+        <w:numPr>
+          <w:ilvl w:val="0"/>
+          <w:numId w:val="12"/>
+        </w:numPr>
+      </w:pPr>
+      <w:r>
+        <w:t>it’s just static file serving</w:t>
+      </w:r>
+    </w:p>
+    <w:p>
+      <w:r>
+        <w:pict w14:anchorId="28AEEB43">
+          <v:rect id="_x0000_i1101" style="width:0;height:1.5pt" o:hralign="center" o:hrstd="t" o:hr="t" fillcolor="#a0a0a0" stroked="f"/>
+        </w:pict>
+      </w:r>
+    </w:p>
+    <w:p>
+      <w:pPr>
+        <w:rPr>
+          <w:b/>
+          <w:bCs/>
+        </w:rPr>
+      </w:pPr>
+      <w:r>
+        <w:rPr>
+          <w:rFonts w:ascii="Segoe UI Emoji" w:hAnsi="Segoe UI Emoji" w:cs="Segoe UI Emoji"/>
+          <w:b/>
+          <w:bCs/>
+        </w:rPr>
+        <w:t>🔥</w:t>
+      </w:r>
+      <w:r>
+        <w:rPr>
+          <w:b/>
+          <w:bCs/>
+        </w:rPr>
+        <w:t xml:space="preserve"> Difference between static JSON and real API</w:t>
+      </w:r>
+    </w:p>
+    <w:tbl>
+      <w:tblPr>
+        <w:tblW w:w="0" w:type="auto"/>
+        <w:tblCellSpacing w:w="15" w:type="dxa"/>
+        <w:tblCellMar>
+          <w:top w:w="15" w:type="dxa"/>
+          <w:left w:w="15" w:type="dxa"/>
+          <w:bottom w:w="15" w:type="dxa"/>
+          <w:right w:w="15" w:type="dxa"/>
+        </w:tblCellMar>
+        <w:tblLook w:val="04A0" w:firstRow="1" w:lastRow="0" w:firstColumn="1" w:lastColumn="0" w:noHBand="0" w:noVBand="1"/>
+      </w:tblPr>
+      <w:tblGrid>
+        <w:gridCol w:w="2151"/>
+        <w:gridCol w:w="2378"/>
+      </w:tblGrid>
+      <w:tr>
+        <w:trPr>
+          <w:tblHeader/>
+          <w:tblCellSpacing w:w="15" w:type="dxa"/>
+        </w:trPr>
+        <w:tc>
+          <w:tcPr>
+            <w:tcW w:w="0" w:type="auto"/>
+            <w:vAlign w:val="center"/>
+            <w:hideMark/>
+          </w:tcPr>
+          <w:p>
+            <w:pPr>
+              <w:rPr>
+                <w:b/>
+                <w:bCs/>
+              </w:rPr>
+            </w:pPr>
+            <w:r>
+              <w:rPr>
+                <w:b/>
+                <w:bCs/>
+              </w:rPr>
+              <w:t>Static JSON File</w:t>
+            </w:r>
+          </w:p>
+        </w:tc>
+        <w:tc>
+          <w:tcPr>
+            <w:tcW w:w="0" w:type="auto"/>
+            <w:vAlign w:val="center"/>
+            <w:hideMark/>
+          </w:tcPr>
+          <w:p>
+            <w:pPr>
+              <w:rPr>
+                <w:b/>
+                <w:bCs/>
+              </w:rPr>
+            </w:pPr>
+            <w:r>
+              <w:rPr>
+                <w:b/>
+                <w:bCs/>
+              </w:rPr>
+              <w:t>API Route</w:t>
+            </w:r>
+          </w:p>
+        </w:tc>
+      </w:tr>
+      <w:tr>
+        <w:trPr>
+          <w:tblCellSpacing w:w="15" w:type="dxa"/>
+        </w:trPr>
+        <w:tc>
+          <w:tcPr>
+            <w:tcW w:w="0" w:type="auto"/>
+            <w:vAlign w:val="center"/>
+            <w:hideMark/>
+          </w:tcPr>
+          <w:p>
+            <w:r>
+              <w:t>Fixed data</w:t>
+            </w:r>
+          </w:p>
+        </w:tc>
+        <w:tc>
+          <w:tcPr>
+            <w:tcW w:w="0" w:type="auto"/>
+            <w:vAlign w:val="center"/>
+            <w:hideMark/>
+          </w:tcPr>
+          <w:p>
+            <w:r>
+              <w:t>Dynamic data</w:t>
+            </w:r>
+          </w:p>
+        </w:tc>
+      </w:tr>
+      <w:tr>
+        <w:trPr>
+          <w:tblCellSpacing w:w="15" w:type="dxa"/>
+        </w:trPr>
+        <w:tc>
+          <w:tcPr>
+            <w:tcW w:w="0" w:type="auto"/>
+            <w:vAlign w:val="center"/>
+            <w:hideMark/>
+          </w:tcPr>
+          <w:p>
+            <w:r>
+              <w:t>No logic</w:t>
+            </w:r>
+          </w:p>
+        </w:tc>
+        <w:tc>
+          <w:tcPr>
+            <w:tcW w:w="0" w:type="auto"/>
+            <w:vAlign w:val="center"/>
+            <w:hideMark/>
+          </w:tcPr>
+          <w:p>
+            <w:r>
+              <w:t>Can query DB</w:t>
+            </w:r>
+          </w:p>
+        </w:tc>
+      </w:tr>
+      <w:tr>
+        <w:trPr>
+          <w:tblCellSpacing w:w="15" w:type="dxa"/>
+        </w:trPr>
+        <w:tc>
+          <w:tcPr>
+            <w:tcW w:w="0" w:type="auto"/>
+            <w:vAlign w:val="center"/>
+            <w:hideMark/>
+          </w:tcPr>
+          <w:p>
+            <w:r>
+              <w:t>No authentication logic</w:t>
+            </w:r>
+          </w:p>
+        </w:tc>
+        <w:tc>
+          <w:tcPr>
+            <w:tcW w:w="0" w:type="auto"/>
+            <w:vAlign w:val="center"/>
+            <w:hideMark/>
+          </w:tcPr>
+          <w:p>
+            <w:r>
+              <w:t>Can validate/authenticate</w:t>
+            </w:r>
+          </w:p>
+        </w:tc>
+      </w:tr>
+      <w:tr>
+        <w:trPr>
+          <w:tblCellSpacing w:w="15" w:type="dxa"/>
+        </w:trPr>
+        <w:tc>
+          <w:tcPr>
+            <w:tcW w:w="0" w:type="auto"/>
+            <w:vAlign w:val="center"/>
+            <w:hideMark/>
+          </w:tcPr>
+          <w:p>
+            <w:r>
+              <w:t>Served as file</w:t>
+            </w:r>
+          </w:p>
+        </w:tc>
+        <w:tc>
+          <w:tcPr>
+            <w:tcW w:w="0" w:type="auto"/>
+            <w:vAlign w:val="center"/>
+            <w:hideMark/>
+          </w:tcPr>
+          <w:p>
+            <w:r>
+              <w:t>Generated response</w:t>
+            </w:r>
+          </w:p>
+        </w:tc>
+      </w:tr>
+    </w:tbl>
+    <w:p>
+      <w:r>
+        <w:pict w14:anchorId="59843AA3">
+          <v:rect id="_x0000_i1102" style="width:0;height:1.5pt" o:hralign="center" o:hrstd="t" o:hr="t" fillcolor="#a0a0a0" stroked="f"/>
+        </w:pict>
+      </w:r>
+    </w:p>
+    <w:p>
+      <w:pPr>
+        <w:rPr>
+          <w:b/>
+          <w:bCs/>
+        </w:rPr>
+      </w:pPr>
+      <w:r>
+        <w:rPr>
+          <w:b/>
+          <w:bCs/>
+        </w:rPr>
+        <w:t>Next.js example</w:t>
+      </w:r>
+    </w:p>
+    <w:p>
+      <w:pPr>
+        <w:rPr>
+          <w:b/>
+          <w:bCs/>
+        </w:rPr>
+      </w:pPr>
+      <w:r>
+        <w:rPr>
+          <w:b/>
+          <w:bCs/>
+        </w:rPr>
+        <w:t>Static JSON</w:t>
+      </w:r>
+    </w:p>
+    <w:p>
+      <w:r>
+        <w:t>/public/</w:t>
+      </w:r>
+      <w:proofErr w:type="spellStart"/>
+      <w:r>
+        <w:t>products.json</w:t>
+      </w:r>
+      <w:proofErr w:type="spellEnd"/>
+    </w:p>
+    <w:p>
+      <w:r>
+        <w:t>Accessible directly.</w:t>
+      </w:r>
+    </w:p>
+    <w:p>
+      <w:r>
+        <w:pict w14:anchorId="40CA5C20">
+          <v:rect id="_x0000_i1103" style="width:0;height:1.5pt" o:hralign="center" o:hrstd="t" o:hr="t" fillcolor="#a0a0a0" stroked="f"/>
+        </w:pict>
+      </w:r>
+    </w:p>
+    <w:p>
+      <w:pPr>
+        <w:rPr>
+          <w:b/>
+          <w:bCs/>
+        </w:rPr>
+      </w:pPr>
+      <w:r>
+        <w:rPr>
+          <w:b/>
+          <w:bCs/>
+        </w:rPr>
+        <w:t>Real API</w:t>
+      </w:r>
+    </w:p>
+    <w:p>
+      <w:r>
+        <w:t>/app/</w:t>
+      </w:r>
+      <w:proofErr w:type="spellStart"/>
+      <w:r>
+        <w:t>api</w:t>
+      </w:r>
+      <w:proofErr w:type="spellEnd"/>
+      <w:r>
+        <w:t>/products/route.js</w:t>
+      </w:r>
+    </w:p>
+    <w:p>
+      <w:r>
+        <w:t xml:space="preserve">export async function </w:t>
+      </w:r>
+      <w:proofErr w:type="gramStart"/>
+      <w:r>
+        <w:t>GET(</w:t>
+      </w:r>
+      <w:proofErr w:type="gramEnd"/>
+      <w:r>
+        <w:t>) {</w:t>
+      </w:r>
+    </w:p>
+    <w:p>
+      <w:r>
+        <w:t xml:space="preserve">  return </w:t>
+      </w:r>
+      <w:proofErr w:type="spellStart"/>
+      <w:r>
+        <w:t>Response.json</w:t>
+      </w:r>
+      <w:proofErr w:type="spellEnd"/>
+      <w:r>
+        <w:t>(products)</w:t>
+      </w:r>
+    </w:p>
+    <w:p>
+      <w:r>
+        <w:t>}</w:t>
+      </w:r>
+    </w:p>
+    <w:p>
+      <w:r>
+        <w:pict w14:anchorId="2E3D1A75">
+          <v:rect id="_x0000_i1104" style="width:0;height:1.5pt" o:hralign="center" o:hrstd="t" o:hr="t" fillcolor="#a0a0a0" stroked="f"/>
+        </w:pict>
+      </w:r>
+    </w:p>
+    <w:p>
+      <w:pPr>
+        <w:rPr>
+          <w:b/>
+          <w:bCs/>
+        </w:rPr>
+      </w:pPr>
+      <w:r>
+        <w:rPr>
+          <w:b/>
+          <w:bCs/>
+        </w:rPr>
+        <w:t>Key understanding</w:t>
+      </w:r>
+    </w:p>
+    <w:p>
+      <w:r>
+        <w:t>API does not mean “special technology”</w:t>
+      </w:r>
+    </w:p>
+    <w:p>
+      <w:r>
+        <w:t>An API is fundamentally:</w:t>
+      </w:r>
+    </w:p>
+    <w:p>
+      <w:r>
+        <w:lastRenderedPageBreak/>
+        <w:t>A way for one program to communicate with another through requests/responses.</w:t>
+      </w:r>
+    </w:p>
+    <w:p>
+      <w:r>
+        <w:t>JSON is just the data format commonly used.</w:t>
+      </w:r>
+    </w:p>
+    <w:p>
+      <w:pPr>
+        <w:rPr>
+          <w:b/>
+          <w:bCs/>
+        </w:rPr>
+      </w:pPr>
+      <w:r>
+        <w:rPr>
+          <w:b/>
+          <w:bCs/>
+        </w:rPr>
+        <w:t xml:space="preserve">how browser know that </w:t>
+      </w:r>
+      <w:proofErr w:type="spellStart"/>
+      <w:r>
+        <w:rPr>
+          <w:b/>
+          <w:bCs/>
+        </w:rPr>
+        <w:t>upcoiing</w:t>
+      </w:r>
+      <w:proofErr w:type="spellEnd"/>
+      <w:r>
+        <w:rPr>
+          <w:b/>
+          <w:bCs/>
+        </w:rPr>
+        <w:t xml:space="preserve"> files from server is a </w:t>
+      </w:r>
+      <w:proofErr w:type="spellStart"/>
+      <w:r>
+        <w:rPr>
+          <w:b/>
+          <w:bCs/>
+        </w:rPr>
+        <w:t>json</w:t>
+      </w:r>
+      <w:proofErr w:type="spellEnd"/>
+      <w:r>
+        <w:rPr>
+          <w:b/>
+          <w:bCs/>
+        </w:rPr>
+        <w:t xml:space="preserve"> file to show as an </w:t>
+      </w:r>
+      <w:proofErr w:type="spellStart"/>
+      <w:r>
+        <w:rPr>
+          <w:b/>
+          <w:bCs/>
+        </w:rPr>
+        <w:t>api</w:t>
+      </w:r>
+      <w:proofErr w:type="spellEnd"/>
+      <w:r>
+        <w:rPr>
+          <w:b/>
+          <w:bCs/>
+        </w:rPr>
+        <w:t>(</w:t>
+      </w:r>
+      <w:proofErr w:type="spellStart"/>
+      <w:r>
+        <w:rPr>
+          <w:b/>
+          <w:bCs/>
+        </w:rPr>
+        <w:t>onlienr</w:t>
+      </w:r>
+      <w:proofErr w:type="spellEnd"/>
+      <w:r>
+        <w:rPr>
+          <w:b/>
+          <w:bCs/>
+        </w:rPr>
+        <w:t>)</w:t>
+      </w:r>
+    </w:p>
+    <w:p>
+      <w:r>
+        <w:t xml:space="preserve">The server sends a </w:t>
+      </w:r>
+      <w:r>
+        <w:rPr>
+          <w:b/>
+          <w:bCs/>
+        </w:rPr>
+        <w:t>Content-Type header</w:t>
+      </w:r>
+      <w:r>
+        <w:t xml:space="preserve"> like:</w:t>
+      </w:r>
+    </w:p>
+    <w:p>
+      <w:r>
+        <w:t>Content-Type: application/</w:t>
+      </w:r>
+      <w:proofErr w:type="spellStart"/>
+      <w:r>
+        <w:t>json</w:t>
+      </w:r>
+      <w:proofErr w:type="spellEnd"/>
+    </w:p>
+    <w:p>
+      <w:r>
+        <w:t>and the browser uses this header to know the response is JSON/API data.</w:t>
+      </w:r>
+    </w:p>
+    <w:p>
+      <w:pPr>
+        <w:rPr>
+          <w:b/>
+          <w:bCs/>
+        </w:rPr>
+      </w:pPr>
+      <w:proofErr w:type="gramStart"/>
+      <w:r>
+        <w:rPr>
+          <w:b/>
+          <w:bCs/>
+        </w:rPr>
+        <w:t>so</w:t>
+      </w:r>
+      <w:proofErr w:type="gramEnd"/>
+      <w:r>
+        <w:rPr>
+          <w:b/>
+          <w:bCs/>
+        </w:rPr>
+        <w:t xml:space="preserve"> server does it automatically</w:t>
+      </w:r>
+    </w:p>
+    <w:p>
+      <w:r>
+        <w:t>Usually yes — the server/framework automatically sets it when you send JSON.</w:t>
+      </w:r>
+    </w:p>
+    <w:p>
+      <w:r>
+        <w:t>Example in Express.js:</w:t>
+      </w:r>
+    </w:p>
+    <w:p>
+      <w:proofErr w:type="spellStart"/>
+      <w:proofErr w:type="gramStart"/>
+      <w:r>
+        <w:t>res.json</w:t>
+      </w:r>
+      <w:proofErr w:type="spellEnd"/>
+      <w:proofErr w:type="gramEnd"/>
+      <w:r>
+        <w:t>(data)</w:t>
+      </w:r>
+    </w:p>
+    <w:p>
+      <w:r>
+        <w:t>automatically sends:</w:t>
+      </w:r>
+    </w:p>
+    <w:p>
+      <w:r>
+        <w:t>Content-Type: application/</w:t>
+      </w:r>
+      <w:proofErr w:type="spellStart"/>
+      <w:r>
+        <w:t>json</w:t>
+      </w:r>
+      <w:proofErr w:type="spellEnd"/>
+    </w:p>
+    <w:p>
+      <w:r>
+        <w:t>But if you manually send data, you may need to set the header yourself.</w:t>
+      </w:r>
+    </w:p>
+    <w:p>
+      <w:pPr>
+        <w:rPr>
+          <w:b/>
+          <w:bCs/>
+        </w:rPr>
+      </w:pPr>
+      <w:r>
+        <w:rPr>
+          <w:b/>
+          <w:bCs/>
+        </w:rPr>
+        <w:t>even a normal server does it</w:t>
+      </w:r>
+    </w:p>
+    <w:p>
+      <w:r>
+        <w:t>Not every “normal server” automatically does it.</w:t>
+      </w:r>
+    </w:p>
+    <w:p>
+      <w:r>
+        <w:t xml:space="preserve">It depends on </w:t>
+      </w:r>
+      <w:r>
+        <w:rPr>
+          <w:b/>
+          <w:bCs/>
+        </w:rPr>
+        <w:t>how the server sends the response</w:t>
+      </w:r>
+      <w:r>
+        <w:t>.</w:t>
+      </w:r>
+    </w:p>
+    <w:p>
+      <w:r>
+        <w:t>Examples:</w:t>
+      </w:r>
+    </w:p>
+    <w:p>
+      <w:pPr>
+        <w:numPr>
+          <w:ilvl w:val="0"/>
+          <w:numId w:val="13"/>
+        </w:numPr>
+      </w:pPr>
+      <w:r>
+        <w:t>If server/framework has a JSON helper (</w:t>
+      </w:r>
+      <w:proofErr w:type="spellStart"/>
+      <w:proofErr w:type="gramStart"/>
+      <w:r>
+        <w:t>res.json</w:t>
+      </w:r>
+      <w:proofErr w:type="spellEnd"/>
+      <w:proofErr w:type="gramEnd"/>
+      <w:r>
+        <w:t xml:space="preserve">, </w:t>
+      </w:r>
+      <w:proofErr w:type="spellStart"/>
+      <w:r>
+        <w:t>Response.json</w:t>
+      </w:r>
+      <w:proofErr w:type="spellEnd"/>
+      <w:r>
+        <w:t>)</w:t>
+      </w:r>
+      <w:r>
+        <w:br/>
+        <w:t xml:space="preserve">→ </w:t>
+      </w:r>
+      <w:r>
+        <w:rPr>
+          <w:rFonts w:ascii="Segoe UI Emoji" w:hAnsi="Segoe UI Emoji" w:cs="Segoe UI Emoji"/>
+        </w:rPr>
+        <w:t>✅</w:t>
+      </w:r>
+      <w:r>
+        <w:t xml:space="preserve"> it automatically sets:</w:t>
+      </w:r>
+    </w:p>
+    <w:p>
+      <w:r>
+        <w:t>Content-Type: application/</w:t>
+      </w:r>
+      <w:proofErr w:type="spellStart"/>
+      <w:r>
+        <w:t>json</w:t>
+      </w:r>
+      <w:proofErr w:type="spellEnd"/>
+    </w:p>
+    <w:p>
+      <w:pPr>
+        <w:numPr>
+          <w:ilvl w:val="0"/>
+          <w:numId w:val="14"/>
+        </w:numPr>
+      </w:pPr>
+      <w:r>
+        <w:t>If server just sends raw text/file manually</w:t>
+      </w:r>
+      <w:r>
+        <w:br/>
+        <w:t xml:space="preserve">→ </w:t>
+      </w:r>
+      <w:r>
+        <w:rPr>
+          <w:rFonts w:ascii="Segoe UI Emoji" w:hAnsi="Segoe UI Emoji" w:cs="Segoe UI Emoji"/>
+        </w:rPr>
+        <w:t>❌</w:t>
+      </w:r>
+      <w:r>
+        <w:t xml:space="preserve"> it may not set JSON type automatically</w:t>
+      </w:r>
+    </w:p>
+    <w:p>
+      <w:r>
+        <w:t>Example:</w:t>
+      </w:r>
+    </w:p>
+    <w:p>
+      <w:proofErr w:type="spellStart"/>
+      <w:proofErr w:type="gramStart"/>
+      <w:r>
+        <w:t>res.send</w:t>
+      </w:r>
+      <w:proofErr w:type="spellEnd"/>
+      <w:proofErr w:type="gramEnd"/>
+      <w:r>
+        <w:t>('{"</w:t>
+      </w:r>
+      <w:proofErr w:type="spellStart"/>
+      <w:r>
+        <w:t>name":"Coder</w:t>
+      </w:r>
+      <w:proofErr w:type="spellEnd"/>
+      <w:r>
+        <w:t>"}')</w:t>
+      </w:r>
+    </w:p>
+    <w:p>
+      <w:r>
+        <w:t>may become:</w:t>
+      </w:r>
+    </w:p>
+    <w:p>
+      <w:r>
+        <w:t>Content-Type: text/html</w:t>
+      </w:r>
+    </w:p>
+    <w:p>
+      <w:r>
+        <w:t>unless explicitly set.</w:t>
+      </w:r>
+    </w:p>
+    <w:p>
+      <w:r>
+        <w:t>So:</w:t>
+      </w:r>
+    </w:p>
+    <w:p>
+      <w:r>
+        <w:t>Servers don’t magically detect JSON perfectly — frameworks/helpers usually handle it.</w:t>
+      </w:r>
+    </w:p>
+    <w:p>
+      <w:pPr>
+        <w:rPr>
+          <w:b/>
+          <w:bCs/>
+        </w:rPr>
+      </w:pPr>
+      <w:proofErr w:type="gramStart"/>
+      <w:r>
+        <w:rPr>
+          <w:b/>
+          <w:bCs/>
+        </w:rPr>
+        <w:t>so</w:t>
+      </w:r>
+      <w:proofErr w:type="gramEnd"/>
+      <w:r>
+        <w:rPr>
+          <w:b/>
+          <w:bCs/>
+        </w:rPr>
+        <w:t xml:space="preserve"> tell me do we import </w:t>
+      </w:r>
+      <w:proofErr w:type="spellStart"/>
+      <w:r>
+        <w:rPr>
+          <w:b/>
+          <w:bCs/>
+        </w:rPr>
+        <w:t>json</w:t>
+      </w:r>
+      <w:proofErr w:type="spellEnd"/>
+      <w:r>
+        <w:rPr>
+          <w:b/>
+          <w:bCs/>
+        </w:rPr>
+        <w:t xml:space="preserve"> file by import only in next js or is it just a normal js feature</w:t>
+      </w:r>
+    </w:p>
+    <w:p>
+      <w:r>
+        <w:t>Importing a JSON file with:</w:t>
+      </w:r>
+    </w:p>
+    <w:p>
+      <w:r>
+        <w:t>import data from "./</w:t>
+      </w:r>
+      <w:proofErr w:type="spellStart"/>
+      <w:r>
+        <w:t>data.json</w:t>
+      </w:r>
+      <w:proofErr w:type="spellEnd"/>
+      <w:r>
+        <w:t>"</w:t>
+      </w:r>
+    </w:p>
+    <w:p>
+      <w:r>
+        <w:lastRenderedPageBreak/>
+        <w:t xml:space="preserve">is mainly a </w:t>
+      </w:r>
+      <w:r>
+        <w:rPr>
+          <w:b/>
+          <w:bCs/>
+        </w:rPr>
+        <w:t>JavaScript module/bundler feature</w:t>
+      </w:r>
+      <w:r>
+        <w:t>, not something unique to Next.js.</w:t>
+      </w:r>
+    </w:p>
+    <w:p>
+      <w:r>
+        <w:t>Modern environments like:</w:t>
+      </w:r>
+    </w:p>
+    <w:p>
+      <w:pPr>
+        <w:numPr>
+          <w:ilvl w:val="0"/>
+          <w:numId w:val="15"/>
+        </w:numPr>
+      </w:pPr>
+      <w:r>
+        <w:t>Next.js</w:t>
+      </w:r>
+    </w:p>
+    <w:p>
+      <w:pPr>
+        <w:numPr>
+          <w:ilvl w:val="0"/>
+          <w:numId w:val="15"/>
+        </w:numPr>
+      </w:pPr>
+      <w:r>
+        <w:t>Vite</w:t>
+      </w:r>
+    </w:p>
+    <w:p>
+      <w:pPr>
+        <w:numPr>
+          <w:ilvl w:val="0"/>
+          <w:numId w:val="15"/>
+        </w:numPr>
+      </w:pPr>
+      <w:r>
+        <w:t>Webpack</w:t>
+      </w:r>
+    </w:p>
+    <w:p>
+      <w:pPr>
+        <w:numPr>
+          <w:ilvl w:val="0"/>
+          <w:numId w:val="15"/>
+        </w:numPr>
+      </w:pPr>
+      <w:r>
+        <w:t>Node.js (modern versions)</w:t>
+      </w:r>
+    </w:p>
+    <w:p>
+      <w:r>
+        <w:t>support JSON imports automatically.</w:t>
+      </w:r>
+    </w:p>
+    <w:p>
+      <w:r>
+        <w:pict w14:anchorId="549D14D8">
+          <v:rect id="_x0000_i1124" style="width:0;height:1.5pt" o:hralign="center" o:hrstd="t" o:hr="t" fillcolor="#a0a0a0" stroked="f"/>
+        </w:pict>
+      </w:r>
+    </w:p>
+    <w:p>
+      <w:pPr>
+        <w:rPr>
+          <w:b/>
+          <w:bCs/>
+        </w:rPr>
+      </w:pPr>
+      <w:r>
+        <w:rPr>
+          <w:b/>
+          <w:bCs/>
+        </w:rPr>
+        <w:t>Important nuance</w:t>
+      </w:r>
+    </w:p>
+    <w:p>
+      <w:r>
+        <w:t xml:space="preserve">Pure original JavaScript in browsers did </w:t>
+      </w:r>
+      <w:r>
+        <w:rPr>
+          <w:b/>
+          <w:bCs/>
+        </w:rPr>
+        <w:t>not traditionally support</w:t>
+      </w:r>
+      <w:r>
+        <w:t>:</w:t>
+      </w:r>
+    </w:p>
+    <w:p>
+      <w:r>
+        <w:t>import data from "./</w:t>
+      </w:r>
+      <w:proofErr w:type="spellStart"/>
+      <w:r>
+        <w:t>data.json</w:t>
+      </w:r>
+      <w:proofErr w:type="spellEnd"/>
+      <w:r>
+        <w:t>"</w:t>
+      </w:r>
+    </w:p>
+    <w:p>
+      <w:r>
+        <w:t>directly.</w:t>
+      </w:r>
+    </w:p>
+    <w:p>
+      <w:r>
+        <w:t>Support came through:</w:t>
+      </w:r>
+    </w:p>
+    <w:p>
+      <w:pPr>
+        <w:numPr>
+          <w:ilvl w:val="0"/>
+          <w:numId w:val="16"/>
+        </w:numPr>
+      </w:pPr>
+      <w:r>
+        <w:t>bundlers</w:t>
+      </w:r>
+    </w:p>
+    <w:p>
+      <w:pPr>
+        <w:numPr>
+          <w:ilvl w:val="0"/>
+          <w:numId w:val="16"/>
+        </w:numPr>
+      </w:pPr>
+      <w:r>
+        <w:t>runtimes</w:t>
+      </w:r>
+    </w:p>
+    <w:p>
+      <w:pPr>
+        <w:numPr>
+          <w:ilvl w:val="0"/>
+          <w:numId w:val="16"/>
+        </w:numPr>
+      </w:pPr>
+      <w:r>
+        <w:t>modern module systems</w:t>
+      </w:r>
+    </w:p>
+    <w:p>
+      <w:r>
+        <w:pict w14:anchorId="29357D82">
+          <v:rect id="_x0000_i1125" style="width:0;height:1.5pt" o:hralign="center" o:hrstd="t" o:hr="t" fillcolor="#a0a0a0" stroked="f"/>
+        </w:pict>
+      </w:r>
+    </w:p>
+    <w:p>
+      <w:pPr>
+        <w:rPr>
+          <w:b/>
+          <w:bCs/>
+        </w:rPr>
+      </w:pPr>
+      <w:r>
+        <w:rPr>
+          <w:b/>
+          <w:bCs/>
+        </w:rPr>
+        <w:t>In Next.js</w:t>
+      </w:r>
+    </w:p>
+    <w:p>
+      <w:r>
+        <w:t>When you do:</w:t>
+      </w:r>
+    </w:p>
+    <w:p>
+      <w:r>
+        <w:t>import products from "@/data/</w:t>
+      </w:r>
+      <w:proofErr w:type="spellStart"/>
+      <w:r>
+        <w:t>products.json</w:t>
+      </w:r>
+      <w:proofErr w:type="spellEnd"/>
+      <w:r>
+        <w:t>"</w:t>
+      </w:r>
+    </w:p>
+    <w:p>
+      <w:pPr>
+        <w:pBdr>
+          <w:bottom w:val="single" w:sz="12" w:space="1" w:color="auto"/>
+        </w:pBdr>
+      </w:pPr>
+      <w:r>
+        <w:t>Next.js handles it during build time automatically.</w:t>
+      </w:r>
+    </w:p>
+    <w:p>
+      <w:pPr>
+        <w:rPr>
+          <w:b/>
+          <w:bCs/>
+        </w:rPr>
+      </w:pPr>
+      <w:r>
+        <w:rPr>
+          <w:b/>
+          <w:bCs/>
+        </w:rPr>
+        <w:t>New Lesson</w:t>
+      </w:r>
+    </w:p>
+    <w:p>
+      <w:r>
+        <w:t>S</w:t>
+      </w:r>
+      <w:r>
+        <w:t xml:space="preserve">o </w:t>
+      </w:r>
+      <w:proofErr w:type="gramStart"/>
+      <w:r>
+        <w:t>far</w:t>
+      </w:r>
+      <w:proofErr w:type="gramEnd"/>
+      <w:r>
+        <w:t xml:space="preserve"> the </w:t>
+      </w:r>
+      <w:proofErr w:type="spellStart"/>
+      <w:r>
+        <w:t>pincodes</w:t>
+      </w:r>
+      <w:proofErr w:type="spellEnd"/>
+      <w:r>
+        <w:t xml:space="preserve"> we </w:t>
+      </w:r>
+      <w:r>
+        <w:t>did</w:t>
+      </w:r>
+      <w:r>
+        <w:t xml:space="preserve"> fetch</w:t>
+      </w:r>
+      <w:r>
+        <w:t xml:space="preserve">. We fetched it with an </w:t>
+      </w:r>
+      <w:proofErr w:type="gramStart"/>
+      <w:r>
+        <w:t>API</w:t>
+      </w:r>
+      <w:r>
+        <w:t>( by</w:t>
+      </w:r>
+      <w:proofErr w:type="gramEnd"/>
+      <w:r>
+        <w:t xml:space="preserve"> backend we </w:t>
+      </w:r>
+      <w:proofErr w:type="spellStart"/>
+      <w:r>
+        <w:t>madfe</w:t>
+      </w:r>
+      <w:proofErr w:type="spellEnd"/>
+      <w:r>
+        <w:t xml:space="preserve"> in </w:t>
+      </w:r>
+      <w:proofErr w:type="spellStart"/>
+      <w:r>
+        <w:t>Nextjs</w:t>
+      </w:r>
+      <w:proofErr w:type="spellEnd"/>
+      <w:proofErr w:type="gramStart"/>
+      <w:r>
+        <w:t>)</w:t>
+      </w:r>
+      <w:r>
+        <w:t xml:space="preserve"> </w:t>
+      </w:r>
+      <w:r>
+        <w:t>.</w:t>
+      </w:r>
+      <w:proofErr w:type="gramEnd"/>
+      <w:r>
+        <w:t xml:space="preserve"> But we would want that out </w:t>
+      </w:r>
+      <w:proofErr w:type="spellStart"/>
+      <w:r>
+        <w:t>pincodes</w:t>
+      </w:r>
+      <w:proofErr w:type="spellEnd"/>
+      <w:r>
+        <w:t xml:space="preserve"> </w:t>
+      </w:r>
+      <w:r>
+        <w:t>s</w:t>
+      </w:r>
+      <w:r>
+        <w:t>houl</w:t>
+      </w:r>
+      <w:r>
+        <w:t>d</w:t>
+      </w:r>
+      <w:r>
+        <w:t xml:space="preserve"> be acces</w:t>
+      </w:r>
+      <w:r>
+        <w:t>s</w:t>
+      </w:r>
+      <w:r>
+        <w:t xml:space="preserve">ed through </w:t>
+      </w:r>
+      <w:proofErr w:type="spellStart"/>
+      <w:r>
+        <w:t>json</w:t>
+      </w:r>
+      <w:proofErr w:type="spellEnd"/>
+      <w:r>
+        <w:t xml:space="preserve"> file</w:t>
+      </w:r>
+      <w:r>
+        <w:t xml:space="preserve"> because it is such file which is going to be read only </w:t>
+      </w:r>
+      <w:r>
+        <w:t xml:space="preserve">whatever </w:t>
+      </w:r>
+      <w:proofErr w:type="spellStart"/>
+      <w:r>
+        <w:t>P</w:t>
+      </w:r>
+      <w:r>
+        <w:t>incodes</w:t>
+      </w:r>
+      <w:proofErr w:type="spellEnd"/>
+      <w:r>
+        <w:t xml:space="preserve"> we are going to service we will put it in </w:t>
+      </w:r>
+      <w:proofErr w:type="spellStart"/>
+      <w:r>
+        <w:t>json</w:t>
+      </w:r>
+      <w:proofErr w:type="spellEnd"/>
+      <w:r>
+        <w:t xml:space="preserve"> file</w:t>
+      </w:r>
+      <w:r>
+        <w:t xml:space="preserve"> and in most of the cases does not get changed in the future</w:t>
+      </w:r>
+      <w:r>
+        <w:t xml:space="preserve">. </w:t>
+      </w:r>
+      <w:proofErr w:type="gramStart"/>
+      <w:r>
+        <w:t>Lets</w:t>
+      </w:r>
+      <w:proofErr w:type="gramEnd"/>
+      <w:r>
+        <w:t xml:space="preserve"> </w:t>
+      </w:r>
+      <w:r>
+        <w:t xml:space="preserve">see how we can do this in </w:t>
+      </w:r>
+      <w:proofErr w:type="spellStart"/>
+      <w:r>
+        <w:t>Nextjs</w:t>
+      </w:r>
+      <w:proofErr w:type="spellEnd"/>
+      <w:r>
+        <w:t xml:space="preserve">. </w:t>
+      </w:r>
+    </w:p>
+    <w:p>
+      <w:pPr>
+        <w:rPr>
+          <w:b/>
+          <w:bCs/>
+        </w:rPr>
+      </w:pPr>
+      <w:r>
+        <w:t xml:space="preserve">We can find a file or folder by </w:t>
+      </w:r>
+      <w:r>
+        <w:rPr>
+          <w:b/>
+          <w:bCs/>
+        </w:rPr>
+        <w:t>ctrl + P</w:t>
+      </w:r>
+      <w:r>
+        <w:rPr>
+          <w:b/>
+          <w:bCs/>
+        </w:rPr>
+        <w:t>.</w:t>
+      </w:r>
+    </w:p>
+    <w:p>
+      <w:r>
+        <w:t>I</w:t>
+      </w:r>
+      <w:r>
+        <w:t>n</w:t>
+      </w:r>
+      <w:r>
+        <w:t xml:space="preserve"> N</w:t>
+      </w:r>
+      <w:r>
+        <w:t>e</w:t>
+      </w:r>
+      <w:r>
+        <w:t xml:space="preserve">xt js or mostly modern js you can import </w:t>
+      </w:r>
+      <w:proofErr w:type="spellStart"/>
+      <w:r>
+        <w:t>json</w:t>
+      </w:r>
+      <w:proofErr w:type="spellEnd"/>
+      <w:r>
+        <w:t xml:space="preserve"> file as sho</w:t>
+      </w:r>
+      <w:r>
+        <w:t>w</w:t>
+      </w:r>
+      <w:r>
+        <w:t>n below</w:t>
+      </w:r>
+    </w:p>
+    <w:p>
+      <w:pPr>
+        <w:jc w:val="center"/>
+      </w:pPr>
+      <w:r>
+        <w:drawing>
+          <wp:inline distT="0" distB="0" distL="0" distR="0" wp14:anchorId="6EF730DA" wp14:editId="1C1A1328">
+            <wp:extent cx="3972479" cy="219106"/>
+            <wp:effectExtent l="0" t="0" r="0" b="9525"/>
+            <wp:docPr id="1417966876" name="Picture 1"/>
+            <wp:cNvGraphicFramePr>
+              <a:graphicFrameLocks xmlns:a="http://schemas.openxmlformats.org/drawingml/2006/main" noChangeAspect="1"/>
+            </wp:cNvGraphicFramePr>
+            <a:graphic xmlns:a="http://schemas.openxmlformats.org/drawingml/2006/main">
+              <a:graphicData uri="http://schemas.openxmlformats.org/drawingml/2006/picture">
+                <pic:pic xmlns:pic="http://schemas.openxmlformats.org/drawingml/2006/picture">
+                  <pic:nvPicPr>
+                    <pic:cNvPr id="1417966876" name=""/>
+                    <pic:cNvPicPr/>
+                  </pic:nvPicPr>
+                  <pic:blipFill>
+                    <a:blip r:embed="rId9"/>
+                    <a:stretch>
+                      <a:fillRect/>
+                    </a:stretch>
+                  </pic:blipFill>
+                  <pic:spPr>
+                    <a:xfrm>
+                      <a:off x="0" y="0"/>
+                      <a:ext cx="3972479" cy="219106"/>
+                    </a:xfrm>
+                    <a:prstGeom prst="rect">
+                      <a:avLst/>
+                    </a:prstGeom>
+                  </pic:spPr>
+                </pic:pic>
+              </a:graphicData>
+            </a:graphic>
+          </wp:inline>
+        </w:drawing>
+      </w:r>
+    </w:p>
+    <w:p/>
+    <w:p>
+      <w:proofErr w:type="gramStart"/>
+      <w:r>
+        <w:t>Usually</w:t>
+      </w:r>
+      <w:proofErr w:type="gramEnd"/>
+      <w:r>
+        <w:t xml:space="preserve"> you can serve a </w:t>
+      </w:r>
+      <w:proofErr w:type="spellStart"/>
+      <w:r>
+        <w:t>json</w:t>
+      </w:r>
+      <w:proofErr w:type="spellEnd"/>
+      <w:r>
+        <w:t xml:space="preserve"> file by placing it in public folder.</w:t>
+      </w:r>
+      <w:r>
+        <w:t xml:space="preserve"> </w:t>
+      </w:r>
+    </w:p>
+    <w:p>
+      <w:pPr>
+        <w:rPr>
+          <w:b/>
+          <w:bCs/>
+        </w:rPr>
+      </w:pPr>
+      <w:r>
+        <w:rPr>
+          <w:b/>
+          <w:bCs/>
+        </w:rPr>
+        <w:t xml:space="preserve">In js </w:t>
+      </w:r>
+      <w:r>
+        <w:rPr>
+          <w:b/>
+          <w:bCs/>
+        </w:rPr>
+        <w:t>for arrays, in checks whether a particular index exists in the array.</w:t>
+      </w:r>
+    </w:p>
+    <w:p>
+      <w:r>
+        <w:lastRenderedPageBreak/>
+        <w:t xml:space="preserve">We need to add transaction id to the </w:t>
+      </w:r>
+      <w:r>
+        <w:t xml:space="preserve">order documents as </w:t>
+      </w:r>
+      <w:r>
+        <w:t xml:space="preserve">whenever we will process </w:t>
+      </w:r>
+      <w:r>
+        <w:t xml:space="preserve">order </w:t>
+      </w:r>
+      <w:r>
+        <w:t xml:space="preserve">or generate refund </w:t>
+      </w:r>
+      <w:r>
+        <w:t xml:space="preserve">then </w:t>
+      </w:r>
+      <w:r>
+        <w:t>P</w:t>
+      </w:r>
+      <w:r>
+        <w:t>aytm recognise a transaction by its transaction id.</w:t>
+      </w:r>
+    </w:p>
+    <w:p>
+      <w:pPr>
+        <w:rPr>
+          <w:b/>
+          <w:bCs/>
+        </w:rPr>
+      </w:pPr>
+      <w:r>
+        <w:rPr>
+          <w:b/>
+          <w:bCs/>
+        </w:rPr>
+        <w:t>When we reload a page th</w:t>
+      </w:r>
+      <w:r>
+        <w:rPr>
+          <w:b/>
+          <w:bCs/>
+        </w:rPr>
+        <w:t>e</w:t>
+      </w:r>
+      <w:r>
+        <w:rPr>
+          <w:b/>
+          <w:bCs/>
+        </w:rPr>
+        <w:t>n all the pre</w:t>
+      </w:r>
+      <w:r>
+        <w:rPr>
+          <w:b/>
+          <w:bCs/>
+        </w:rPr>
+        <w:t>v</w:t>
+      </w:r>
+      <w:r>
+        <w:rPr>
+          <w:b/>
+          <w:bCs/>
+        </w:rPr>
+        <w:t xml:space="preserve">ious request </w:t>
+      </w:r>
+      <w:r>
+        <w:rPr>
+          <w:b/>
+          <w:bCs/>
+        </w:rPr>
+        <w:t xml:space="preserve">will be rejected and </w:t>
+      </w:r>
+      <w:r>
+        <w:rPr>
+          <w:b/>
+          <w:bCs/>
+        </w:rPr>
+        <w:t xml:space="preserve">it </w:t>
+      </w:r>
+      <w:r>
+        <w:rPr>
+          <w:b/>
+          <w:bCs/>
+        </w:rPr>
+        <w:t>will not get the response from before loading request.</w:t>
+      </w:r>
+    </w:p>
+    <w:p>
+      <w:r>
+        <w:t xml:space="preserve">What we will do in track order is that </w:t>
+      </w:r>
+      <w:r>
+        <w:t xml:space="preserve">if delivery status unshipped then if we add link in delivery </w:t>
+      </w:r>
+      <w:proofErr w:type="gramStart"/>
+      <w:r>
+        <w:t>status(</w:t>
+      </w:r>
+      <w:proofErr w:type="gramEnd"/>
+      <w:r>
+        <w:t xml:space="preserve">who knows) </w:t>
+      </w:r>
+      <w:r>
+        <w:t xml:space="preserve">then that link will open on clicking in track </w:t>
+      </w:r>
+      <w:proofErr w:type="gramStart"/>
+      <w:r>
+        <w:t>order(</w:t>
+      </w:r>
+      <w:proofErr w:type="gramEnd"/>
+      <w:r>
+        <w:t>who knows)</w:t>
+      </w:r>
+    </w:p>
+    <w:p>
+      <w:pPr>
+        <w:jc w:val="center"/>
+      </w:pPr>
+      <w:r>
+        <w:drawing>
+          <wp:inline distT="0" distB="0" distL="0" distR="0" wp14:anchorId="26FD73D2" wp14:editId="680EE311">
+            <wp:extent cx="5731510" cy="1821815"/>
+            <wp:effectExtent l="0" t="0" r="2540" b="6985"/>
+            <wp:docPr id="2041522680" name="Picture 1"/>
+            <wp:cNvGraphicFramePr>
+              <a:graphicFrameLocks xmlns:a="http://schemas.openxmlformats.org/drawingml/2006/main" noChangeAspect="1"/>
+            </wp:cNvGraphicFramePr>
+            <a:graphic xmlns:a="http://schemas.openxmlformats.org/drawingml/2006/main">
+              <a:graphicData uri="http://schemas.openxmlformats.org/drawingml/2006/picture">
+                <pic:pic xmlns:pic="http://schemas.openxmlformats.org/drawingml/2006/picture">
+                  <pic:nvPicPr>
+                    <pic:cNvPr id="2041522680" name=""/>
+                    <pic:cNvPicPr/>
+                  </pic:nvPicPr>
+                  <pic:blipFill>
+                    <a:blip r:embed="rId10"/>
+                    <a:stretch>
+                      <a:fillRect/>
+                    </a:stretch>
+                  </pic:blipFill>
+                  <pic:spPr>
+                    <a:xfrm>
+                      <a:off x="0" y="0"/>
+                      <a:ext cx="5731510" cy="1821815"/>
+                    </a:xfrm>
+                    <a:prstGeom prst="rect">
+                      <a:avLst/>
+                    </a:prstGeom>
+                  </pic:spPr>
+                </pic:pic>
+              </a:graphicData>
+            </a:graphic>
+          </wp:inline>
+        </w:drawing>
+      </w:r>
+    </w:p>
     <w:p/>
     <w:sectPr>
       <w:pgSz w:w="11906" w:h="16838"/>
@@ -6840,6 +8808,155 @@
 <file path=word/numbering.xml><?xml version="1.0" encoding="utf-8"?>
 <w:numbering xmlns:wpc="http://schemas.microsoft.com/office/word/2010/wordprocessingCanvas" xmlns:cx="http://schemas.microsoft.com/office/drawing/2014/chartex" xmlns:cx1="http://schemas.microsoft.com/office/drawing/2015/9/8/chartex" xmlns:cx2="http://schemas.microsoft.com/office/drawing/2015/10/21/chartex" xmlns:cx3="http://schemas.microsoft.com/office/drawing/2016/5/9/chartex" xmlns:cx4="http://schemas.microsoft.com/office/drawing/2016/5/10/chartex" xmlns:cx5="http://schemas.microsoft.com/office/drawing/2016/5/11/chartex" xmlns:cx6="http://schemas.microsoft.com/office/drawing/2016/5/12/chartex" xmlns:cx7="http://schemas.microsoft.com/office/drawing/2016/5/13/chartex" xmlns:cx8="http://schemas.microsoft.com/office/drawing/2016/5/14/chartex" xmlns:mc="http://schemas.openxmlformats.org/markup-compatibility/2006" xmlns:aink="http://schemas.microsoft.com/office/drawing/2016/ink" xmlns:am3d="http://schemas.microsoft.com/office/drawing/2017/model3d" xmlns:o="urn:schemas-microsoft-com:office:office" xmlns:oel="http://schemas.microsoft.com/office/2019/extlst" xmlns:r="http://schemas.openxmlformats.org/officeDocument/2006/relationships" xmlns:m="http://schemas.openxmlformats.org/officeDocument/2006/math" xmlns:v="urn:schemas-microsoft-com:vml" xmlns:wp14="http://schemas.microsoft.com/office/word/2010/wordprocessingDrawing" xmlns:wp="http://schemas.openxmlformats.org/drawingml/2006/wordprocessingDrawing" xmlns:w10="urn:schemas-microsoft-com:office:word" xmlns:w="http://schemas.openxmlformats.org/wordprocessingml/2006/main" xmlns:w14="http://schemas.microsoft.com/office/word/2010/wordml" xmlns:w15="http://schemas.microsoft.com/office/word/2012/wordml" xmlns:w16cex="http://schemas.microsoft.com/office/word/2018/wordml/cex" xmlns:w16cid="http://schemas.microsoft.com/office/word/2016/wordml/cid" xmlns:w16="http://schemas.microsoft.com/office/word/2018/wordml" xmlns:w16du="http://schemas.microsoft.com/office/word/2023/wordml/word16du" xmlns:w16sdtdh="http://schemas.microsoft.com/office/word/2020/wordml/sdtdatahash" xmlns:w16sdtfl="http://schemas.microsoft.com/office/word/2024/wordml/sdtformatlock" xmlns:w16se="http://schemas.microsoft.com/office/word/2015/wordml/symex" xmlns:wpg="http://schemas.microsoft.com/office/word/2010/wordprocessingGroup" xmlns:wpi="http://schemas.microsoft.com/office/word/2010/wordprocessingInk" xmlns:wne="http://schemas.microsoft.com/office/word/2006/wordml" xmlns:wps="http://schemas.microsoft.com/office/word/2010/wordprocessingShape" mc:Ignorable="w14 w15 w16se w16cid w16 w16cex w16sdtdh w16sdtfl w16du wp14">
   <w:abstractNum w:abstractNumId="0" w15:restartNumberingAfterBreak="0">
+    <w:nsid w:val="06970D3F"/>
+    <w:multiLevelType w:val="multilevel"/>
+    <w:tmpl w:val="AA20F818"/>
+    <w:lvl w:ilvl="0">
+      <w:start w:val="1"/>
+      <w:numFmt w:val="bullet"/>
+      <w:lvlText w:val=""/>
+      <w:lvlJc w:val="left"/>
+      <w:pPr>
+        <w:tabs>
+          <w:tab w:val="num" w:pos="720"/>
+        </w:tabs>
+        <w:ind w:left="720" w:hanging="360"/>
+      </w:pPr>
+      <w:rPr>
+        <w:rFonts w:ascii="Symbol" w:hAnsi="Symbol" w:hint="default"/>
+        <w:sz w:val="20"/>
+      </w:rPr>
+    </w:lvl>
+    <w:lvl w:ilvl="1" w:tentative="1">
+      <w:start w:val="1"/>
+      <w:numFmt w:val="bullet"/>
+      <w:lvlText w:val="o"/>
+      <w:lvlJc w:val="left"/>
+      <w:pPr>
+        <w:tabs>
+          <w:tab w:val="num" w:pos="1440"/>
+        </w:tabs>
+        <w:ind w:left="1440" w:hanging="360"/>
+      </w:pPr>
+      <w:rPr>
+        <w:rFonts w:ascii="Courier New" w:hAnsi="Courier New" w:hint="default"/>
+        <w:sz w:val="20"/>
+      </w:rPr>
+    </w:lvl>
+    <w:lvl w:ilvl="2" w:tentative="1">
+      <w:start w:val="1"/>
+      <w:numFmt w:val="bullet"/>
+      <w:lvlText w:val=""/>
+      <w:lvlJc w:val="left"/>
+      <w:pPr>
+        <w:tabs>
+          <w:tab w:val="num" w:pos="2160"/>
+        </w:tabs>
+        <w:ind w:left="2160" w:hanging="360"/>
+      </w:pPr>
+      <w:rPr>
+        <w:rFonts w:ascii="Wingdings" w:hAnsi="Wingdings" w:hint="default"/>
+        <w:sz w:val="20"/>
+      </w:rPr>
+    </w:lvl>
+    <w:lvl w:ilvl="3" w:tentative="1">
+      <w:start w:val="1"/>
+      <w:numFmt w:val="bullet"/>
+      <w:lvlText w:val=""/>
+      <w:lvlJc w:val="left"/>
+      <w:pPr>
+        <w:tabs>
+          <w:tab w:val="num" w:pos="2880"/>
+        </w:tabs>
+        <w:ind w:left="2880" w:hanging="360"/>
+      </w:pPr>
+      <w:rPr>
+        <w:rFonts w:ascii="Wingdings" w:hAnsi="Wingdings" w:hint="default"/>
+        <w:sz w:val="20"/>
+      </w:rPr>
+    </w:lvl>
+    <w:lvl w:ilvl="4" w:tentative="1">
+      <w:start w:val="1"/>
+      <w:numFmt w:val="bullet"/>
+      <w:lvlText w:val=""/>
+      <w:lvlJc w:val="left"/>
+      <w:pPr>
+        <w:tabs>
+          <w:tab w:val="num" w:pos="3600"/>
+        </w:tabs>
+        <w:ind w:left="3600" w:hanging="360"/>
+      </w:pPr>
+      <w:rPr>
+        <w:rFonts w:ascii="Wingdings" w:hAnsi="Wingdings" w:hint="default"/>
+        <w:sz w:val="20"/>
+      </w:rPr>
+    </w:lvl>
+    <w:lvl w:ilvl="5" w:tentative="1">
+      <w:start w:val="1"/>
+      <w:numFmt w:val="bullet"/>
+      <w:lvlText w:val=""/>
+      <w:lvlJc w:val="left"/>
+      <w:pPr>
+        <w:tabs>
+          <w:tab w:val="num" w:pos="4320"/>
+        </w:tabs>
+        <w:ind w:left="4320" w:hanging="360"/>
+      </w:pPr>
+      <w:rPr>
+        <w:rFonts w:ascii="Wingdings" w:hAnsi="Wingdings" w:hint="default"/>
+        <w:sz w:val="20"/>
+      </w:rPr>
+    </w:lvl>
+    <w:lvl w:ilvl="6" w:tentative="1">
+      <w:start w:val="1"/>
+      <w:numFmt w:val="bullet"/>
+      <w:lvlText w:val=""/>
+      <w:lvlJc w:val="left"/>
+      <w:pPr>
+        <w:tabs>
+          <w:tab w:val="num" w:pos="5040"/>
+        </w:tabs>
+        <w:ind w:left="5040" w:hanging="360"/>
+      </w:pPr>
+      <w:rPr>
+        <w:rFonts w:ascii="Wingdings" w:hAnsi="Wingdings" w:hint="default"/>
+        <w:sz w:val="20"/>
+      </w:rPr>
+    </w:lvl>
+    <w:lvl w:ilvl="7" w:tentative="1">
+      <w:start w:val="1"/>
+      <w:numFmt w:val="bullet"/>
+      <w:lvlText w:val=""/>
+      <w:lvlJc w:val="left"/>
+      <w:pPr>
+        <w:tabs>
+          <w:tab w:val="num" w:pos="5760"/>
+        </w:tabs>
+        <w:ind w:left="5760" w:hanging="360"/>
+      </w:pPr>
+      <w:rPr>
+        <w:rFonts w:ascii="Wingdings" w:hAnsi="Wingdings" w:hint="default"/>
+        <w:sz w:val="20"/>
+      </w:rPr>
+    </w:lvl>
+    <w:lvl w:ilvl="8" w:tentative="1">
+      <w:start w:val="1"/>
+      <w:numFmt w:val="bullet"/>
+      <w:lvlText w:val=""/>
+      <w:lvlJc w:val="left"/>
+      <w:pPr>
+        <w:tabs>
+          <w:tab w:val="num" w:pos="6480"/>
+        </w:tabs>
+        <w:ind w:left="6480" w:hanging="360"/>
+      </w:pPr>
+      <w:rPr>
+        <w:rFonts w:ascii="Wingdings" w:hAnsi="Wingdings" w:hint="default"/>
+        <w:sz w:val="20"/>
+      </w:rPr>
+    </w:lvl>
+  </w:abstractNum>
+  <w:abstractNum w:abstractNumId="1" w15:restartNumberingAfterBreak="0">
     <w:nsid w:val="0E63190B"/>
     <w:multiLevelType w:val="multilevel"/>
     <w:tmpl w:val="CF521104"/>
@@ -6988,7 +9105,7 @@
       </w:rPr>
     </w:lvl>
   </w:abstractNum>
-  <w:abstractNum w:abstractNumId="1" w15:restartNumberingAfterBreak="0">
+  <w:abstractNum w:abstractNumId="2" w15:restartNumberingAfterBreak="0">
     <w:nsid w:val="12562D16"/>
     <w:multiLevelType w:val="multilevel"/>
     <w:tmpl w:val="C486EBF8"/>
@@ -7137,7 +9254,156 @@
       </w:rPr>
     </w:lvl>
   </w:abstractNum>
-  <w:abstractNum w:abstractNumId="2" w15:restartNumberingAfterBreak="0">
+  <w:abstractNum w:abstractNumId="3" w15:restartNumberingAfterBreak="0">
+    <w:nsid w:val="13B36130"/>
+    <w:multiLevelType w:val="multilevel"/>
+    <w:tmpl w:val="5BE613E0"/>
+    <w:lvl w:ilvl="0">
+      <w:start w:val="1"/>
+      <w:numFmt w:val="bullet"/>
+      <w:lvlText w:val=""/>
+      <w:lvlJc w:val="left"/>
+      <w:pPr>
+        <w:tabs>
+          <w:tab w:val="num" w:pos="720"/>
+        </w:tabs>
+        <w:ind w:left="720" w:hanging="360"/>
+      </w:pPr>
+      <w:rPr>
+        <w:rFonts w:ascii="Symbol" w:hAnsi="Symbol" w:hint="default"/>
+        <w:sz w:val="20"/>
+      </w:rPr>
+    </w:lvl>
+    <w:lvl w:ilvl="1" w:tentative="1">
+      <w:start w:val="1"/>
+      <w:numFmt w:val="bullet"/>
+      <w:lvlText w:val="o"/>
+      <w:lvlJc w:val="left"/>
+      <w:pPr>
+        <w:tabs>
+          <w:tab w:val="num" w:pos="1440"/>
+        </w:tabs>
+        <w:ind w:left="1440" w:hanging="360"/>
+      </w:pPr>
+      <w:rPr>
+        <w:rFonts w:ascii="Courier New" w:hAnsi="Courier New" w:hint="default"/>
+        <w:sz w:val="20"/>
+      </w:rPr>
+    </w:lvl>
+    <w:lvl w:ilvl="2" w:tentative="1">
+      <w:start w:val="1"/>
+      <w:numFmt w:val="bullet"/>
+      <w:lvlText w:val=""/>
+      <w:lvlJc w:val="left"/>
+      <w:pPr>
+        <w:tabs>
+          <w:tab w:val="num" w:pos="2160"/>
+        </w:tabs>
+        <w:ind w:left="2160" w:hanging="360"/>
+      </w:pPr>
+      <w:rPr>
+        <w:rFonts w:ascii="Wingdings" w:hAnsi="Wingdings" w:hint="default"/>
+        <w:sz w:val="20"/>
+      </w:rPr>
+    </w:lvl>
+    <w:lvl w:ilvl="3" w:tentative="1">
+      <w:start w:val="1"/>
+      <w:numFmt w:val="bullet"/>
+      <w:lvlText w:val=""/>
+      <w:lvlJc w:val="left"/>
+      <w:pPr>
+        <w:tabs>
+          <w:tab w:val="num" w:pos="2880"/>
+        </w:tabs>
+        <w:ind w:left="2880" w:hanging="360"/>
+      </w:pPr>
+      <w:rPr>
+        <w:rFonts w:ascii="Wingdings" w:hAnsi="Wingdings" w:hint="default"/>
+        <w:sz w:val="20"/>
+      </w:rPr>
+    </w:lvl>
+    <w:lvl w:ilvl="4" w:tentative="1">
+      <w:start w:val="1"/>
+      <w:numFmt w:val="bullet"/>
+      <w:lvlText w:val=""/>
+      <w:lvlJc w:val="left"/>
+      <w:pPr>
+        <w:tabs>
+          <w:tab w:val="num" w:pos="3600"/>
+        </w:tabs>
+        <w:ind w:left="3600" w:hanging="360"/>
+      </w:pPr>
+      <w:rPr>
+        <w:rFonts w:ascii="Wingdings" w:hAnsi="Wingdings" w:hint="default"/>
+        <w:sz w:val="20"/>
+      </w:rPr>
+    </w:lvl>
+    <w:lvl w:ilvl="5" w:tentative="1">
+      <w:start w:val="1"/>
+      <w:numFmt w:val="bullet"/>
+      <w:lvlText w:val=""/>
+      <w:lvlJc w:val="left"/>
+      <w:pPr>
+        <w:tabs>
+          <w:tab w:val="num" w:pos="4320"/>
+        </w:tabs>
+        <w:ind w:left="4320" w:hanging="360"/>
+      </w:pPr>
+      <w:rPr>
+        <w:rFonts w:ascii="Wingdings" w:hAnsi="Wingdings" w:hint="default"/>
+        <w:sz w:val="20"/>
+      </w:rPr>
+    </w:lvl>
+    <w:lvl w:ilvl="6" w:tentative="1">
+      <w:start w:val="1"/>
+      <w:numFmt w:val="bullet"/>
+      <w:lvlText w:val=""/>
+      <w:lvlJc w:val="left"/>
+      <w:pPr>
+        <w:tabs>
+          <w:tab w:val="num" w:pos="5040"/>
+        </w:tabs>
+        <w:ind w:left="5040" w:hanging="360"/>
+      </w:pPr>
+      <w:rPr>
+        <w:rFonts w:ascii="Wingdings" w:hAnsi="Wingdings" w:hint="default"/>
+        <w:sz w:val="20"/>
+      </w:rPr>
+    </w:lvl>
+    <w:lvl w:ilvl="7" w:tentative="1">
+      <w:start w:val="1"/>
+      <w:numFmt w:val="bullet"/>
+      <w:lvlText w:val=""/>
+      <w:lvlJc w:val="left"/>
+      <w:pPr>
+        <w:tabs>
+          <w:tab w:val="num" w:pos="5760"/>
+        </w:tabs>
+        <w:ind w:left="5760" w:hanging="360"/>
+      </w:pPr>
+      <w:rPr>
+        <w:rFonts w:ascii="Wingdings" w:hAnsi="Wingdings" w:hint="default"/>
+        <w:sz w:val="20"/>
+      </w:rPr>
+    </w:lvl>
+    <w:lvl w:ilvl="8" w:tentative="1">
+      <w:start w:val="1"/>
+      <w:numFmt w:val="bullet"/>
+      <w:lvlText w:val=""/>
+      <w:lvlJc w:val="left"/>
+      <w:pPr>
+        <w:tabs>
+          <w:tab w:val="num" w:pos="6480"/>
+        </w:tabs>
+        <w:ind w:left="6480" w:hanging="360"/>
+      </w:pPr>
+      <w:rPr>
+        <w:rFonts w:ascii="Wingdings" w:hAnsi="Wingdings" w:hint="default"/>
+        <w:sz w:val="20"/>
+      </w:rPr>
+    </w:lvl>
+  </w:abstractNum>
+  <w:abstractNum w:abstractNumId="4" w15:restartNumberingAfterBreak="0">
     <w:nsid w:val="151C097E"/>
     <w:multiLevelType w:val="multilevel"/>
     <w:tmpl w:val="A6323EAA"/>
@@ -7286,7 +9552,7 @@
       </w:rPr>
     </w:lvl>
   </w:abstractNum>
-  <w:abstractNum w:abstractNumId="3" w15:restartNumberingAfterBreak="0">
+  <w:abstractNum w:abstractNumId="5" w15:restartNumberingAfterBreak="0">
     <w:nsid w:val="1CE83152"/>
     <w:multiLevelType w:val="multilevel"/>
     <w:tmpl w:val="93A6B55A"/>
@@ -7435,7 +9701,7 @@
       </w:rPr>
     </w:lvl>
   </w:abstractNum>
-  <w:abstractNum w:abstractNumId="4" w15:restartNumberingAfterBreak="0">
+  <w:abstractNum w:abstractNumId="6" w15:restartNumberingAfterBreak="0">
     <w:nsid w:val="266656E6"/>
     <w:multiLevelType w:val="multilevel"/>
     <w:tmpl w:val="F604C1A0"/>
@@ -7584,7 +9850,7 @@
       </w:rPr>
     </w:lvl>
   </w:abstractNum>
-  <w:abstractNum w:abstractNumId="5" w15:restartNumberingAfterBreak="0">
+  <w:abstractNum w:abstractNumId="7" w15:restartNumberingAfterBreak="0">
     <w:nsid w:val="27564D58"/>
     <w:multiLevelType w:val="multilevel"/>
     <w:tmpl w:val="D6C4AA12"/>
@@ -7733,7 +9999,156 @@
       </w:rPr>
     </w:lvl>
   </w:abstractNum>
-  <w:abstractNum w:abstractNumId="6" w15:restartNumberingAfterBreak="0">
+  <w:abstractNum w:abstractNumId="8" w15:restartNumberingAfterBreak="0">
+    <w:nsid w:val="28087A7F"/>
+    <w:multiLevelType w:val="multilevel"/>
+    <w:tmpl w:val="3A84646C"/>
+    <w:lvl w:ilvl="0">
+      <w:start w:val="1"/>
+      <w:numFmt w:val="bullet"/>
+      <w:lvlText w:val=""/>
+      <w:lvlJc w:val="left"/>
+      <w:pPr>
+        <w:tabs>
+          <w:tab w:val="num" w:pos="720"/>
+        </w:tabs>
+        <w:ind w:left="720" w:hanging="360"/>
+      </w:pPr>
+      <w:rPr>
+        <w:rFonts w:ascii="Symbol" w:hAnsi="Symbol" w:hint="default"/>
+        <w:sz w:val="20"/>
+      </w:rPr>
+    </w:lvl>
+    <w:lvl w:ilvl="1" w:tentative="1">
+      <w:start w:val="1"/>
+      <w:numFmt w:val="bullet"/>
+      <w:lvlText w:val="o"/>
+      <w:lvlJc w:val="left"/>
+      <w:pPr>
+        <w:tabs>
+          <w:tab w:val="num" w:pos="1440"/>
+        </w:tabs>
+        <w:ind w:left="1440" w:hanging="360"/>
+      </w:pPr>
+      <w:rPr>
+        <w:rFonts w:ascii="Courier New" w:hAnsi="Courier New" w:hint="default"/>
+        <w:sz w:val="20"/>
+      </w:rPr>
+    </w:lvl>
+    <w:lvl w:ilvl="2" w:tentative="1">
+      <w:start w:val="1"/>
+      <w:numFmt w:val="bullet"/>
+      <w:lvlText w:val=""/>
+      <w:lvlJc w:val="left"/>
+      <w:pPr>
+        <w:tabs>
+          <w:tab w:val="num" w:pos="2160"/>
+        </w:tabs>
+        <w:ind w:left="2160" w:hanging="360"/>
+      </w:pPr>
+      <w:rPr>
+        <w:rFonts w:ascii="Wingdings" w:hAnsi="Wingdings" w:hint="default"/>
+        <w:sz w:val="20"/>
+      </w:rPr>
+    </w:lvl>
+    <w:lvl w:ilvl="3" w:tentative="1">
+      <w:start w:val="1"/>
+      <w:numFmt w:val="bullet"/>
+      <w:lvlText w:val=""/>
+      <w:lvlJc w:val="left"/>
+      <w:pPr>
+        <w:tabs>
+          <w:tab w:val="num" w:pos="2880"/>
+        </w:tabs>
+        <w:ind w:left="2880" w:hanging="360"/>
+      </w:pPr>
+      <w:rPr>
+        <w:rFonts w:ascii="Wingdings" w:hAnsi="Wingdings" w:hint="default"/>
+        <w:sz w:val="20"/>
+      </w:rPr>
+    </w:lvl>
+    <w:lvl w:ilvl="4" w:tentative="1">
+      <w:start w:val="1"/>
+      <w:numFmt w:val="bullet"/>
+      <w:lvlText w:val=""/>
+      <w:lvlJc w:val="left"/>
+      <w:pPr>
+        <w:tabs>
+          <w:tab w:val="num" w:pos="3600"/>
+        </w:tabs>
+        <w:ind w:left="3600" w:hanging="360"/>
+      </w:pPr>
+      <w:rPr>
+        <w:rFonts w:ascii="Wingdings" w:hAnsi="Wingdings" w:hint="default"/>
+        <w:sz w:val="20"/>
+      </w:rPr>
+    </w:lvl>
+    <w:lvl w:ilvl="5" w:tentative="1">
+      <w:start w:val="1"/>
+      <w:numFmt w:val="bullet"/>
+      <w:lvlText w:val=""/>
+      <w:lvlJc w:val="left"/>
+      <w:pPr>
+        <w:tabs>
+          <w:tab w:val="num" w:pos="4320"/>
+        </w:tabs>
+        <w:ind w:left="4320" w:hanging="360"/>
+      </w:pPr>
+      <w:rPr>
+        <w:rFonts w:ascii="Wingdings" w:hAnsi="Wingdings" w:hint="default"/>
+        <w:sz w:val="20"/>
+      </w:rPr>
+    </w:lvl>
+    <w:lvl w:ilvl="6" w:tentative="1">
+      <w:start w:val="1"/>
+      <w:numFmt w:val="bullet"/>
+      <w:lvlText w:val=""/>
+      <w:lvlJc w:val="left"/>
+      <w:pPr>
+        <w:tabs>
+          <w:tab w:val="num" w:pos="5040"/>
+        </w:tabs>
+        <w:ind w:left="5040" w:hanging="360"/>
+      </w:pPr>
+      <w:rPr>
+        <w:rFonts w:ascii="Wingdings" w:hAnsi="Wingdings" w:hint="default"/>
+        <w:sz w:val="20"/>
+      </w:rPr>
+    </w:lvl>
+    <w:lvl w:ilvl="7" w:tentative="1">
+      <w:start w:val="1"/>
+      <w:numFmt w:val="bullet"/>
+      <w:lvlText w:val=""/>
+      <w:lvlJc w:val="left"/>
+      <w:pPr>
+        <w:tabs>
+          <w:tab w:val="num" w:pos="5760"/>
+        </w:tabs>
+        <w:ind w:left="5760" w:hanging="360"/>
+      </w:pPr>
+      <w:rPr>
+        <w:rFonts w:ascii="Wingdings" w:hAnsi="Wingdings" w:hint="default"/>
+        <w:sz w:val="20"/>
+      </w:rPr>
+    </w:lvl>
+    <w:lvl w:ilvl="8" w:tentative="1">
+      <w:start w:val="1"/>
+      <w:numFmt w:val="bullet"/>
+      <w:lvlText w:val=""/>
+      <w:lvlJc w:val="left"/>
+      <w:pPr>
+        <w:tabs>
+          <w:tab w:val="num" w:pos="6480"/>
+        </w:tabs>
+        <w:ind w:left="6480" w:hanging="360"/>
+      </w:pPr>
+      <w:rPr>
+        <w:rFonts w:ascii="Wingdings" w:hAnsi="Wingdings" w:hint="default"/>
+        <w:sz w:val="20"/>
+      </w:rPr>
+    </w:lvl>
+  </w:abstractNum>
+  <w:abstractNum w:abstractNumId="9" w15:restartNumberingAfterBreak="0">
     <w:nsid w:val="5232049B"/>
     <w:multiLevelType w:val="multilevel"/>
     <w:tmpl w:val="C91E334C"/>
@@ -7882,7 +10297,7 @@
       </w:rPr>
     </w:lvl>
   </w:abstractNum>
-  <w:abstractNum w:abstractNumId="7" w15:restartNumberingAfterBreak="0">
+  <w:abstractNum w:abstractNumId="10" w15:restartNumberingAfterBreak="0">
     <w:nsid w:val="546C033C"/>
     <w:multiLevelType w:val="multilevel"/>
     <w:tmpl w:val="71AC7086"/>
@@ -8031,7 +10446,7 @@
       </w:rPr>
     </w:lvl>
   </w:abstractNum>
-  <w:abstractNum w:abstractNumId="8" w15:restartNumberingAfterBreak="0">
+  <w:abstractNum w:abstractNumId="11" w15:restartNumberingAfterBreak="0">
     <w:nsid w:val="54C66CA0"/>
     <w:multiLevelType w:val="multilevel"/>
     <w:tmpl w:val="009E1CA0"/>
@@ -8180,7 +10595,156 @@
       </w:rPr>
     </w:lvl>
   </w:abstractNum>
-  <w:abstractNum w:abstractNumId="9" w15:restartNumberingAfterBreak="0">
+  <w:abstractNum w:abstractNumId="12" w15:restartNumberingAfterBreak="0">
+    <w:nsid w:val="5A2A5408"/>
+    <w:multiLevelType w:val="multilevel"/>
+    <w:tmpl w:val="E1E24276"/>
+    <w:lvl w:ilvl="0">
+      <w:start w:val="1"/>
+      <w:numFmt w:val="bullet"/>
+      <w:lvlText w:val=""/>
+      <w:lvlJc w:val="left"/>
+      <w:pPr>
+        <w:tabs>
+          <w:tab w:val="num" w:pos="720"/>
+        </w:tabs>
+        <w:ind w:left="720" w:hanging="360"/>
+      </w:pPr>
+      <w:rPr>
+        <w:rFonts w:ascii="Symbol" w:hAnsi="Symbol" w:hint="default"/>
+        <w:sz w:val="20"/>
+      </w:rPr>
+    </w:lvl>
+    <w:lvl w:ilvl="1" w:tentative="1">
+      <w:start w:val="1"/>
+      <w:numFmt w:val="bullet"/>
+      <w:lvlText w:val="o"/>
+      <w:lvlJc w:val="left"/>
+      <w:pPr>
+        <w:tabs>
+          <w:tab w:val="num" w:pos="1440"/>
+        </w:tabs>
+        <w:ind w:left="1440" w:hanging="360"/>
+      </w:pPr>
+      <w:rPr>
+        <w:rFonts w:ascii="Courier New" w:hAnsi="Courier New" w:hint="default"/>
+        <w:sz w:val="20"/>
+      </w:rPr>
+    </w:lvl>
+    <w:lvl w:ilvl="2" w:tentative="1">
+      <w:start w:val="1"/>
+      <w:numFmt w:val="bullet"/>
+      <w:lvlText w:val=""/>
+      <w:lvlJc w:val="left"/>
+      <w:pPr>
+        <w:tabs>
+          <w:tab w:val="num" w:pos="2160"/>
+        </w:tabs>
+        <w:ind w:left="2160" w:hanging="360"/>
+      </w:pPr>
+      <w:rPr>
+        <w:rFonts w:ascii="Wingdings" w:hAnsi="Wingdings" w:hint="default"/>
+        <w:sz w:val="20"/>
+      </w:rPr>
+    </w:lvl>
+    <w:lvl w:ilvl="3" w:tentative="1">
+      <w:start w:val="1"/>
+      <w:numFmt w:val="bullet"/>
+      <w:lvlText w:val=""/>
+      <w:lvlJc w:val="left"/>
+      <w:pPr>
+        <w:tabs>
+          <w:tab w:val="num" w:pos="2880"/>
+        </w:tabs>
+        <w:ind w:left="2880" w:hanging="360"/>
+      </w:pPr>
+      <w:rPr>
+        <w:rFonts w:ascii="Wingdings" w:hAnsi="Wingdings" w:hint="default"/>
+        <w:sz w:val="20"/>
+      </w:rPr>
+    </w:lvl>
+    <w:lvl w:ilvl="4" w:tentative="1">
+      <w:start w:val="1"/>
+      <w:numFmt w:val="bullet"/>
+      <w:lvlText w:val=""/>
+      <w:lvlJc w:val="left"/>
+      <w:pPr>
+        <w:tabs>
+          <w:tab w:val="num" w:pos="3600"/>
+        </w:tabs>
+        <w:ind w:left="3600" w:hanging="360"/>
+      </w:pPr>
+      <w:rPr>
+        <w:rFonts w:ascii="Wingdings" w:hAnsi="Wingdings" w:hint="default"/>
+        <w:sz w:val="20"/>
+      </w:rPr>
+    </w:lvl>
+    <w:lvl w:ilvl="5" w:tentative="1">
+      <w:start w:val="1"/>
+      <w:numFmt w:val="bullet"/>
+      <w:lvlText w:val=""/>
+      <w:lvlJc w:val="left"/>
+      <w:pPr>
+        <w:tabs>
+          <w:tab w:val="num" w:pos="4320"/>
+        </w:tabs>
+        <w:ind w:left="4320" w:hanging="360"/>
+      </w:pPr>
+      <w:rPr>
+        <w:rFonts w:ascii="Wingdings" w:hAnsi="Wingdings" w:hint="default"/>
+        <w:sz w:val="20"/>
+      </w:rPr>
+    </w:lvl>
+    <w:lvl w:ilvl="6" w:tentative="1">
+      <w:start w:val="1"/>
+      <w:numFmt w:val="bullet"/>
+      <w:lvlText w:val=""/>
+      <w:lvlJc w:val="left"/>
+      <w:pPr>
+        <w:tabs>
+          <w:tab w:val="num" w:pos="5040"/>
+        </w:tabs>
+        <w:ind w:left="5040" w:hanging="360"/>
+      </w:pPr>
+      <w:rPr>
+        <w:rFonts w:ascii="Wingdings" w:hAnsi="Wingdings" w:hint="default"/>
+        <w:sz w:val="20"/>
+      </w:rPr>
+    </w:lvl>
+    <w:lvl w:ilvl="7" w:tentative="1">
+      <w:start w:val="1"/>
+      <w:numFmt w:val="bullet"/>
+      <w:lvlText w:val=""/>
+      <w:lvlJc w:val="left"/>
+      <w:pPr>
+        <w:tabs>
+          <w:tab w:val="num" w:pos="5760"/>
+        </w:tabs>
+        <w:ind w:left="5760" w:hanging="360"/>
+      </w:pPr>
+      <w:rPr>
+        <w:rFonts w:ascii="Wingdings" w:hAnsi="Wingdings" w:hint="default"/>
+        <w:sz w:val="20"/>
+      </w:rPr>
+    </w:lvl>
+    <w:lvl w:ilvl="8" w:tentative="1">
+      <w:start w:val="1"/>
+      <w:numFmt w:val="bullet"/>
+      <w:lvlText w:val=""/>
+      <w:lvlJc w:val="left"/>
+      <w:pPr>
+        <w:tabs>
+          <w:tab w:val="num" w:pos="6480"/>
+        </w:tabs>
+        <w:ind w:left="6480" w:hanging="360"/>
+      </w:pPr>
+      <w:rPr>
+        <w:rFonts w:ascii="Wingdings" w:hAnsi="Wingdings" w:hint="default"/>
+        <w:sz w:val="20"/>
+      </w:rPr>
+    </w:lvl>
+  </w:abstractNum>
+  <w:abstractNum w:abstractNumId="13" w15:restartNumberingAfterBreak="0">
     <w:nsid w:val="67FD1F32"/>
     <w:multiLevelType w:val="multilevel"/>
     <w:tmpl w:val="114CD08E"/>
@@ -8329,35 +10893,315 @@
       </w:rPr>
     </w:lvl>
   </w:abstractNum>
+  <w:abstractNum w:abstractNumId="14" w15:restartNumberingAfterBreak="0">
+    <w:nsid w:val="694D6D93"/>
+    <w:multiLevelType w:val="multilevel"/>
+    <w:tmpl w:val="CE46F22C"/>
+    <w:lvl w:ilvl="0">
+      <w:start w:val="1"/>
+      <w:numFmt w:val="decimal"/>
+      <w:lvlText w:val="%1."/>
+      <w:lvlJc w:val="left"/>
+      <w:pPr>
+        <w:tabs>
+          <w:tab w:val="num" w:pos="720"/>
+        </w:tabs>
+        <w:ind w:left="720" w:hanging="360"/>
+      </w:pPr>
+    </w:lvl>
+    <w:lvl w:ilvl="1" w:tentative="1">
+      <w:start w:val="1"/>
+      <w:numFmt w:val="decimal"/>
+      <w:lvlText w:val="%2."/>
+      <w:lvlJc w:val="left"/>
+      <w:pPr>
+        <w:tabs>
+          <w:tab w:val="num" w:pos="1440"/>
+        </w:tabs>
+        <w:ind w:left="1440" w:hanging="360"/>
+      </w:pPr>
+    </w:lvl>
+    <w:lvl w:ilvl="2" w:tentative="1">
+      <w:start w:val="1"/>
+      <w:numFmt w:val="decimal"/>
+      <w:lvlText w:val="%3."/>
+      <w:lvlJc w:val="left"/>
+      <w:pPr>
+        <w:tabs>
+          <w:tab w:val="num" w:pos="2160"/>
+        </w:tabs>
+        <w:ind w:left="2160" w:hanging="360"/>
+      </w:pPr>
+    </w:lvl>
+    <w:lvl w:ilvl="3" w:tentative="1">
+      <w:start w:val="1"/>
+      <w:numFmt w:val="decimal"/>
+      <w:lvlText w:val="%4."/>
+      <w:lvlJc w:val="left"/>
+      <w:pPr>
+        <w:tabs>
+          <w:tab w:val="num" w:pos="2880"/>
+        </w:tabs>
+        <w:ind w:left="2880" w:hanging="360"/>
+      </w:pPr>
+    </w:lvl>
+    <w:lvl w:ilvl="4" w:tentative="1">
+      <w:start w:val="1"/>
+      <w:numFmt w:val="decimal"/>
+      <w:lvlText w:val="%5."/>
+      <w:lvlJc w:val="left"/>
+      <w:pPr>
+        <w:tabs>
+          <w:tab w:val="num" w:pos="3600"/>
+        </w:tabs>
+        <w:ind w:left="3600" w:hanging="360"/>
+      </w:pPr>
+    </w:lvl>
+    <w:lvl w:ilvl="5" w:tentative="1">
+      <w:start w:val="1"/>
+      <w:numFmt w:val="decimal"/>
+      <w:lvlText w:val="%6."/>
+      <w:lvlJc w:val="left"/>
+      <w:pPr>
+        <w:tabs>
+          <w:tab w:val="num" w:pos="4320"/>
+        </w:tabs>
+        <w:ind w:left="4320" w:hanging="360"/>
+      </w:pPr>
+    </w:lvl>
+    <w:lvl w:ilvl="6" w:tentative="1">
+      <w:start w:val="1"/>
+      <w:numFmt w:val="decimal"/>
+      <w:lvlText w:val="%7."/>
+      <w:lvlJc w:val="left"/>
+      <w:pPr>
+        <w:tabs>
+          <w:tab w:val="num" w:pos="5040"/>
+        </w:tabs>
+        <w:ind w:left="5040" w:hanging="360"/>
+      </w:pPr>
+    </w:lvl>
+    <w:lvl w:ilvl="7" w:tentative="1">
+      <w:start w:val="1"/>
+      <w:numFmt w:val="decimal"/>
+      <w:lvlText w:val="%8."/>
+      <w:lvlJc w:val="left"/>
+      <w:pPr>
+        <w:tabs>
+          <w:tab w:val="num" w:pos="5760"/>
+        </w:tabs>
+        <w:ind w:left="5760" w:hanging="360"/>
+      </w:pPr>
+    </w:lvl>
+    <w:lvl w:ilvl="8" w:tentative="1">
+      <w:start w:val="1"/>
+      <w:numFmt w:val="decimal"/>
+      <w:lvlText w:val="%9."/>
+      <w:lvlJc w:val="left"/>
+      <w:pPr>
+        <w:tabs>
+          <w:tab w:val="num" w:pos="6480"/>
+        </w:tabs>
+        <w:ind w:left="6480" w:hanging="360"/>
+      </w:pPr>
+    </w:lvl>
+  </w:abstractNum>
+  <w:abstractNum w:abstractNumId="15" w15:restartNumberingAfterBreak="0">
+    <w:nsid w:val="7DAA2B58"/>
+    <w:multiLevelType w:val="multilevel"/>
+    <w:tmpl w:val="FDFC684A"/>
+    <w:lvl w:ilvl="0">
+      <w:start w:val="1"/>
+      <w:numFmt w:val="bullet"/>
+      <w:lvlText w:val=""/>
+      <w:lvlJc w:val="left"/>
+      <w:pPr>
+        <w:tabs>
+          <w:tab w:val="num" w:pos="720"/>
+        </w:tabs>
+        <w:ind w:left="720" w:hanging="360"/>
+      </w:pPr>
+      <w:rPr>
+        <w:rFonts w:ascii="Symbol" w:hAnsi="Symbol" w:hint="default"/>
+        <w:sz w:val="20"/>
+      </w:rPr>
+    </w:lvl>
+    <w:lvl w:ilvl="1" w:tentative="1">
+      <w:start w:val="1"/>
+      <w:numFmt w:val="bullet"/>
+      <w:lvlText w:val="o"/>
+      <w:lvlJc w:val="left"/>
+      <w:pPr>
+        <w:tabs>
+          <w:tab w:val="num" w:pos="1440"/>
+        </w:tabs>
+        <w:ind w:left="1440" w:hanging="360"/>
+      </w:pPr>
+      <w:rPr>
+        <w:rFonts w:ascii="Courier New" w:hAnsi="Courier New" w:hint="default"/>
+        <w:sz w:val="20"/>
+      </w:rPr>
+    </w:lvl>
+    <w:lvl w:ilvl="2" w:tentative="1">
+      <w:start w:val="1"/>
+      <w:numFmt w:val="bullet"/>
+      <w:lvlText w:val=""/>
+      <w:lvlJc w:val="left"/>
+      <w:pPr>
+        <w:tabs>
+          <w:tab w:val="num" w:pos="2160"/>
+        </w:tabs>
+        <w:ind w:left="2160" w:hanging="360"/>
+      </w:pPr>
+      <w:rPr>
+        <w:rFonts w:ascii="Wingdings" w:hAnsi="Wingdings" w:hint="default"/>
+        <w:sz w:val="20"/>
+      </w:rPr>
+    </w:lvl>
+    <w:lvl w:ilvl="3" w:tentative="1">
+      <w:start w:val="1"/>
+      <w:numFmt w:val="bullet"/>
+      <w:lvlText w:val=""/>
+      <w:lvlJc w:val="left"/>
+      <w:pPr>
+        <w:tabs>
+          <w:tab w:val="num" w:pos="2880"/>
+        </w:tabs>
+        <w:ind w:left="2880" w:hanging="360"/>
+      </w:pPr>
+      <w:rPr>
+        <w:rFonts w:ascii="Wingdings" w:hAnsi="Wingdings" w:hint="default"/>
+        <w:sz w:val="20"/>
+      </w:rPr>
+    </w:lvl>
+    <w:lvl w:ilvl="4" w:tentative="1">
+      <w:start w:val="1"/>
+      <w:numFmt w:val="bullet"/>
+      <w:lvlText w:val=""/>
+      <w:lvlJc w:val="left"/>
+      <w:pPr>
+        <w:tabs>
+          <w:tab w:val="num" w:pos="3600"/>
+        </w:tabs>
+        <w:ind w:left="3600" w:hanging="360"/>
+      </w:pPr>
+      <w:rPr>
+        <w:rFonts w:ascii="Wingdings" w:hAnsi="Wingdings" w:hint="default"/>
+        <w:sz w:val="20"/>
+      </w:rPr>
+    </w:lvl>
+    <w:lvl w:ilvl="5" w:tentative="1">
+      <w:start w:val="1"/>
+      <w:numFmt w:val="bullet"/>
+      <w:lvlText w:val=""/>
+      <w:lvlJc w:val="left"/>
+      <w:pPr>
+        <w:tabs>
+          <w:tab w:val="num" w:pos="4320"/>
+        </w:tabs>
+        <w:ind w:left="4320" w:hanging="360"/>
+      </w:pPr>
+      <w:rPr>
+        <w:rFonts w:ascii="Wingdings" w:hAnsi="Wingdings" w:hint="default"/>
+        <w:sz w:val="20"/>
+      </w:rPr>
+    </w:lvl>
+    <w:lvl w:ilvl="6" w:tentative="1">
+      <w:start w:val="1"/>
+      <w:numFmt w:val="bullet"/>
+      <w:lvlText w:val=""/>
+      <w:lvlJc w:val="left"/>
+      <w:pPr>
+        <w:tabs>
+          <w:tab w:val="num" w:pos="5040"/>
+        </w:tabs>
+        <w:ind w:left="5040" w:hanging="360"/>
+      </w:pPr>
+      <w:rPr>
+        <w:rFonts w:ascii="Wingdings" w:hAnsi="Wingdings" w:hint="default"/>
+        <w:sz w:val="20"/>
+      </w:rPr>
+    </w:lvl>
+    <w:lvl w:ilvl="7" w:tentative="1">
+      <w:start w:val="1"/>
+      <w:numFmt w:val="bullet"/>
+      <w:lvlText w:val=""/>
+      <w:lvlJc w:val="left"/>
+      <w:pPr>
+        <w:tabs>
+          <w:tab w:val="num" w:pos="5760"/>
+        </w:tabs>
+        <w:ind w:left="5760" w:hanging="360"/>
+      </w:pPr>
+      <w:rPr>
+        <w:rFonts w:ascii="Wingdings" w:hAnsi="Wingdings" w:hint="default"/>
+        <w:sz w:val="20"/>
+      </w:rPr>
+    </w:lvl>
+    <w:lvl w:ilvl="8" w:tentative="1">
+      <w:start w:val="1"/>
+      <w:numFmt w:val="bullet"/>
+      <w:lvlText w:val=""/>
+      <w:lvlJc w:val="left"/>
+      <w:pPr>
+        <w:tabs>
+          <w:tab w:val="num" w:pos="6480"/>
+        </w:tabs>
+        <w:ind w:left="6480" w:hanging="360"/>
+      </w:pPr>
+      <w:rPr>
+        <w:rFonts w:ascii="Wingdings" w:hAnsi="Wingdings" w:hint="default"/>
+        <w:sz w:val="20"/>
+      </w:rPr>
+    </w:lvl>
+  </w:abstractNum>
   <w:num w:numId="1" w16cid:durableId="803160041">
+    <w:abstractNumId w:val="13"/>
+  </w:num>
+  <w:num w:numId="2" w16cid:durableId="1529953245">
+    <w:abstractNumId w:val="5"/>
+  </w:num>
+  <w:num w:numId="3" w16cid:durableId="1193686947">
+    <w:abstractNumId w:val="4"/>
+  </w:num>
+  <w:num w:numId="4" w16cid:durableId="1357462995">
+    <w:abstractNumId w:val="6"/>
+  </w:num>
+  <w:num w:numId="5" w16cid:durableId="861632351">
+    <w:abstractNumId w:val="10"/>
+  </w:num>
+  <w:num w:numId="6" w16cid:durableId="994601221">
+    <w:abstractNumId w:val="11"/>
+  </w:num>
+  <w:num w:numId="7" w16cid:durableId="534273436">
     <w:abstractNumId w:val="9"/>
   </w:num>
-  <w:num w:numId="2" w16cid:durableId="1529953245">
+  <w:num w:numId="8" w16cid:durableId="2030640433">
+    <w:abstractNumId w:val="7"/>
+  </w:num>
+  <w:num w:numId="9" w16cid:durableId="461966072">
+    <w:abstractNumId w:val="2"/>
+  </w:num>
+  <w:num w:numId="10" w16cid:durableId="603419282">
+    <w:abstractNumId w:val="1"/>
+  </w:num>
+  <w:num w:numId="11" w16cid:durableId="91048958">
+    <w:abstractNumId w:val="14"/>
+  </w:num>
+  <w:num w:numId="12" w16cid:durableId="1840384654">
     <w:abstractNumId w:val="3"/>
   </w:num>
-  <w:num w:numId="3" w16cid:durableId="1193686947">
-    <w:abstractNumId w:val="2"/>
+  <w:num w:numId="13" w16cid:durableId="770861108">
+    <w:abstractNumId w:val="0"/>
   </w:num>
-  <w:num w:numId="4" w16cid:durableId="1357462995">
-    <w:abstractNumId w:val="4"/>
+  <w:num w:numId="14" w16cid:durableId="427699559">
+    <w:abstractNumId w:val="12"/>
   </w:num>
-  <w:num w:numId="5" w16cid:durableId="861632351">
-    <w:abstractNumId w:val="7"/>
+  <w:num w:numId="15" w16cid:durableId="972517287">
+    <w:abstractNumId w:val="15"/>
   </w:num>
-  <w:num w:numId="6" w16cid:durableId="994601221">
+  <w:num w:numId="16" w16cid:durableId="263148264">
     <w:abstractNumId w:val="8"/>
-  </w:num>
-  <w:num w:numId="7" w16cid:durableId="534273436">
-    <w:abstractNumId w:val="6"/>
-  </w:num>
-  <w:num w:numId="8" w16cid:durableId="2030640433">
-    <w:abstractNumId w:val="5"/>
-  </w:num>
-  <w:num w:numId="9" w16cid:durableId="461966072">
-    <w:abstractNumId w:val="1"/>
-  </w:num>
-  <w:num w:numId="10" w16cid:durableId="603419282">
-    <w:abstractNumId w:val="0"/>
   </w:num>
 </w:numbering>
 </file>

</xml_diff>

<commit_message>
Lesson 72 Creating MyAccount Section for CodesWear
</commit_message>
<xml_diff>
--- a/Notes3.docx
+++ b/Notes3.docx
@@ -12,21 +12,7 @@
         <w:rPr>
           <w:lang w:val="en-US"/>
         </w:rPr>
-        <w:t xml:space="preserve">Teacher </w:t>
-      </w:r>
-      <w:proofErr w:type="gramStart"/>
-      <w:r>
-        <w:rPr>
-          <w:lang w:val="en-US"/>
-        </w:rPr>
-        <w:t>think</w:t>
-      </w:r>
-      <w:proofErr w:type="gramEnd"/>
-      <w:r>
-        <w:rPr>
-          <w:lang w:val="en-US"/>
-        </w:rPr>
-        <w:t xml:space="preserve"> that you can make id public and key private but we say th</w:t>
+        <w:t>Teacher think that you can make id public and key private but we say th</w:t>
       </w:r>
       <w:r>
         <w:rPr>
@@ -38,16 +24,8 @@
         <w:rPr>
           <w:lang w:val="en-US"/>
         </w:rPr>
-        <w:t xml:space="preserve">t keep both </w:t>
-      </w:r>
-      <w:proofErr w:type="gramStart"/>
-      <w:r>
-        <w:rPr>
-          <w:lang w:val="en-US"/>
-        </w:rPr>
-        <w:t>private(</w:t>
-      </w:r>
-      <w:proofErr w:type="gramEnd"/>
+        <w:t>t keep both private(</w:t>
+      </w:r>
       <w:r>
         <w:rPr>
           <w:lang w:val="en-US"/>
@@ -73,19 +51,11 @@
           <w:lang w:val="en-US"/>
         </w:rPr>
       </w:pPr>
-      <w:proofErr w:type="gramStart"/>
-      <w:r>
-        <w:rPr>
-          <w:lang w:val="en-US"/>
-        </w:rPr>
-        <w:t>So</w:t>
-      </w:r>
-      <w:proofErr w:type="gramEnd"/>
-      <w:r>
-        <w:rPr>
-          <w:lang w:val="en-US"/>
-        </w:rPr>
-        <w:t xml:space="preserve"> you might get good idea that </w:t>
+      <w:r>
+        <w:rPr>
+          <w:lang w:val="en-US"/>
+        </w:rPr>
+        <w:t xml:space="preserve">So you might get good idea that </w:t>
       </w:r>
       <w:r>
         <w:rPr>
@@ -218,21 +188,7 @@
         <w:rPr>
           <w:lang w:val="en-US"/>
         </w:rPr>
-        <w:t xml:space="preserve">Some payment gateway </w:t>
-      </w:r>
-      <w:proofErr w:type="gramStart"/>
-      <w:r>
-        <w:rPr>
-          <w:lang w:val="en-US"/>
-        </w:rPr>
-        <w:t>have</w:t>
-      </w:r>
-      <w:proofErr w:type="gramEnd"/>
-      <w:r>
-        <w:rPr>
-          <w:lang w:val="en-US"/>
-        </w:rPr>
-        <w:t xml:space="preserve"> pr</w:t>
+        <w:t>Some payment gateway have pr</w:t>
       </w:r>
       <w:r>
         <w:rPr>
@@ -288,21 +244,7 @@
         <w:rPr>
           <w:lang w:val="en-US"/>
         </w:rPr>
-        <w:t xml:space="preserve">One user </w:t>
-      </w:r>
-      <w:proofErr w:type="gramStart"/>
-      <w:r>
-        <w:rPr>
-          <w:lang w:val="en-US"/>
-        </w:rPr>
-        <w:t>make</w:t>
-      </w:r>
-      <w:proofErr w:type="gramEnd"/>
-      <w:r>
-        <w:rPr>
-          <w:lang w:val="en-US"/>
-        </w:rPr>
-        <w:t xml:space="preserve"> some cart in out website </w:t>
+        <w:t xml:space="preserve">One user make some cart in out website </w:t>
       </w:r>
       <w:r>
         <w:rPr>
@@ -513,7 +455,6 @@
         <w:t xml:space="preserve">You can </w:t>
       </w:r>
       <w:proofErr w:type="spellStart"/>
-      <w:proofErr w:type="gramStart"/>
       <w:r>
         <w:rPr>
           <w:b/>
@@ -529,16 +470,7 @@
           <w:bCs/>
           <w:lang w:val="en-US"/>
         </w:rPr>
-        <w:t>(</w:t>
-      </w:r>
-      <w:proofErr w:type="gramEnd"/>
-      <w:r>
-        <w:rPr>
-          <w:b/>
-          <w:bCs/>
-          <w:lang w:val="en-US"/>
-        </w:rPr>
-        <w:t>codeword that is showin</w:t>
+        <w:t>(codeword that is showin</w:t>
       </w:r>
       <w:r>
         <w:rPr>
@@ -605,21 +537,7 @@
         <w:rPr>
           <w:lang w:val="en-US"/>
         </w:rPr>
-        <w:t xml:space="preserve">if a function is in a </w:t>
-      </w:r>
-      <w:proofErr w:type="gramStart"/>
-      <w:r>
-        <w:rPr>
-          <w:lang w:val="en-US"/>
-        </w:rPr>
-        <w:t>render</w:t>
-      </w:r>
-      <w:proofErr w:type="gramEnd"/>
-      <w:r>
-        <w:rPr>
-          <w:lang w:val="en-US"/>
-        </w:rPr>
-        <w:t xml:space="preserve"> it will only use that </w:t>
+        <w:t xml:space="preserve">if a function is in a render it will only use that </w:t>
       </w:r>
       <w:r>
         <w:rPr>
@@ -631,27 +549,13 @@
         <w:rPr>
           <w:lang w:val="en-US"/>
         </w:rPr>
-        <w:t xml:space="preserve">value of the </w:t>
-      </w:r>
-      <w:proofErr w:type="gramStart"/>
-      <w:r>
-        <w:rPr>
-          <w:lang w:val="en-US"/>
-        </w:rPr>
-        <w:t>render</w:t>
-      </w:r>
-      <w:r>
-        <w:rPr>
-          <w:lang w:val="en-US"/>
-        </w:rPr>
-        <w:t>(</w:t>
-      </w:r>
-      <w:proofErr w:type="gramEnd"/>
-      <w:r>
-        <w:rPr>
-          <w:lang w:val="en-US"/>
-        </w:rPr>
-        <w:t>or we might say environment of th</w:t>
+        <w:t>value of the render</w:t>
+      </w:r>
+      <w:r>
+        <w:rPr>
+          <w:lang w:val="en-US"/>
+        </w:rPr>
+        <w:t>(or we might say environment of th</w:t>
       </w:r>
       <w:r>
         <w:rPr>
@@ -935,21 +839,7 @@
         <w:rPr>
           <w:lang w:val="en-US"/>
         </w:rPr>
-        <w:t xml:space="preserve">. </w:t>
-      </w:r>
-      <w:proofErr w:type="gramStart"/>
-      <w:r>
-        <w:rPr>
-          <w:lang w:val="en-US"/>
-        </w:rPr>
-        <w:t>So</w:t>
-      </w:r>
-      <w:proofErr w:type="gramEnd"/>
-      <w:r>
-        <w:rPr>
-          <w:lang w:val="en-US"/>
-        </w:rPr>
-        <w:t xml:space="preserve"> by using our merchant </w:t>
+        <w:t xml:space="preserve">. So by using our merchant </w:t>
       </w:r>
       <w:r>
         <w:rPr>
@@ -987,19 +877,11 @@
         </w:rPr>
         <w:t xml:space="preserve"> </w:t>
       </w:r>
-      <w:proofErr w:type="gramStart"/>
-      <w:r>
-        <w:rPr>
-          <w:lang w:val="en-US"/>
-        </w:rPr>
-        <w:t>So</w:t>
-      </w:r>
-      <w:proofErr w:type="gramEnd"/>
-      <w:r>
-        <w:rPr>
-          <w:lang w:val="en-US"/>
-        </w:rPr>
-        <w:t xml:space="preserve"> through checksum we come to know is that valid or not.</w:t>
+      <w:r>
+        <w:rPr>
+          <w:lang w:val="en-US"/>
+        </w:rPr>
+        <w:t>So through checksum we come to know is that valid or not.</w:t>
       </w:r>
     </w:p>
     <w:p>
@@ -1199,27 +1081,7 @@
           <w:color w:val="EE0000"/>
           <w:lang w:val="en-US"/>
         </w:rPr>
-        <w:t xml:space="preserve">some method does not return promise die which error may </w:t>
-      </w:r>
-      <w:proofErr w:type="gramStart"/>
-      <w:r>
-        <w:rPr>
-          <w:b/>
-          <w:bCs/>
-          <w:color w:val="EE0000"/>
-          <w:lang w:val="en-US"/>
-        </w:rPr>
-        <w:t>arise(</w:t>
-      </w:r>
-      <w:proofErr w:type="gramEnd"/>
-      <w:r>
-        <w:rPr>
-          <w:b/>
-          <w:bCs/>
-          <w:color w:val="EE0000"/>
-          <w:lang w:val="en-US"/>
-        </w:rPr>
-        <w:t xml:space="preserve">who knows maybe we are wrong) according to teacher. </w:t>
+        <w:t xml:space="preserve">some method does not return promise die which error may arise(who knows maybe we are wrong) according to teacher. </w:t>
       </w:r>
     </w:p>
     <w:p>
@@ -1465,13 +1327,8 @@
         <w:t>(`${</w:t>
       </w:r>
       <w:proofErr w:type="spellStart"/>
-      <w:proofErr w:type="gramStart"/>
-      <w:r>
-        <w:t>process.env.NEXT</w:t>
-      </w:r>
-      <w:proofErr w:type="gramEnd"/>
-      <w:r>
-        <w:t>_PUBLIC_HOST</w:t>
+      <w:r>
+        <w:t>process.env.NEXT_PUBLIC_HOST</w:t>
       </w:r>
       <w:proofErr w:type="spellEnd"/>
       <w:r>
@@ -1523,15 +1380,7 @@
       </w:r>
       <w:proofErr w:type="spellEnd"/>
       <w:r>
-        <w:t xml:space="preserve">(new </w:t>
-      </w:r>
-      <w:proofErr w:type="gramStart"/>
-      <w:r>
-        <w:t>URL(</w:t>
-      </w:r>
-      <w:proofErr w:type="gramEnd"/>
-      <w:r>
-        <w:t>"/order", req.url), 302);</w:t>
+        <w:t>(new URL("/order", req.url), 302);</w:t>
       </w:r>
     </w:p>
     <w:p>
@@ -1611,15 +1460,7 @@
     </w:p>
     <w:p>
       <w:r>
-        <w:t xml:space="preserve">new </w:t>
-      </w:r>
-      <w:proofErr w:type="gramStart"/>
-      <w:r>
-        <w:t>URL(</w:t>
-      </w:r>
-      <w:proofErr w:type="gramEnd"/>
-      <w:r>
-        <w:t>"/order", req.url)</w:t>
+        <w:t>new URL("/order", req.url)</w:t>
       </w:r>
     </w:p>
     <w:p>
@@ -1675,15 +1516,7 @@
       </w:r>
       <w:proofErr w:type="spellEnd"/>
       <w:r>
-        <w:t xml:space="preserve"> needs a full URL, so use new </w:t>
-      </w:r>
-      <w:proofErr w:type="gramStart"/>
-      <w:r>
-        <w:t>URL(</w:t>
-      </w:r>
-      <w:proofErr w:type="gramEnd"/>
-      <w:r>
-        <w:t>"/order", req.url) instead of just "/order".</w:t>
+        <w:t xml:space="preserve"> needs a full URL, so use new URL("/order", req.url) instead of just "/order".</w:t>
       </w:r>
     </w:p>
     <w:p>
@@ -1702,23 +1535,7 @@
           <w:b/>
           <w:bCs/>
         </w:rPr>
-        <w:t xml:space="preserve">when to use </w:t>
-      </w:r>
-      <w:proofErr w:type="gramStart"/>
-      <w:r>
-        <w:rPr>
-          <w:b/>
-          <w:bCs/>
-        </w:rPr>
-        <w:t>redirect(</w:t>
-      </w:r>
-      <w:proofErr w:type="gramEnd"/>
-      <w:r>
-        <w:rPr>
-          <w:b/>
-          <w:bCs/>
-        </w:rPr>
-        <w:t xml:space="preserve">) vs </w:t>
+        <w:t xml:space="preserve">when to use redirect() vs </w:t>
       </w:r>
       <w:proofErr w:type="spellStart"/>
       <w:r>
@@ -1876,12 +1693,10 @@
     </w:p>
     <w:p>
       <w:proofErr w:type="spellStart"/>
-      <w:proofErr w:type="gramStart"/>
       <w:r>
         <w:t>window.location</w:t>
       </w:r>
       <w:proofErr w:type="spellEnd"/>
-      <w:proofErr w:type="gramEnd"/>
       <w:r>
         <w:t xml:space="preserve"> = "/order"</w:t>
       </w:r>
@@ -2122,15 +1937,7 @@
     </w:p>
     <w:p>
       <w:r>
-        <w:t xml:space="preserve">new </w:t>
-      </w:r>
-      <w:proofErr w:type="gramStart"/>
-      <w:r>
-        <w:t>URL(</w:t>
-      </w:r>
-      <w:proofErr w:type="gramEnd"/>
-      <w:r>
-        <w:t>"/order", req.url)</w:t>
+        <w:t>new URL("/order", req.url)</w:t>
       </w:r>
     </w:p>
     <w:p>
@@ -2537,15 +2344,7 @@
     </w:p>
     <w:p>
       <w:r>
-        <w:t xml:space="preserve">new </w:t>
-      </w:r>
-      <w:proofErr w:type="gramStart"/>
-      <w:r>
-        <w:t>URL(</w:t>
-      </w:r>
-      <w:proofErr w:type="gramEnd"/>
-      <w:r>
-        <w:t>"/order", req.url)</w:t>
+        <w:t>new URL("/order", req.url)</w:t>
       </w:r>
     </w:p>
     <w:p>
@@ -2880,12 +2679,10 @@
     </w:p>
     <w:p>
       <w:proofErr w:type="spellStart"/>
-      <w:proofErr w:type="gramStart"/>
       <w:r>
         <w:t>res.redirect</w:t>
       </w:r>
       <w:proofErr w:type="spellEnd"/>
-      <w:proofErr w:type="gramEnd"/>
       <w:r>
         <w:t>("/order")</w:t>
       </w:r>
@@ -2930,13 +2727,8 @@
         <w:t>Internally used request info (</w:t>
       </w:r>
       <w:proofErr w:type="spellStart"/>
-      <w:proofErr w:type="gramStart"/>
-      <w:r>
-        <w:t>req.headers</w:t>
-      </w:r>
-      <w:proofErr w:type="gramEnd"/>
-      <w:r>
-        <w:t>.host</w:t>
+      <w:r>
+        <w:t>req.headers.host</w:t>
       </w:r>
       <w:proofErr w:type="spellEnd"/>
       <w:r>
@@ -3210,12 +3002,10 @@
           </w:tcPr>
           <w:p>
             <w:proofErr w:type="spellStart"/>
-            <w:proofErr w:type="gramStart"/>
             <w:r>
               <w:t>res.redirect</w:t>
             </w:r>
             <w:proofErr w:type="spellEnd"/>
-            <w:proofErr w:type="gramEnd"/>
             <w:r>
               <w:t xml:space="preserve">("/x") </w:t>
             </w:r>
@@ -3366,12 +3156,10 @@
         <w:t xml:space="preserve">In old Next.js, </w:t>
       </w:r>
       <w:proofErr w:type="spellStart"/>
-      <w:proofErr w:type="gramStart"/>
       <w:r>
         <w:t>res.redirect</w:t>
       </w:r>
       <w:proofErr w:type="spellEnd"/>
-      <w:proofErr w:type="gramEnd"/>
       <w:r>
         <w:t xml:space="preserve"> auto-built the full URL, but modern Next.js uses standard </w:t>
       </w:r>
@@ -3485,27 +3273,13 @@
         <w:rPr>
           <w:lang w:val="en-US"/>
         </w:rPr>
-        <w:t xml:space="preserve">om </w:t>
-      </w:r>
-      <w:proofErr w:type="gramStart"/>
-      <w:r>
-        <w:rPr>
-          <w:lang w:val="en-US"/>
-        </w:rPr>
-        <w:t>number.</w:t>
-      </w:r>
-      <w:r>
-        <w:rPr>
-          <w:lang w:val="en-US"/>
-        </w:rPr>
-        <w:t>(</w:t>
-      </w:r>
-      <w:proofErr w:type="gramEnd"/>
-      <w:r>
-        <w:rPr>
-          <w:lang w:val="en-US"/>
-        </w:rPr>
-        <w:t xml:space="preserve">maybe by guess by which </w:t>
+        <w:t>om number.</w:t>
+      </w:r>
+      <w:r>
+        <w:rPr>
+          <w:lang w:val="en-US"/>
+        </w:rPr>
+        <w:t xml:space="preserve">(maybe by guess by which </w:t>
       </w:r>
       <w:r>
         <w:rPr>
@@ -3525,19 +3299,11 @@
         </w:rPr>
         <w:t xml:space="preserve"> by the </w:t>
       </w:r>
-      <w:proofErr w:type="gramStart"/>
-      <w:r>
-        <w:rPr>
-          <w:lang w:val="en-US"/>
-        </w:rPr>
-        <w:t>hacker(</w:t>
-      </w:r>
-      <w:proofErr w:type="gramEnd"/>
-      <w:r>
-        <w:rPr>
-          <w:lang w:val="en-US"/>
-        </w:rPr>
-        <w:t>who knows)</w:t>
+      <w:r>
+        <w:rPr>
+          <w:lang w:val="en-US"/>
+        </w:rPr>
+        <w:t>hacker(who knows)</w:t>
       </w:r>
       <w:r>
         <w:rPr>
@@ -3594,16 +3360,7 @@
           <w:bCs/>
           <w:lang w:val="en-US"/>
         </w:rPr>
-        <w:t xml:space="preserve">t is </w:t>
-      </w:r>
-      <w:proofErr w:type="gramStart"/>
-      <w:r>
-        <w:rPr>
-          <w:b/>
-          <w:bCs/>
-          <w:lang w:val="en-US"/>
-        </w:rPr>
-        <w:t>pen</w:t>
+        <w:t>t is pen</w:t>
       </w:r>
       <w:r>
         <w:rPr>
@@ -3619,16 +3376,7 @@
           <w:bCs/>
           <w:lang w:val="en-US"/>
         </w:rPr>
-        <w:t>ing(</w:t>
-      </w:r>
-      <w:proofErr w:type="gramEnd"/>
-      <w:r>
-        <w:rPr>
-          <w:b/>
-          <w:bCs/>
-          <w:lang w:val="en-US"/>
-        </w:rPr>
-        <w:t>very short)</w:t>
+        <w:t>ing(very short)</w:t>
       </w:r>
     </w:p>
     <w:p>
@@ -3928,23 +3676,13 @@
           <w:lang w:val="en-US"/>
         </w:rPr>
       </w:pPr>
-      <w:proofErr w:type="gramStart"/>
-      <w:r>
-        <w:rPr>
-          <w:b/>
-          <w:bCs/>
-          <w:lang w:val="en-US"/>
-        </w:rPr>
-        <w:t>so</w:t>
-      </w:r>
-      <w:proofErr w:type="gramEnd"/>
-      <w:r>
-        <w:rPr>
-          <w:b/>
-          <w:bCs/>
-          <w:lang w:val="en-US"/>
-        </w:rPr>
-        <w:t xml:space="preserve"> by pen</w:t>
+      <w:r>
+        <w:rPr>
+          <w:b/>
+          <w:bCs/>
+          <w:lang w:val="en-US"/>
+        </w:rPr>
+        <w:t>so by pen</w:t>
       </w:r>
       <w:r>
         <w:rPr>
@@ -4138,21 +3876,7 @@
         <w:rPr>
           <w:lang w:val="en-US"/>
         </w:rPr>
-        <w:t xml:space="preserve"> so the they can choose an order and track it (maybe </w:t>
-      </w:r>
-      <w:proofErr w:type="gramStart"/>
-      <w:r>
-        <w:rPr>
-          <w:lang w:val="en-US"/>
-        </w:rPr>
-        <w:t>opening  a</w:t>
-      </w:r>
-      <w:proofErr w:type="gramEnd"/>
-      <w:r>
-        <w:rPr>
-          <w:lang w:val="en-US"/>
-        </w:rPr>
-        <w:t xml:space="preserve"> particular order page of order in orders page)</w:t>
+        <w:t xml:space="preserve"> so the they can choose an order and track it (maybe opening  a particular order page of order in orders page)</w:t>
       </w:r>
       <w:r>
         <w:rPr>
@@ -4188,47 +3912,19 @@
         <w:rPr>
           <w:lang w:val="en-US"/>
         </w:rPr>
-        <w:t xml:space="preserve">from customer help </w:t>
-      </w:r>
-      <w:proofErr w:type="gramStart"/>
-      <w:r>
-        <w:rPr>
-          <w:lang w:val="en-US"/>
-        </w:rPr>
-        <w:t>desk(</w:t>
-      </w:r>
-      <w:proofErr w:type="gramEnd"/>
-      <w:r>
-        <w:rPr>
-          <w:lang w:val="en-US"/>
-        </w:rPr>
-        <w:t>who knows)</w:t>
-      </w:r>
-      <w:r>
-        <w:rPr>
-          <w:lang w:val="en-US"/>
-        </w:rPr>
-        <w:t xml:space="preserve"> then it can quote order </w:t>
-      </w:r>
-      <w:proofErr w:type="gramStart"/>
-      <w:r>
-        <w:rPr>
-          <w:lang w:val="en-US"/>
-        </w:rPr>
-        <w:t xml:space="preserve">id </w:t>
-      </w:r>
-      <w:r>
-        <w:rPr>
-          <w:lang w:val="en-US"/>
-        </w:rPr>
-        <w:t xml:space="preserve"> and</w:t>
-      </w:r>
-      <w:proofErr w:type="gramEnd"/>
-      <w:r>
-        <w:rPr>
-          <w:lang w:val="en-US"/>
-        </w:rPr>
-        <w:t xml:space="preserve"> take </w:t>
+        <w:t>from customer help desk(who knows)</w:t>
+      </w:r>
+      <w:r>
+        <w:rPr>
+          <w:lang w:val="en-US"/>
+        </w:rPr>
+        <w:t xml:space="preserve"> then it can quote order id </w:t>
+      </w:r>
+      <w:r>
+        <w:rPr>
+          <w:lang w:val="en-US"/>
+        </w:rPr>
+        <w:t xml:space="preserve"> and take </w:t>
       </w:r>
       <w:r>
         <w:rPr>
@@ -4332,7 +4028,6 @@
           <w:lang w:val="en-US"/>
         </w:rPr>
       </w:pPr>
-      <w:proofErr w:type="gramStart"/>
       <w:r>
         <w:rPr>
           <w:b/>
@@ -4341,7 +4036,6 @@
         </w:rPr>
         <w:t>Note:-</w:t>
       </w:r>
-      <w:proofErr w:type="gramEnd"/>
     </w:p>
     <w:p>
       <w:pPr>
@@ -4510,7 +4204,6 @@
         </w:rPr>
         <w:t xml:space="preserve">For an ecommerce site </w:t>
       </w:r>
-      <w:proofErr w:type="gramStart"/>
       <w:r>
         <w:rPr>
           <w:lang w:val="en-US"/>
@@ -4527,26 +4220,131 @@
         <w:rPr>
           <w:lang w:val="en-US"/>
         </w:rPr>
-        <w:t>illment</w:t>
-      </w:r>
-      <w:proofErr w:type="gramEnd"/>
+        <w:t xml:space="preserve">illment </w:t>
+      </w:r>
+      <w:r>
+        <w:rPr>
+          <w:lang w:val="en-US"/>
+        </w:rPr>
+        <w:t xml:space="preserve">we need to keep the </w:t>
+      </w:r>
+      <w:proofErr w:type="spellStart"/>
+      <w:r>
+        <w:rPr>
+          <w:lang w:val="en-US"/>
+        </w:rPr>
+        <w:t>pincode</w:t>
+      </w:r>
+      <w:proofErr w:type="spellEnd"/>
       <w:r>
         <w:rPr>
           <w:lang w:val="en-US"/>
         </w:rPr>
         <w:t xml:space="preserve"> </w:t>
       </w:r>
-      <w:r>
-        <w:rPr>
-          <w:lang w:val="en-US"/>
-        </w:rPr>
-        <w:t xml:space="preserve">we need to keep the </w:t>
-      </w:r>
       <w:proofErr w:type="spellStart"/>
       <w:r>
         <w:rPr>
           <w:lang w:val="en-US"/>
         </w:rPr>
+        <w:t>servi</w:t>
+      </w:r>
+      <w:r>
+        <w:rPr>
+          <w:lang w:val="en-US"/>
+        </w:rPr>
+        <w:t>c</w:t>
+      </w:r>
+      <w:r>
+        <w:rPr>
+          <w:lang w:val="en-US"/>
+        </w:rPr>
+        <w:t>able</w:t>
+      </w:r>
+      <w:proofErr w:type="spellEnd"/>
+      <w:r>
+        <w:rPr>
+          <w:lang w:val="en-US"/>
+        </w:rPr>
+        <w:t xml:space="preserve"> </w:t>
+      </w:r>
+      <w:r>
+        <w:rPr>
+          <w:lang w:val="en-US"/>
+        </w:rPr>
+        <w:t xml:space="preserve">if it is not serviceable then we will not be able </w:t>
+      </w:r>
+      <w:r>
+        <w:rPr>
+          <w:lang w:val="en-US"/>
+        </w:rPr>
+        <w:t>deliver there</w:t>
+      </w:r>
+      <w:r>
+        <w:rPr>
+          <w:lang w:val="en-US"/>
+        </w:rPr>
+        <w:t xml:space="preserve"> we would want that when someone </w:t>
+      </w:r>
+      <w:r>
+        <w:rPr>
+          <w:lang w:val="en-US"/>
+        </w:rPr>
+        <w:t xml:space="preserve">enter their pin then there state and district </w:t>
+      </w:r>
+      <w:r>
+        <w:rPr>
+          <w:lang w:val="en-US"/>
+        </w:rPr>
+        <w:t xml:space="preserve">automatically get filled </w:t>
+      </w:r>
+      <w:r>
+        <w:rPr>
+          <w:lang w:val="en-US"/>
+        </w:rPr>
+        <w:t xml:space="preserve">if it get done then it will be </w:t>
+      </w:r>
+      <w:r>
+        <w:rPr>
+          <w:lang w:val="en-US"/>
+        </w:rPr>
+        <w:t xml:space="preserve">a good experience for </w:t>
+      </w:r>
+      <w:r>
+        <w:rPr>
+          <w:lang w:val="en-US"/>
+        </w:rPr>
+        <w:t xml:space="preserve">user. </w:t>
+      </w:r>
+      <w:r>
+        <w:rPr>
+          <w:lang w:val="en-US"/>
+        </w:rPr>
+        <w:t>Because user woul</w:t>
+      </w:r>
+      <w:r>
+        <w:rPr>
+          <w:lang w:val="en-US"/>
+        </w:rPr>
+        <w:t>d</w:t>
+      </w:r>
+      <w:r>
+        <w:rPr>
+          <w:lang w:val="en-US"/>
+        </w:rPr>
+        <w:t xml:space="preserve"> not want that </w:t>
+      </w:r>
+      <w:r>
+        <w:rPr>
+          <w:lang w:val="en-US"/>
+        </w:rPr>
+        <w:t xml:space="preserve">he fills the </w:t>
+      </w:r>
+      <w:proofErr w:type="spellStart"/>
+      <w:r>
+        <w:rPr>
+          <w:lang w:val="en-US"/>
+        </w:rPr>
         <w:t>pincode</w:t>
       </w:r>
       <w:proofErr w:type="spellEnd"/>
@@ -4554,695 +4352,449 @@
         <w:rPr>
           <w:lang w:val="en-US"/>
         </w:rPr>
+        <w:t xml:space="preserve"> and then he have to fill State and then distric</w:t>
+      </w:r>
+      <w:r>
+        <w:rPr>
+          <w:lang w:val="en-US"/>
+        </w:rPr>
+        <w:t>t then these all things should be automatic</w:t>
+      </w:r>
+      <w:r>
+        <w:rPr>
+          <w:lang w:val="en-US"/>
+        </w:rPr>
+        <w:t xml:space="preserve">. </w:t>
+      </w:r>
+      <w:proofErr w:type="spellStart"/>
+      <w:r>
+        <w:rPr>
+          <w:lang w:val="en-US"/>
+        </w:rPr>
+        <w:t>Lets</w:t>
+      </w:r>
+      <w:proofErr w:type="spellEnd"/>
+      <w:r>
+        <w:rPr>
+          <w:lang w:val="en-US"/>
+        </w:rPr>
+        <w:t xml:space="preserve"> see how we can distribute </w:t>
+      </w:r>
+      <w:proofErr w:type="spellStart"/>
+      <w:r>
+        <w:rPr>
+          <w:lang w:val="en-US"/>
+        </w:rPr>
+        <w:t>pincode</w:t>
+      </w:r>
+      <w:proofErr w:type="spellEnd"/>
+      <w:r>
+        <w:rPr>
+          <w:lang w:val="en-US"/>
+        </w:rPr>
+        <w:t xml:space="preserve"> into state and district.</w:t>
+      </w:r>
+    </w:p>
+    <w:p>
+      <w:pPr>
+        <w:rPr>
+          <w:lang w:val="en-US"/>
+        </w:rPr>
+      </w:pPr>
+      <w:r>
+        <w:rPr>
+          <w:lang w:val="en-US"/>
+        </w:rPr>
+        <w:t>And we will also see how to check tampering of cart. (who knows)</w:t>
+      </w:r>
+      <w:r>
+        <w:rPr>
+          <w:lang w:val="en-US"/>
+        </w:rPr>
+        <w:t xml:space="preserve"> that nobody changes the cart in the memo</w:t>
+      </w:r>
+      <w:r>
+        <w:rPr>
+          <w:lang w:val="en-US"/>
+        </w:rPr>
+        <w:t xml:space="preserve">ry </w:t>
+      </w:r>
+      <w:r>
+        <w:rPr>
+          <w:lang w:val="en-US"/>
+        </w:rPr>
+        <w:t xml:space="preserve">and then </w:t>
+      </w:r>
+      <w:r>
+        <w:rPr>
+          <w:lang w:val="en-US"/>
+        </w:rPr>
+        <w:t>buy thin</w:t>
+      </w:r>
+      <w:r>
+        <w:rPr>
+          <w:lang w:val="en-US"/>
+        </w:rPr>
+        <w:t>gs</w:t>
+      </w:r>
+      <w:r>
+        <w:rPr>
+          <w:lang w:val="en-US"/>
+        </w:rPr>
         <w:t xml:space="preserve"> </w:t>
       </w:r>
+      <w:r>
+        <w:rPr>
+          <w:lang w:val="en-US"/>
+        </w:rPr>
+        <w:t>very</w:t>
+      </w:r>
+      <w:r>
+        <w:rPr>
+          <w:lang w:val="en-US"/>
+        </w:rPr>
+        <w:t xml:space="preserve"> cheap</w:t>
+      </w:r>
+      <w:r>
+        <w:rPr>
+          <w:lang w:val="en-US"/>
+        </w:rPr>
+        <w:t xml:space="preserve"> as cart data is in localhost.</w:t>
+      </w:r>
+    </w:p>
+    <w:p>
+      <w:pPr>
+        <w:rPr>
+          <w:lang w:val="en-US"/>
+        </w:rPr>
+      </w:pPr>
+    </w:p>
+    <w:p>
+      <w:pPr>
+        <w:rPr>
+          <w:lang w:val="en-US"/>
+        </w:rPr>
+      </w:pPr>
+    </w:p>
+    <w:p>
+      <w:pPr>
+        <w:rPr>
+          <w:b/>
+          <w:bCs/>
+          <w:color w:val="EE0000"/>
+          <w:lang w:val="en-US"/>
+        </w:rPr>
+      </w:pPr>
+      <w:r>
+        <w:rPr>
+          <w:b/>
+          <w:bCs/>
+          <w:color w:val="EE0000"/>
+          <w:lang w:val="en-US"/>
+        </w:rPr>
+        <w:t xml:space="preserve">By for in loop we can </w:t>
+      </w:r>
+      <w:r>
+        <w:rPr>
+          <w:b/>
+          <w:bCs/>
+          <w:color w:val="EE0000"/>
+          <w:lang w:val="en-US"/>
+        </w:rPr>
+        <w:t>go through all the keys of an object</w:t>
+      </w:r>
+    </w:p>
+    <w:p>
+      <w:r>
+        <w:t xml:space="preserve">If you keep inventory of </w:t>
+      </w:r>
+      <w:r>
+        <w:t>things then there is a high chance that after some time the thi</w:t>
+      </w:r>
+      <w:r>
+        <w:t>ng</w:t>
+      </w:r>
+      <w:r>
+        <w:t>s got out of stock.</w:t>
+      </w:r>
+      <w:r>
+        <w:t xml:space="preserve"> If everything got sold our then off course it will be out of stock. </w:t>
+      </w:r>
+      <w:r>
+        <w:t xml:space="preserve">And in such cases of you are still showing the items </w:t>
+      </w:r>
+      <w:r>
+        <w:t>and people are still able to buying it</w:t>
+      </w:r>
+      <w:r>
+        <w:t xml:space="preserve"> then it is a very big problem because </w:t>
+      </w:r>
+      <w:r>
+        <w:t xml:space="preserve">you will not have stock </w:t>
+      </w:r>
+      <w:r>
+        <w:t xml:space="preserve">and user will put the order and if you cancel everything then it will not be good for </w:t>
+      </w:r>
+      <w:r>
+        <w:t>user</w:t>
+      </w:r>
+      <w:r>
+        <w:t xml:space="preserve">.  As the user is buying items </w:t>
+      </w:r>
+      <w:r>
+        <w:t>and we will</w:t>
+      </w:r>
+      <w:r>
+        <w:t xml:space="preserve"> </w:t>
+      </w:r>
+      <w:r>
+        <w:t xml:space="preserve">deduct from one available </w:t>
+      </w:r>
+      <w:r>
+        <w:t xml:space="preserve">quantity </w:t>
+      </w:r>
+      <w:r>
+        <w:t xml:space="preserve">whatever number they have bought </w:t>
+      </w:r>
+      <w:r>
+        <w:t>and if available quan</w:t>
+      </w:r>
+      <w:r>
+        <w:t xml:space="preserve">tity is </w:t>
+      </w:r>
+      <w:r>
+        <w:t xml:space="preserve">0 then </w:t>
+      </w:r>
+      <w:r>
+        <w:t>w</w:t>
+      </w:r>
+      <w:r>
+        <w:t>e will show our of stock</w:t>
+      </w:r>
+      <w:r>
+        <w:t xml:space="preserve"> in ou</w:t>
+      </w:r>
+      <w:r>
+        <w:t>r</w:t>
+      </w:r>
+      <w:r>
+        <w:t xml:space="preserve"> product page. </w:t>
+      </w:r>
+    </w:p>
+    <w:p>
+      <w:pPr>
+        <w:rPr>
+          <w:b/>
+          <w:bCs/>
+          <w:color w:val="EE0000"/>
+        </w:rPr>
+      </w:pPr>
+      <w:r>
+        <w:rPr>
+          <w:b/>
+          <w:bCs/>
+          <w:color w:val="EE0000"/>
+        </w:rPr>
+        <w:t xml:space="preserve">If any person try to tamper the data in local storage or </w:t>
+      </w:r>
+      <w:r>
+        <w:rPr>
+          <w:b/>
+          <w:bCs/>
+          <w:color w:val="EE0000"/>
+        </w:rPr>
+        <w:t>the price get changed in backend for some genuin</w:t>
+      </w:r>
+      <w:r>
+        <w:rPr>
+          <w:b/>
+          <w:bCs/>
+          <w:color w:val="EE0000"/>
+        </w:rPr>
+        <w:t>e reason (maybe backend changed by the</w:t>
+      </w:r>
+      <w:r>
+        <w:rPr>
+          <w:b/>
+          <w:bCs/>
+          <w:color w:val="EE0000"/>
+        </w:rPr>
+        <w:t xml:space="preserve"> merchant(who knows)</w:t>
+      </w:r>
+      <w:r>
+        <w:rPr>
+          <w:b/>
+          <w:bCs/>
+          <w:color w:val="EE0000"/>
+        </w:rPr>
+        <w:t>)</w:t>
+      </w:r>
+      <w:r>
+        <w:rPr>
+          <w:b/>
+          <w:bCs/>
+          <w:color w:val="EE0000"/>
+        </w:rPr>
+        <w:t xml:space="preserve"> then we will clear the cart from local storage</w:t>
+      </w:r>
+    </w:p>
+    <w:p>
+      <w:r>
+        <w:t>On</w:t>
+      </w:r>
+      <w:r>
+        <w:t>e</w:t>
+      </w:r>
+      <w:r>
+        <w:t xml:space="preserve"> thing to notice if we buy with some other email then it will not e </w:t>
+      </w:r>
       <w:proofErr w:type="spellStart"/>
       <w:r>
-        <w:rPr>
-          <w:lang w:val="en-US"/>
-        </w:rPr>
-        <w:t>servi</w:t>
-      </w:r>
-      <w:r>
-        <w:rPr>
-          <w:lang w:val="en-US"/>
-        </w:rPr>
-        <w:t>c</w:t>
-      </w:r>
-      <w:r>
-        <w:rPr>
-          <w:lang w:val="en-US"/>
-        </w:rPr>
-        <w:t>able</w:t>
+        <w:t>showin</w:t>
       </w:r>
       <w:proofErr w:type="spellEnd"/>
       <w:r>
-        <w:rPr>
-          <w:lang w:val="en-US"/>
-        </w:rPr>
-        <w:t xml:space="preserve"> </w:t>
-      </w:r>
-      <w:r>
-        <w:rPr>
-          <w:lang w:val="en-US"/>
-        </w:rPr>
-        <w:t xml:space="preserve">if it is not serviceable then we will not be able </w:t>
-      </w:r>
-      <w:r>
-        <w:rPr>
-          <w:lang w:val="en-US"/>
-        </w:rPr>
-        <w:t>deliver there</w:t>
-      </w:r>
-      <w:r>
-        <w:rPr>
-          <w:lang w:val="en-US"/>
-        </w:rPr>
-        <w:t xml:space="preserve"> we would want that when someone </w:t>
-      </w:r>
-      <w:r>
-        <w:rPr>
-          <w:lang w:val="en-US"/>
-        </w:rPr>
-        <w:t xml:space="preserve">enter their pin then </w:t>
-      </w:r>
-      <w:proofErr w:type="gramStart"/>
-      <w:r>
-        <w:rPr>
-          <w:lang w:val="en-US"/>
-        </w:rPr>
-        <w:t>there</w:t>
-      </w:r>
-      <w:proofErr w:type="gramEnd"/>
-      <w:r>
-        <w:rPr>
-          <w:lang w:val="en-US"/>
-        </w:rPr>
-        <w:t xml:space="preserve"> state and district </w:t>
-      </w:r>
-      <w:r>
-        <w:rPr>
-          <w:lang w:val="en-US"/>
-        </w:rPr>
-        <w:t xml:space="preserve">automatically get filled </w:t>
-      </w:r>
-      <w:r>
-        <w:rPr>
-          <w:lang w:val="en-US"/>
-        </w:rPr>
-        <w:t xml:space="preserve">if it </w:t>
-      </w:r>
-      <w:proofErr w:type="gramStart"/>
-      <w:r>
-        <w:rPr>
-          <w:lang w:val="en-US"/>
-        </w:rPr>
-        <w:t>get</w:t>
-      </w:r>
-      <w:proofErr w:type="gramEnd"/>
-      <w:r>
-        <w:rPr>
-          <w:lang w:val="en-US"/>
-        </w:rPr>
-        <w:t xml:space="preserve"> done then it will be </w:t>
-      </w:r>
-      <w:r>
-        <w:rPr>
-          <w:lang w:val="en-US"/>
-        </w:rPr>
-        <w:t xml:space="preserve">a good experience for </w:t>
-      </w:r>
-      <w:r>
-        <w:rPr>
-          <w:lang w:val="en-US"/>
-        </w:rPr>
-        <w:t xml:space="preserve">user. </w:t>
-      </w:r>
-      <w:r>
-        <w:rPr>
-          <w:lang w:val="en-US"/>
-        </w:rPr>
-        <w:t>Because user woul</w:t>
-      </w:r>
-      <w:r>
-        <w:rPr>
-          <w:lang w:val="en-US"/>
-        </w:rPr>
-        <w:t>d</w:t>
-      </w:r>
-      <w:r>
-        <w:rPr>
-          <w:lang w:val="en-US"/>
-        </w:rPr>
-        <w:t xml:space="preserve"> not want that </w:t>
-      </w:r>
-      <w:r>
-        <w:rPr>
-          <w:lang w:val="en-US"/>
-        </w:rPr>
-        <w:t xml:space="preserve">he fills the </w:t>
+        <w:t xml:space="preserve"> in orders </w:t>
+      </w:r>
+      <w:r>
+        <w:t>and the user will not be able to t</w:t>
+      </w:r>
+      <w:r>
+        <w:t>r</w:t>
+      </w:r>
+      <w:r>
+        <w:t xml:space="preserve">ack from their </w:t>
+      </w:r>
+      <w:r>
+        <w:t xml:space="preserve">email </w:t>
+      </w:r>
+      <w:r>
+        <w:t xml:space="preserve">id </w:t>
+      </w:r>
+      <w:r>
+        <w:t xml:space="preserve">So what we will do is that if the person is logged in then email value will not change </w:t>
+      </w:r>
+    </w:p>
+    <w:p>
+      <w:pPr>
+        <w:rPr>
+          <w:b/>
+          <w:bCs/>
+        </w:rPr>
+      </w:pPr>
+      <w:r>
+        <w:rPr>
+          <w:b/>
+          <w:bCs/>
+        </w:rPr>
+        <w:t>so child useEffect runs first(</w:t>
       </w:r>
       <w:proofErr w:type="spellStart"/>
       <w:r>
         <w:rPr>
-          <w:lang w:val="en-US"/>
-        </w:rPr>
-        <w:t>pincode</w:t>
+          <w:b/>
+          <w:bCs/>
+        </w:rPr>
+        <w:t>onelienr</w:t>
       </w:r>
       <w:proofErr w:type="spellEnd"/>
       <w:r>
         <w:rPr>
-          <w:lang w:val="en-US"/>
-        </w:rPr>
-        <w:t xml:space="preserve"> and then he </w:t>
-      </w:r>
-      <w:proofErr w:type="gramStart"/>
-      <w:r>
-        <w:rPr>
-          <w:lang w:val="en-US"/>
-        </w:rPr>
-        <w:t>have</w:t>
-      </w:r>
-      <w:proofErr w:type="gramEnd"/>
-      <w:r>
-        <w:rPr>
-          <w:lang w:val="en-US"/>
-        </w:rPr>
-        <w:t xml:space="preserve"> to fill State and then distric</w:t>
-      </w:r>
-      <w:r>
-        <w:rPr>
-          <w:lang w:val="en-US"/>
-        </w:rPr>
-        <w:t>t then these all things should be automatic</w:t>
-      </w:r>
-      <w:r>
-        <w:rPr>
-          <w:lang w:val="en-US"/>
-        </w:rPr>
-        <w:t xml:space="preserve">. </w:t>
+          <w:b/>
+          <w:bCs/>
+        </w:rPr>
+        <w:t>)</w:t>
+      </w:r>
+    </w:p>
+    <w:p>
+      <w:r>
+        <w:rPr>
+          <w:rFonts w:ascii="Segoe UI Emoji" w:hAnsi="Segoe UI Emoji" w:cs="Segoe UI Emoji"/>
+        </w:rPr>
+        <w:t>✔️</w:t>
+      </w:r>
+      <w:r>
+        <w:t xml:space="preserve"> Yes—after rendering, useEffect of child components runs before the parent’s useEffect.</w:t>
+      </w:r>
+    </w:p>
+    <w:p>
+      <w:pPr>
+        <w:rPr>
+          <w:b/>
+          <w:bCs/>
+        </w:rPr>
+      </w:pPr>
+      <w:r>
+        <w:rPr>
+          <w:b/>
+          <w:bCs/>
+        </w:rPr>
+        <w:t>so order matters here(</w:t>
       </w:r>
       <w:proofErr w:type="spellStart"/>
-      <w:proofErr w:type="gramStart"/>
-      <w:r>
-        <w:rPr>
-          <w:lang w:val="en-US"/>
-        </w:rPr>
-        <w:t>Lets</w:t>
+      <w:r>
+        <w:rPr>
+          <w:b/>
+          <w:bCs/>
+        </w:rPr>
+        <w:t>oneliner</w:t>
       </w:r>
       <w:proofErr w:type="spellEnd"/>
-      <w:proofErr w:type="gramEnd"/>
-      <w:r>
-        <w:rPr>
-          <w:lang w:val="en-US"/>
-        </w:rPr>
-        <w:t xml:space="preserve"> see how we can distribute </w:t>
-      </w:r>
-      <w:proofErr w:type="spellStart"/>
-      <w:r>
-        <w:rPr>
-          <w:lang w:val="en-US"/>
-        </w:rPr>
-        <w:t>pincode</w:t>
-      </w:r>
-      <w:proofErr w:type="spellEnd"/>
-      <w:r>
-        <w:rPr>
-          <w:lang w:val="en-US"/>
-        </w:rPr>
-        <w:t xml:space="preserve"> into state and district.</w:t>
-      </w:r>
-    </w:p>
-    <w:p>
-      <w:pPr>
-        <w:rPr>
-          <w:lang w:val="en-US"/>
-        </w:rPr>
-      </w:pPr>
-      <w:r>
-        <w:rPr>
-          <w:lang w:val="en-US"/>
-        </w:rPr>
-        <w:t>And we will also see how to check tampering of cart. (who knows)</w:t>
-      </w:r>
-      <w:r>
-        <w:rPr>
-          <w:lang w:val="en-US"/>
-        </w:rPr>
-        <w:t xml:space="preserve"> that nobody changes the cart in the memo</w:t>
-      </w:r>
-      <w:r>
-        <w:rPr>
-          <w:lang w:val="en-US"/>
-        </w:rPr>
-        <w:t xml:space="preserve">ry </w:t>
-      </w:r>
-      <w:r>
-        <w:rPr>
-          <w:lang w:val="en-US"/>
-        </w:rPr>
-        <w:t xml:space="preserve">and then </w:t>
-      </w:r>
-      <w:r>
-        <w:rPr>
-          <w:lang w:val="en-US"/>
-        </w:rPr>
-        <w:t>buy thin</w:t>
-      </w:r>
-      <w:r>
-        <w:rPr>
-          <w:lang w:val="en-US"/>
-        </w:rPr>
-        <w:t>gs</w:t>
-      </w:r>
-      <w:r>
-        <w:rPr>
-          <w:lang w:val="en-US"/>
-        </w:rPr>
-        <w:t xml:space="preserve"> </w:t>
-      </w:r>
-      <w:r>
-        <w:rPr>
-          <w:lang w:val="en-US"/>
-        </w:rPr>
-        <w:t>very</w:t>
-      </w:r>
-      <w:r>
-        <w:rPr>
-          <w:lang w:val="en-US"/>
-        </w:rPr>
-        <w:t xml:space="preserve"> cheap</w:t>
-      </w:r>
-      <w:r>
-        <w:rPr>
-          <w:lang w:val="en-US"/>
-        </w:rPr>
-        <w:t xml:space="preserve"> as cart data is in localhost.</w:t>
-      </w:r>
-    </w:p>
-    <w:p>
-      <w:pPr>
-        <w:rPr>
-          <w:lang w:val="en-US"/>
-        </w:rPr>
-      </w:pPr>
-    </w:p>
-    <w:p>
-      <w:pPr>
-        <w:rPr>
-          <w:lang w:val="en-US"/>
-        </w:rPr>
-      </w:pPr>
-    </w:p>
-    <w:p>
-      <w:pPr>
-        <w:rPr>
-          <w:b/>
-          <w:bCs/>
-          <w:color w:val="EE0000"/>
-          <w:lang w:val="en-US"/>
-        </w:rPr>
-      </w:pPr>
-      <w:r>
-        <w:rPr>
-          <w:b/>
-          <w:bCs/>
-          <w:color w:val="EE0000"/>
-          <w:lang w:val="en-US"/>
-        </w:rPr>
-        <w:t xml:space="preserve">By for in </w:t>
-      </w:r>
-      <w:proofErr w:type="gramStart"/>
-      <w:r>
-        <w:rPr>
-          <w:b/>
-          <w:bCs/>
-          <w:color w:val="EE0000"/>
-          <w:lang w:val="en-US"/>
-        </w:rPr>
-        <w:t>loop</w:t>
-      </w:r>
-      <w:proofErr w:type="gramEnd"/>
-      <w:r>
-        <w:rPr>
-          <w:b/>
-          <w:bCs/>
-          <w:color w:val="EE0000"/>
-          <w:lang w:val="en-US"/>
-        </w:rPr>
-        <w:t xml:space="preserve"> we can </w:t>
-      </w:r>
-      <w:r>
-        <w:rPr>
-          <w:b/>
-          <w:bCs/>
-          <w:color w:val="EE0000"/>
-          <w:lang w:val="en-US"/>
-        </w:rPr>
-        <w:t>go through all the keys of an object</w:t>
-      </w:r>
-    </w:p>
-    <w:p>
-      <w:r>
-        <w:t xml:space="preserve">If you keep inventory of </w:t>
-      </w:r>
-      <w:r>
-        <w:t>things then there is a high chance that after some time the thi</w:t>
-      </w:r>
-      <w:r>
-        <w:t>ng</w:t>
-      </w:r>
-      <w:r>
-        <w:t>s got out of stock.</w:t>
-      </w:r>
-      <w:r>
-        <w:t xml:space="preserve"> If everything got sold </w:t>
-      </w:r>
-      <w:proofErr w:type="gramStart"/>
-      <w:r>
-        <w:t>our</w:t>
-      </w:r>
-      <w:proofErr w:type="gramEnd"/>
-      <w:r>
-        <w:t xml:space="preserve"> then off course it will be out of stock. </w:t>
-      </w:r>
-      <w:r>
-        <w:t xml:space="preserve">And in such cases of you are still showing the items </w:t>
-      </w:r>
-      <w:r>
-        <w:t>and people are still able to buying it</w:t>
-      </w:r>
-      <w:r>
-        <w:t xml:space="preserve"> then it is a very big problem because </w:t>
-      </w:r>
-      <w:r>
-        <w:t xml:space="preserve">you will not have stock </w:t>
-      </w:r>
-      <w:r>
-        <w:t xml:space="preserve">and user will put the order and if you cancel everything then it will not be good for </w:t>
-      </w:r>
-      <w:r>
-        <w:t>user</w:t>
-      </w:r>
-      <w:r>
-        <w:t xml:space="preserve">.  As the user is buying items </w:t>
-      </w:r>
-      <w:r>
-        <w:t>and we will</w:t>
-      </w:r>
-      <w:r>
-        <w:t xml:space="preserve"> </w:t>
-      </w:r>
-      <w:r>
-        <w:t xml:space="preserve">deduct from one available </w:t>
-      </w:r>
-      <w:r>
-        <w:t xml:space="preserve">quantity </w:t>
-      </w:r>
-      <w:r>
-        <w:t xml:space="preserve">whatever number they have bought </w:t>
-      </w:r>
-      <w:r>
-        <w:t>and if available quan</w:t>
-      </w:r>
-      <w:r>
-        <w:t xml:space="preserve">tity is </w:t>
-      </w:r>
-      <w:r>
-        <w:t xml:space="preserve">0 then </w:t>
-      </w:r>
-      <w:r>
-        <w:t>w</w:t>
-      </w:r>
-      <w:r>
-        <w:t xml:space="preserve">e will show </w:t>
-      </w:r>
-      <w:proofErr w:type="gramStart"/>
-      <w:r>
-        <w:t>our</w:t>
-      </w:r>
-      <w:proofErr w:type="gramEnd"/>
-      <w:r>
-        <w:t xml:space="preserve"> of stock</w:t>
-      </w:r>
-      <w:r>
-        <w:t xml:space="preserve"> in ou</w:t>
-      </w:r>
-      <w:r>
-        <w:t>r</w:t>
-      </w:r>
-      <w:r>
-        <w:t xml:space="preserve"> product page. </w:t>
-      </w:r>
-    </w:p>
-    <w:p>
-      <w:pPr>
-        <w:rPr>
-          <w:b/>
-          <w:bCs/>
-          <w:color w:val="EE0000"/>
-        </w:rPr>
-      </w:pPr>
-      <w:r>
-        <w:rPr>
-          <w:b/>
-          <w:bCs/>
-          <w:color w:val="EE0000"/>
-        </w:rPr>
-        <w:t xml:space="preserve">If any person </w:t>
-      </w:r>
-      <w:proofErr w:type="gramStart"/>
-      <w:r>
-        <w:rPr>
-          <w:b/>
-          <w:bCs/>
-          <w:color w:val="EE0000"/>
-        </w:rPr>
-        <w:t>try</w:t>
-      </w:r>
-      <w:proofErr w:type="gramEnd"/>
-      <w:r>
-        <w:rPr>
-          <w:b/>
-          <w:bCs/>
-          <w:color w:val="EE0000"/>
-        </w:rPr>
-        <w:t xml:space="preserve"> to tamper the data in local storage or </w:t>
-      </w:r>
-      <w:r>
-        <w:rPr>
-          <w:b/>
-          <w:bCs/>
-          <w:color w:val="EE0000"/>
-        </w:rPr>
-        <w:t>the price get changed in backend for some genuin</w:t>
-      </w:r>
-      <w:r>
-        <w:rPr>
-          <w:b/>
-          <w:bCs/>
-          <w:color w:val="EE0000"/>
-        </w:rPr>
-        <w:t>e reason (maybe backend changed by the</w:t>
-      </w:r>
-      <w:r>
-        <w:rPr>
-          <w:b/>
-          <w:bCs/>
-          <w:color w:val="EE0000"/>
-        </w:rPr>
-        <w:t xml:space="preserve"> </w:t>
-      </w:r>
-      <w:proofErr w:type="gramStart"/>
-      <w:r>
-        <w:rPr>
-          <w:b/>
-          <w:bCs/>
-          <w:color w:val="EE0000"/>
-        </w:rPr>
-        <w:t>merchant(</w:t>
-      </w:r>
-      <w:proofErr w:type="gramEnd"/>
-      <w:r>
-        <w:rPr>
-          <w:b/>
-          <w:bCs/>
-          <w:color w:val="EE0000"/>
-        </w:rPr>
-        <w:t>who knows)</w:t>
-      </w:r>
-      <w:r>
-        <w:rPr>
-          <w:b/>
-          <w:bCs/>
-          <w:color w:val="EE0000"/>
+      <w:r>
+        <w:rPr>
+          <w:b/>
+          <w:bCs/>
         </w:rPr>
         <w:t>)</w:t>
       </w:r>
-      <w:r>
-        <w:rPr>
-          <w:b/>
-          <w:bCs/>
-          <w:color w:val="EE0000"/>
-        </w:rPr>
-        <w:t xml:space="preserve"> then we will clear the cart from local storage</w:t>
-      </w:r>
-    </w:p>
-    <w:p>
-      <w:r>
-        <w:t>On</w:t>
-      </w:r>
-      <w:r>
+    </w:p>
+    <w:p>
+      <w:r>
+        <w:rPr>
+          <w:rFonts w:ascii="Segoe UI Emoji" w:hAnsi="Segoe UI Emoji" w:cs="Segoe UI Emoji"/>
+        </w:rPr>
+        <w:t>✔️</w:t>
+      </w:r>
+      <w:r>
+        <w:t xml:space="preserve"> Yes—the component hierarchy/order matters, so child useEffect runs before parent useEffect.</w:t>
+      </w:r>
+    </w:p>
+    <w:p>
+      <w:pPr>
+        <w:rPr>
+          <w:b/>
+          <w:bCs/>
+        </w:rPr>
+      </w:pPr>
+      <w:r>
+        <w:rPr>
+          <w:b/>
+          <w:bCs/>
+        </w:rPr>
+        <w:t>i</w:t>
+      </w:r>
+      <w:r>
+        <w:rPr>
+          <w:b/>
+          <w:bCs/>
+        </w:rPr>
+        <w:t>f</w:t>
+      </w:r>
+      <w:r>
+        <w:rPr>
+          <w:b/>
+          <w:bCs/>
+        </w:rPr>
+        <w:t xml:space="preserve"> the compon</w:t>
+      </w:r>
+      <w:r>
+        <w:rPr>
+          <w:b/>
+          <w:bCs/>
+        </w:rPr>
         <w:t>e</w:t>
       </w:r>
       <w:r>
-        <w:t xml:space="preserve"> thing to notice if we buy with some other email then it will not e </w:t>
-      </w:r>
-      <w:proofErr w:type="spellStart"/>
-      <w:r>
-        <w:t>showin</w:t>
-      </w:r>
-      <w:proofErr w:type="spellEnd"/>
-      <w:r>
-        <w:t xml:space="preserve"> in orders </w:t>
-      </w:r>
-      <w:r>
-        <w:t>and the user will not be able to t</w:t>
-      </w:r>
-      <w:r>
-        <w:t>r</w:t>
-      </w:r>
-      <w:r>
-        <w:t xml:space="preserve">ack from their </w:t>
-      </w:r>
-      <w:r>
-        <w:t xml:space="preserve">email </w:t>
-      </w:r>
-      <w:r>
-        <w:t xml:space="preserve">id </w:t>
-      </w:r>
-      <w:r>
-        <w:t xml:space="preserve">So what we will do is that if the person is logged in then email value will not change </w:t>
-      </w:r>
-    </w:p>
-    <w:p>
-      <w:pPr>
-        <w:rPr>
-          <w:b/>
-          <w:bCs/>
-        </w:rPr>
-      </w:pPr>
-      <w:proofErr w:type="gramStart"/>
-      <w:r>
-        <w:rPr>
-          <w:b/>
-          <w:bCs/>
-        </w:rPr>
-        <w:t>so</w:t>
-      </w:r>
-      <w:proofErr w:type="gramEnd"/>
-      <w:r>
-        <w:rPr>
-          <w:b/>
-          <w:bCs/>
-        </w:rPr>
-        <w:t xml:space="preserve"> child useEffect runs first(</w:t>
-      </w:r>
-      <w:proofErr w:type="spellStart"/>
-      <w:r>
-        <w:rPr>
-          <w:b/>
-          <w:bCs/>
-        </w:rPr>
-        <w:t>onelienr</w:t>
-      </w:r>
-      <w:proofErr w:type="spellEnd"/>
-      <w:r>
-        <w:rPr>
-          <w:b/>
-          <w:bCs/>
-        </w:rPr>
-        <w:t>)</w:t>
-      </w:r>
-    </w:p>
-    <w:p>
-      <w:r>
-        <w:rPr>
-          <w:rFonts w:ascii="Segoe UI Emoji" w:hAnsi="Segoe UI Emoji" w:cs="Segoe UI Emoji"/>
-        </w:rPr>
-        <w:t>✔️</w:t>
-      </w:r>
-      <w:r>
-        <w:t xml:space="preserve"> Yes—after rendering, useEffect of child components runs before the parent’s useEffect.</w:t>
-      </w:r>
-    </w:p>
-    <w:p>
-      <w:pPr>
-        <w:rPr>
-          <w:b/>
-          <w:bCs/>
-        </w:rPr>
-      </w:pPr>
-      <w:proofErr w:type="gramStart"/>
-      <w:r>
-        <w:rPr>
-          <w:b/>
-          <w:bCs/>
-        </w:rPr>
-        <w:t>so</w:t>
-      </w:r>
-      <w:proofErr w:type="gramEnd"/>
-      <w:r>
-        <w:rPr>
-          <w:b/>
-          <w:bCs/>
-        </w:rPr>
-        <w:t xml:space="preserve"> order matters here(</w:t>
-      </w:r>
-      <w:proofErr w:type="spellStart"/>
-      <w:r>
-        <w:rPr>
-          <w:b/>
-          <w:bCs/>
-        </w:rPr>
-        <w:t>oneliner</w:t>
-      </w:r>
-      <w:proofErr w:type="spellEnd"/>
-      <w:r>
-        <w:rPr>
-          <w:b/>
-          <w:bCs/>
-        </w:rPr>
-        <w:t>)</w:t>
-      </w:r>
-    </w:p>
-    <w:p>
-      <w:r>
-        <w:rPr>
-          <w:rFonts w:ascii="Segoe UI Emoji" w:hAnsi="Segoe UI Emoji" w:cs="Segoe UI Emoji"/>
-        </w:rPr>
-        <w:t>✔️</w:t>
-      </w:r>
-      <w:r>
-        <w:t xml:space="preserve"> Yes—the component hierarchy/order matters, so child useEffect runs before parent useEffect.</w:t>
-      </w:r>
-    </w:p>
-    <w:p>
-      <w:pPr>
-        <w:rPr>
-          <w:b/>
-          <w:bCs/>
-        </w:rPr>
-      </w:pPr>
-      <w:r>
-        <w:rPr>
-          <w:b/>
-          <w:bCs/>
-        </w:rPr>
-        <w:t>i</w:t>
-      </w:r>
-      <w:r>
-        <w:rPr>
-          <w:b/>
-          <w:bCs/>
-        </w:rPr>
-        <w:t>f</w:t>
-      </w:r>
-      <w:r>
-        <w:rPr>
-          <w:b/>
-          <w:bCs/>
-        </w:rPr>
-        <w:t xml:space="preserve"> the compon</w:t>
-      </w:r>
-      <w:r>
-        <w:rPr>
-          <w:b/>
-          <w:bCs/>
-        </w:rPr>
-        <w:t>e</w:t>
-      </w:r>
-      <w:r>
         <w:rPr>
           <w:b/>
           <w:bCs/>
@@ -5261,23 +4813,7 @@
           <w:b/>
           <w:bCs/>
         </w:rPr>
-        <w:t xml:space="preserve"> </w:t>
-      </w:r>
-      <w:proofErr w:type="gramStart"/>
-      <w:r>
-        <w:rPr>
-          <w:b/>
-          <w:bCs/>
-        </w:rPr>
-        <w:t>get</w:t>
-      </w:r>
-      <w:proofErr w:type="gramEnd"/>
-      <w:r>
-        <w:rPr>
-          <w:b/>
-          <w:bCs/>
-        </w:rPr>
-        <w:t xml:space="preserve"> re</w:t>
+        <w:t xml:space="preserve"> get re</w:t>
       </w:r>
       <w:r>
         <w:rPr>
@@ -5625,21 +5161,12 @@
           <w:bCs/>
         </w:rPr>
       </w:pPr>
-      <w:proofErr w:type="gramStart"/>
-      <w:r>
-        <w:rPr>
-          <w:b/>
-          <w:bCs/>
-        </w:rPr>
-        <w:t>so</w:t>
-      </w:r>
-      <w:proofErr w:type="gramEnd"/>
-      <w:r>
-        <w:rPr>
-          <w:b/>
-          <w:bCs/>
-        </w:rPr>
-        <w:t xml:space="preserve"> in props </w:t>
+      <w:r>
+        <w:rPr>
+          <w:b/>
+          <w:bCs/>
+        </w:rPr>
+        <w:t xml:space="preserve">so in props </w:t>
       </w:r>
       <w:proofErr w:type="spellStart"/>
       <w:r>
@@ -5721,15 +5248,7 @@
         <w:t xml:space="preserve"> the system</w:t>
       </w:r>
       <w:r>
-        <w:t xml:space="preserve"> and get free </w:t>
-      </w:r>
-      <w:proofErr w:type="gramStart"/>
-      <w:r>
-        <w:t>deliveries(</w:t>
-      </w:r>
-      <w:proofErr w:type="gramEnd"/>
-      <w:r>
-        <w:t>who knows).</w:t>
+        <w:t xml:space="preserve"> and get free deliveries(who knows).</w:t>
       </w:r>
     </w:p>
     <w:p>
@@ -5774,15 +5293,7 @@
     </w:p>
     <w:p>
       <w:r>
-        <w:t xml:space="preserve">We could use set &amp;&amp; </w:t>
-      </w:r>
-      <w:proofErr w:type="gramStart"/>
-      <w:r>
-        <w:t>to  run</w:t>
-      </w:r>
-      <w:proofErr w:type="gramEnd"/>
-      <w:r>
-        <w:t xml:space="preserve"> an instruction on </w:t>
+        <w:t xml:space="preserve">We could use set &amp;&amp; to  run an instruction on </w:t>
       </w:r>
       <w:r>
         <w:t>t</w:t>
@@ -5886,15 +5397,7 @@
         <w:t>.</w:t>
       </w:r>
       <w:r>
-        <w:t xml:space="preserve"> It should not be like that </w:t>
-      </w:r>
-      <w:proofErr w:type="gramStart"/>
-      <w:r>
-        <w:t>a  user</w:t>
-      </w:r>
-      <w:proofErr w:type="gramEnd"/>
-      <w:r>
-        <w:t xml:space="preserve"> some in </w:t>
+        <w:t xml:space="preserve"> It should not be like that a  user some in </w:t>
       </w:r>
       <w:proofErr w:type="spellStart"/>
       <w:r>
@@ -5914,15 +5417,7 @@
         <w:t xml:space="preserve">oing any payment </w:t>
       </w:r>
       <w:r>
-        <w:t xml:space="preserve">that he will directly generate order </w:t>
-      </w:r>
-      <w:proofErr w:type="gramStart"/>
-      <w:r>
-        <w:t>page(</w:t>
-      </w:r>
-      <w:proofErr w:type="gramEnd"/>
-      <w:r>
-        <w:t>by redirecting aften order payment success)</w:t>
+        <w:t>that he will directly generate order page(by redirecting aften order payment success)</w:t>
       </w:r>
       <w:r>
         <w:t xml:space="preserve"> that’s why Paytm give us checksum </w:t>
@@ -5934,15 +5429,7 @@
         <w:t xml:space="preserve">. </w:t>
       </w:r>
       <w:r>
-        <w:t xml:space="preserve">How all </w:t>
-      </w:r>
-      <w:proofErr w:type="gramStart"/>
-      <w:r>
-        <w:t>these work</w:t>
-      </w:r>
-      <w:proofErr w:type="gramEnd"/>
-      <w:r>
-        <w:t xml:space="preserve"> how we can save ou</w:t>
+        <w:t>How all these work how we can save ou</w:t>
       </w:r>
       <w:r>
         <w:t>r site from hacking we will see.</w:t>
@@ -6151,98 +5638,61 @@
         <w:t>to paid.</w:t>
       </w:r>
       <w:r>
+        <w:t xml:space="preserve"> So there will be loss for you</w:t>
+      </w:r>
+      <w:r>
+        <w:t xml:space="preserve"> and you would not want to bear the loss.</w:t>
+      </w:r>
+      <w:r>
+        <w:t xml:space="preserve"> So what we will do is that when data rea</w:t>
+      </w:r>
+      <w:r>
+        <w:t>c</w:t>
+      </w:r>
+      <w:r>
+        <w:t xml:space="preserve">h our server from </w:t>
+      </w:r>
+      <w:r>
+        <w:t>P</w:t>
+      </w:r>
+      <w:r>
+        <w:t>aytm</w:t>
+      </w:r>
+      <w:r>
+        <w:t xml:space="preserve"> we will validate it.</w:t>
+      </w:r>
+      <w:r>
         <w:t xml:space="preserve"> </w:t>
       </w:r>
-      <w:proofErr w:type="gramStart"/>
-      <w:r>
-        <w:t>So</w:t>
-      </w:r>
-      <w:proofErr w:type="gramEnd"/>
-      <w:r>
-        <w:t xml:space="preserve"> there will be loss for you</w:t>
-      </w:r>
-      <w:r>
-        <w:t xml:space="preserve"> and you would not want to bear the loss.</w:t>
+      <w:r>
+        <w:t xml:space="preserve">and we will validate is it the data that the </w:t>
+      </w:r>
+      <w:r>
+        <w:t>P</w:t>
+      </w:r>
+      <w:r>
+        <w:t xml:space="preserve">aytm </w:t>
+      </w:r>
+      <w:r>
+        <w:t xml:space="preserve">sent </w:t>
+      </w:r>
+      <w:r>
+        <w:t xml:space="preserve"> or someone in middle </w:t>
+      </w:r>
+      <w:r>
+        <w:t>changed it.</w:t>
       </w:r>
       <w:r>
         <w:t xml:space="preserve"> </w:t>
       </w:r>
-      <w:proofErr w:type="gramStart"/>
-      <w:r>
-        <w:t>So</w:t>
-      </w:r>
-      <w:proofErr w:type="gramEnd"/>
-      <w:r>
-        <w:t xml:space="preserve"> what we will do is that when data rea</w:t>
-      </w:r>
-      <w:r>
-        <w:t>c</w:t>
-      </w:r>
-      <w:r>
-        <w:t xml:space="preserve">h our server from </w:t>
-      </w:r>
-      <w:r>
-        <w:t>P</w:t>
-      </w:r>
-      <w:r>
-        <w:t>aytm</w:t>
-      </w:r>
-      <w:r>
-        <w:t xml:space="preserve"> we will validate it.</w:t>
+      <w:r>
+        <w:t>that’s why people uses checksum.</w:t>
       </w:r>
       <w:r>
         <w:t xml:space="preserve"> </w:t>
       </w:r>
       <w:r>
-        <w:t xml:space="preserve">and we will validate is it the data that the </w:t>
-      </w:r>
-      <w:r>
-        <w:t>P</w:t>
-      </w:r>
-      <w:r>
-        <w:t xml:space="preserve">aytm </w:t>
-      </w:r>
-      <w:proofErr w:type="gramStart"/>
-      <w:r>
-        <w:t xml:space="preserve">sent </w:t>
-      </w:r>
-      <w:r>
-        <w:t xml:space="preserve"> or</w:t>
-      </w:r>
-      <w:proofErr w:type="gramEnd"/>
-      <w:r>
-        <w:t xml:space="preserve"> someone in middle </w:t>
-      </w:r>
-      <w:r>
-        <w:t>changed it.</w:t>
-      </w:r>
-      <w:r>
-        <w:t xml:space="preserve"> </w:t>
-      </w:r>
-      <w:r>
-        <w:t xml:space="preserve">that’s why people </w:t>
-      </w:r>
-      <w:proofErr w:type="gramStart"/>
-      <w:r>
-        <w:t>uses</w:t>
-      </w:r>
-      <w:proofErr w:type="gramEnd"/>
-      <w:r>
-        <w:t xml:space="preserve"> checksum.</w:t>
-      </w:r>
-      <w:r>
-        <w:t xml:space="preserve"> </w:t>
-      </w:r>
-      <w:r>
-        <w:t xml:space="preserve">The basic code </w:t>
-      </w:r>
-      <w:proofErr w:type="gramStart"/>
-      <w:r>
-        <w:t>look</w:t>
-      </w:r>
-      <w:proofErr w:type="gramEnd"/>
-      <w:r>
-        <w:t xml:space="preserve"> like below</w:t>
+        <w:t>The basic code look like below</w:t>
       </w:r>
     </w:p>
     <w:p>
@@ -6297,13 +5747,8 @@
       </w:r>
     </w:p>
     <w:p>
-      <w:proofErr w:type="gramStart"/>
-      <w:r>
-        <w:t>So</w:t>
-      </w:r>
-      <w:proofErr w:type="gramEnd"/>
-      <w:r>
-        <w:t xml:space="preserve"> we will use only object literal version of the body (the data we g</w:t>
+      <w:r>
+        <w:t>So we will use only object literal version of the body (the data we g</w:t>
       </w:r>
       <w:r>
         <w:t>o</w:t>
@@ -6337,23 +5782,7 @@
         <w:t xml:space="preserve"> </w:t>
       </w:r>
       <w:r>
-        <w:t xml:space="preserve">text response by return </w:t>
-      </w:r>
-      <w:proofErr w:type="gramStart"/>
-      <w:r>
-        <w:t>Response(</w:t>
-      </w:r>
-      <w:proofErr w:type="gramEnd"/>
-      <w:r>
-        <w:t>“text message</w:t>
-      </w:r>
-      <w:proofErr w:type="gramStart"/>
-      <w:r>
-        <w:t>”,{</w:t>
-      </w:r>
-      <w:proofErr w:type="gramEnd"/>
-      <w:r>
-        <w:t>status:&lt;status&gt;})</w:t>
+        <w:t>text response by return Response(“text message”,{status:&lt;status&gt;})</w:t>
       </w:r>
     </w:p>
     <w:p>
@@ -6921,15 +6350,7 @@
     </w:p>
     <w:p>
       <w:r>
-        <w:t xml:space="preserve">  </w:t>
-      </w:r>
-      <w:proofErr w:type="gramStart"/>
-      <w:r>
-        <w:t>{ "</w:t>
-      </w:r>
-      <w:proofErr w:type="gramEnd"/>
-      <w:r>
-        <w:t>name": "</w:t>
+        <w:t xml:space="preserve">  { "name": "</w:t>
       </w:r>
       <w:proofErr w:type="spellStart"/>
       <w:r>
@@ -6937,34 +6358,13 @@
       </w:r>
       <w:proofErr w:type="spellEnd"/>
       <w:r>
-        <w:t xml:space="preserve">", "price": </w:t>
-      </w:r>
-      <w:proofErr w:type="gramStart"/>
-      <w:r>
-        <w:t>499 }</w:t>
-      </w:r>
-      <w:proofErr w:type="gramEnd"/>
-      <w:r>
-        <w:t>,</w:t>
-      </w:r>
-    </w:p>
-    <w:p>
-      <w:r>
-        <w:t xml:space="preserve">  </w:t>
-      </w:r>
-      <w:proofErr w:type="gramStart"/>
-      <w:r>
-        <w:t>{ "</w:t>
-      </w:r>
-      <w:proofErr w:type="gramEnd"/>
-      <w:r>
-        <w:t xml:space="preserve">name": "Hoodie", "price": </w:t>
-      </w:r>
-      <w:proofErr w:type="gramStart"/>
-      <w:r>
-        <w:t>999 }</w:t>
-      </w:r>
-      <w:proofErr w:type="gramEnd"/>
+        <w:t>", "price": 499 },</w:t>
+      </w:r>
+    </w:p>
+    <w:p>
+      <w:r>
+        <w:t xml:space="preserve">  { "name": "Hoodie", "price": 999 }</w:t>
+      </w:r>
     </w:p>
     <w:p>
       <w:r>
@@ -7088,17 +6488,12 @@
     </w:p>
     <w:p>
       <w:proofErr w:type="spellStart"/>
-      <w:proofErr w:type="gramStart"/>
       <w:r>
         <w:t>app.get</w:t>
       </w:r>
       <w:proofErr w:type="spellEnd"/>
       <w:r>
-        <w:t>(</w:t>
-      </w:r>
-      <w:proofErr w:type="gramEnd"/>
-      <w:r>
-        <w:t>"/</w:t>
+        <w:t>("/</w:t>
       </w:r>
       <w:proofErr w:type="spellStart"/>
       <w:r>
@@ -7122,12 +6517,10 @@
         <w:t xml:space="preserve">  </w:t>
       </w:r>
       <w:proofErr w:type="spellStart"/>
-      <w:proofErr w:type="gramStart"/>
       <w:r>
         <w:t>res.json</w:t>
       </w:r>
       <w:proofErr w:type="spellEnd"/>
-      <w:proofErr w:type="gramEnd"/>
       <w:r>
         <w:t>(products)</w:t>
       </w:r>
@@ -7192,15 +6585,7 @@
     </w:p>
     <w:p>
       <w:r>
-        <w:t xml:space="preserve">  </w:t>
-      </w:r>
-      <w:proofErr w:type="gramStart"/>
-      <w:r>
-        <w:t>{ "</w:t>
-      </w:r>
-      <w:proofErr w:type="gramEnd"/>
-      <w:r>
-        <w:t>name": "</w:t>
+        <w:t xml:space="preserve">  { "name": "</w:t>
       </w:r>
       <w:proofErr w:type="spellStart"/>
       <w:r>
@@ -7208,13 +6593,8 @@
       </w:r>
       <w:proofErr w:type="spellEnd"/>
       <w:r>
-        <w:t xml:space="preserve">", "price": </w:t>
-      </w:r>
-      <w:proofErr w:type="gramStart"/>
-      <w:r>
-        <w:t>499 }</w:t>
-      </w:r>
-      <w:proofErr w:type="gramEnd"/>
+        <w:t>", "price": 499 }</w:t>
+      </w:r>
     </w:p>
     <w:p>
       <w:r>
@@ -7638,15 +7018,7 @@
     </w:p>
     <w:p>
       <w:r>
-        <w:t xml:space="preserve">export async function </w:t>
-      </w:r>
-      <w:proofErr w:type="gramStart"/>
-      <w:r>
-        <w:t>GET(</w:t>
-      </w:r>
-      <w:proofErr w:type="gramEnd"/>
-      <w:r>
-        <w:t>) {</w:t>
+        <w:t>export async function GET() {</w:t>
       </w:r>
     </w:p>
     <w:p>
@@ -7826,21 +7198,12 @@
           <w:bCs/>
         </w:rPr>
       </w:pPr>
-      <w:proofErr w:type="gramStart"/>
-      <w:r>
-        <w:rPr>
-          <w:b/>
-          <w:bCs/>
-        </w:rPr>
-        <w:t>so</w:t>
-      </w:r>
-      <w:proofErr w:type="gramEnd"/>
-      <w:r>
-        <w:rPr>
-          <w:b/>
-          <w:bCs/>
-        </w:rPr>
-        <w:t xml:space="preserve"> server does it automatically</w:t>
+      <w:r>
+        <w:rPr>
+          <w:b/>
+          <w:bCs/>
+        </w:rPr>
+        <w:t>so server does it automatically</w:t>
       </w:r>
     </w:p>
     <w:p>
@@ -7855,12 +7218,10 @@
     </w:p>
     <w:p>
       <w:proofErr w:type="spellStart"/>
-      <w:proofErr w:type="gramStart"/>
       <w:r>
         <w:t>res.json</w:t>
       </w:r>
       <w:proofErr w:type="spellEnd"/>
-      <w:proofErr w:type="gramEnd"/>
       <w:r>
         <w:t>(data)</w:t>
       </w:r>
@@ -7936,12 +7297,10 @@
         <w:t>If server/framework has a JSON helper (</w:t>
       </w:r>
       <w:proofErr w:type="spellStart"/>
-      <w:proofErr w:type="gramStart"/>
       <w:r>
         <w:t>res.json</w:t>
       </w:r>
       <w:proofErr w:type="spellEnd"/>
-      <w:proofErr w:type="gramEnd"/>
       <w:r>
         <w:t xml:space="preserve">, </w:t>
       </w:r>
@@ -8008,12 +7367,10 @@
     </w:p>
     <w:p>
       <w:proofErr w:type="spellStart"/>
-      <w:proofErr w:type="gramStart"/>
       <w:r>
         <w:t>res.send</w:t>
       </w:r>
       <w:proofErr w:type="spellEnd"/>
-      <w:proofErr w:type="gramEnd"/>
       <w:r>
         <w:t>('{"</w:t>
       </w:r>
@@ -8058,21 +7415,12 @@
           <w:bCs/>
         </w:rPr>
       </w:pPr>
-      <w:proofErr w:type="gramStart"/>
-      <w:r>
-        <w:rPr>
-          <w:b/>
-          <w:bCs/>
-        </w:rPr>
-        <w:t>so</w:t>
-      </w:r>
-      <w:proofErr w:type="gramEnd"/>
-      <w:r>
-        <w:rPr>
-          <w:b/>
-          <w:bCs/>
-        </w:rPr>
-        <w:t xml:space="preserve"> tell me do we import </w:t>
+      <w:r>
+        <w:rPr>
+          <w:b/>
+          <w:bCs/>
+        </w:rPr>
+        <w:t xml:space="preserve">so tell me do we import </w:t>
       </w:r>
       <w:proofErr w:type="spellStart"/>
       <w:r>
@@ -8342,15 +7690,7 @@
         <w:t>S</w:t>
       </w:r>
       <w:r>
-        <w:t xml:space="preserve">o </w:t>
-      </w:r>
-      <w:proofErr w:type="gramStart"/>
-      <w:r>
-        <w:t>far</w:t>
-      </w:r>
-      <w:proofErr w:type="gramEnd"/>
-      <w:r>
-        <w:t xml:space="preserve"> the </w:t>
+        <w:t xml:space="preserve">o far the </w:t>
       </w:r>
       <w:proofErr w:type="spellStart"/>
       <w:r>
@@ -8367,18 +7707,10 @@
         <w:t xml:space="preserve"> fetch</w:t>
       </w:r>
       <w:r>
-        <w:t xml:space="preserve">. We fetched it with an </w:t>
-      </w:r>
-      <w:proofErr w:type="gramStart"/>
-      <w:r>
-        <w:t>API</w:t>
-      </w:r>
-      <w:r>
-        <w:t>( by</w:t>
-      </w:r>
-      <w:proofErr w:type="gramEnd"/>
-      <w:r>
-        <w:t xml:space="preserve"> backend we </w:t>
+        <w:t>. We fetched it with an API</w:t>
+      </w:r>
+      <w:r>
+        <w:t xml:space="preserve">( by backend we </w:t>
       </w:r>
       <w:proofErr w:type="spellStart"/>
       <w:r>
@@ -8393,7 +7725,6 @@
         <w:t>Nextjs</w:t>
       </w:r>
       <w:proofErr w:type="spellEnd"/>
-      <w:proofErr w:type="gramStart"/>
       <w:r>
         <w:t>)</w:t>
       </w:r>
@@ -8401,11 +7732,7 @@
         <w:t xml:space="preserve"> </w:t>
       </w:r>
       <w:r>
-        <w:t>.</w:t>
-      </w:r>
-      <w:proofErr w:type="gramEnd"/>
-      <w:r>
-        <w:t xml:space="preserve"> But we would want that out </w:t>
+        <w:t xml:space="preserve">. But we would want that out </w:t>
       </w:r>
       <w:proofErr w:type="spellStart"/>
       <w:r>
@@ -8470,15 +7797,7 @@
         <w:t xml:space="preserve"> and in most of the cases does not get changed in the future</w:t>
       </w:r>
       <w:r>
-        <w:t xml:space="preserve">. </w:t>
-      </w:r>
-      <w:proofErr w:type="gramStart"/>
-      <w:r>
-        <w:t>Lets</w:t>
-      </w:r>
-      <w:proofErr w:type="gramEnd"/>
-      <w:r>
-        <w:t xml:space="preserve"> </w:t>
+        <w:t xml:space="preserve">. Lets </w:t>
       </w:r>
       <w:r>
         <w:t xml:space="preserve">see how we can do this in </w:t>
@@ -8592,13 +7911,8 @@
     </w:p>
     <w:p/>
     <w:p>
-      <w:proofErr w:type="gramStart"/>
-      <w:r>
-        <w:t>Usually</w:t>
-      </w:r>
-      <w:proofErr w:type="gramEnd"/>
-      <w:r>
-        <w:t xml:space="preserve"> you can serve a </w:t>
+      <w:r>
+        <w:t xml:space="preserve">Usually you can serve a </w:t>
       </w:r>
       <w:proofErr w:type="spellStart"/>
       <w:r>
@@ -8730,26 +8044,71 @@
         <w:t xml:space="preserve">What we will do in track order is that </w:t>
       </w:r>
       <w:r>
-        <w:t xml:space="preserve">if delivery status unshipped then if we add link in delivery </w:t>
-      </w:r>
-      <w:proofErr w:type="gramStart"/>
-      <w:r>
-        <w:t>status(</w:t>
-      </w:r>
-      <w:proofErr w:type="gramEnd"/>
-      <w:r>
-        <w:t xml:space="preserve">who knows) </w:t>
-      </w:r>
-      <w:r>
-        <w:t xml:space="preserve">then that link will open on clicking in track </w:t>
-      </w:r>
-      <w:proofErr w:type="gramStart"/>
-      <w:r>
-        <w:t>order(</w:t>
-      </w:r>
-      <w:proofErr w:type="gramEnd"/>
-      <w:r>
-        <w:t>who knows)</w:t>
+        <w:t xml:space="preserve">if delivery status unshipped then if we add link in delivery status(who knows) </w:t>
+      </w:r>
+      <w:r>
+        <w:t>then that link will open on clicking in track order(who knows)</w:t>
+      </w:r>
+    </w:p>
+    <w:p>
+      <w:pPr>
+        <w:rPr>
+          <w:b/>
+          <w:bCs/>
+        </w:rPr>
+      </w:pPr>
+      <w:r>
+        <w:rPr>
+          <w:b/>
+          <w:bCs/>
+        </w:rPr>
+        <w:t>New Lesson</w:t>
+      </w:r>
+    </w:p>
+    <w:p>
+      <w:r>
+        <w:t>We will not allow user to change email in my account (w</w:t>
+      </w:r>
+      <w:r>
+        <w:t>ho</w:t>
+      </w:r>
+      <w:r>
+        <w:t xml:space="preserve"> knows)</w:t>
+      </w:r>
+      <w:r>
+        <w:t xml:space="preserve">. </w:t>
+      </w:r>
+      <w:r>
+        <w:t xml:space="preserve">By filling account </w:t>
+      </w:r>
+      <w:r>
+        <w:t>user checkout pages will have fields already filled.</w:t>
+      </w:r>
+    </w:p>
+    <w:p>
+      <w:r>
+        <w:rPr>
+          <w:b/>
+          <w:bCs/>
+          <w:color w:val="EE0000"/>
+        </w:rPr>
+        <w:t xml:space="preserve">If we don’t want something from an object while destructing then we don’t mention it in the </w:t>
+      </w:r>
+      <w:r>
+        <w:rPr>
+          <w:b/>
+          <w:bCs/>
+          <w:color w:val="EE0000"/>
+        </w:rPr>
+        <w:t>items of the destruct curly braces</w:t>
+      </w:r>
+      <w:r>
+        <w:t xml:space="preserve">. </w:t>
+      </w:r>
+    </w:p>
+    <w:p>
+      <w:r>
+        <w:t>One example is as shown below</w:t>
       </w:r>
     </w:p>
     <w:p>
@@ -8758,10 +8117,10 @@
       </w:pPr>
       <w:r>
         <w:drawing>
-          <wp:inline distT="0" distB="0" distL="0" distR="0" wp14:anchorId="26FD73D2" wp14:editId="680EE311">
-            <wp:extent cx="5731510" cy="1821815"/>
-            <wp:effectExtent l="0" t="0" r="2540" b="6985"/>
-            <wp:docPr id="2041522680" name="Picture 1"/>
+          <wp:inline distT="0" distB="0" distL="0" distR="0" wp14:anchorId="66733B05" wp14:editId="6DAC0C1A">
+            <wp:extent cx="3219899" cy="200053"/>
+            <wp:effectExtent l="0" t="0" r="0" b="9525"/>
+            <wp:docPr id="1082482962" name="Picture 1"/>
             <wp:cNvGraphicFramePr>
               <a:graphicFrameLocks xmlns:a="http://schemas.openxmlformats.org/drawingml/2006/main" noChangeAspect="1"/>
             </wp:cNvGraphicFramePr>
@@ -8769,7 +8128,7 @@
               <a:graphicData uri="http://schemas.openxmlformats.org/drawingml/2006/picture">
                 <pic:pic xmlns:pic="http://schemas.openxmlformats.org/drawingml/2006/picture">
                   <pic:nvPicPr>
-                    <pic:cNvPr id="2041522680" name=""/>
+                    <pic:cNvPr id="1082482962" name=""/>
                     <pic:cNvPicPr/>
                   </pic:nvPicPr>
                   <pic:blipFill>
@@ -8781,7 +8140,7 @@
                   <pic:spPr>
                     <a:xfrm>
                       <a:off x="0" y="0"/>
-                      <a:ext cx="5731510" cy="1821815"/>
+                      <a:ext cx="3219899" cy="200053"/>
                     </a:xfrm>
                     <a:prstGeom prst="rect">
                       <a:avLst/>
@@ -8792,6 +8151,531 @@
             </a:graphic>
           </wp:inline>
         </w:drawing>
+      </w:r>
+    </w:p>
+    <w:p>
+      <w:r>
+        <w:t xml:space="preserve">We did not want password so </w:t>
+      </w:r>
+      <w:r>
+        <w:t xml:space="preserve">we </w:t>
+      </w:r>
+      <w:r>
+        <w:t>did n</w:t>
+      </w:r>
+      <w:r>
+        <w:t>o</w:t>
+      </w:r>
+      <w:r>
+        <w:t xml:space="preserve">t mentioned it in the </w:t>
+      </w:r>
+      <w:proofErr w:type="spellStart"/>
+      <w:r>
+        <w:t>destructure</w:t>
+      </w:r>
+      <w:proofErr w:type="spellEnd"/>
+      <w:r>
+        <w:t xml:space="preserve"> bracket.</w:t>
+      </w:r>
+    </w:p>
+    <w:p>
+      <w:pPr>
+        <w:rPr>
+          <w:b/>
+          <w:bCs/>
+          <w:color w:val="EE0000"/>
+        </w:rPr>
+      </w:pPr>
+      <w:r>
+        <w:rPr>
+          <w:b/>
+          <w:bCs/>
+          <w:color w:val="EE0000"/>
+        </w:rPr>
+        <w:t xml:space="preserve">We observed that if you bring major changes in models then you need to restart the server </w:t>
+      </w:r>
+      <w:r>
+        <w:rPr>
+          <w:b/>
+          <w:bCs/>
+          <w:color w:val="EE0000"/>
+        </w:rPr>
+        <w:t xml:space="preserve">as we saw in our case </w:t>
+      </w:r>
+      <w:r>
+        <w:rPr>
+          <w:b/>
+          <w:bCs/>
+          <w:color w:val="EE0000"/>
+        </w:rPr>
+        <w:t xml:space="preserve">where we added </w:t>
+      </w:r>
+      <w:r>
+        <w:rPr>
+          <w:b/>
+          <w:bCs/>
+          <w:color w:val="EE0000"/>
+        </w:rPr>
+        <w:t xml:space="preserve">fields in our model </w:t>
+      </w:r>
+      <w:r>
+        <w:rPr>
+          <w:b/>
+          <w:bCs/>
+          <w:color w:val="EE0000"/>
+        </w:rPr>
+        <w:t xml:space="preserve">and we use find </w:t>
+      </w:r>
+      <w:r>
+        <w:rPr>
+          <w:b/>
+          <w:bCs/>
+          <w:color w:val="EE0000"/>
+        </w:rPr>
+        <w:t xml:space="preserve">method </w:t>
+      </w:r>
+      <w:r>
+        <w:rPr>
+          <w:b/>
+          <w:bCs/>
+          <w:color w:val="EE0000"/>
+        </w:rPr>
+        <w:t>of our Model</w:t>
+      </w:r>
+      <w:r>
+        <w:rPr>
+          <w:b/>
+          <w:bCs/>
+          <w:color w:val="EE0000"/>
+        </w:rPr>
+        <w:t xml:space="preserve"> </w:t>
+      </w:r>
+      <w:r>
+        <w:rPr>
+          <w:b/>
+          <w:bCs/>
+          <w:color w:val="EE0000"/>
+        </w:rPr>
+        <w:t xml:space="preserve">and </w:t>
+      </w:r>
+      <w:r>
+        <w:rPr>
+          <w:b/>
+          <w:bCs/>
+          <w:color w:val="EE0000"/>
+        </w:rPr>
+        <w:t xml:space="preserve">then we </w:t>
+      </w:r>
+      <w:r>
+        <w:rPr>
+          <w:b/>
+          <w:bCs/>
+          <w:color w:val="EE0000"/>
+        </w:rPr>
+        <w:t>did</w:t>
+      </w:r>
+      <w:r>
+        <w:rPr>
+          <w:b/>
+          <w:bCs/>
+          <w:color w:val="EE0000"/>
+        </w:rPr>
+        <w:t xml:space="preserve"> not get the fie</w:t>
+      </w:r>
+      <w:r>
+        <w:rPr>
+          <w:b/>
+          <w:bCs/>
+          <w:color w:val="EE0000"/>
+        </w:rPr>
+        <w:t>l</w:t>
+      </w:r>
+      <w:r>
+        <w:rPr>
+          <w:b/>
+          <w:bCs/>
+          <w:color w:val="EE0000"/>
+        </w:rPr>
+        <w:t xml:space="preserve">ds in the document </w:t>
+      </w:r>
+      <w:r>
+        <w:rPr>
+          <w:b/>
+          <w:bCs/>
+          <w:color w:val="EE0000"/>
+        </w:rPr>
+        <w:t>we got back</w:t>
+      </w:r>
+      <w:r>
+        <w:rPr>
+          <w:b/>
+          <w:bCs/>
+          <w:color w:val="EE0000"/>
+        </w:rPr>
+        <w:t xml:space="preserve"> </w:t>
+      </w:r>
+      <w:r>
+        <w:rPr>
+          <w:b/>
+          <w:bCs/>
+          <w:color w:val="EE0000"/>
+        </w:rPr>
+        <w:t>and not</w:t>
+      </w:r>
+      <w:r>
+        <w:rPr>
+          <w:b/>
+          <w:bCs/>
+          <w:color w:val="EE0000"/>
+        </w:rPr>
+        <w:t xml:space="preserve"> </w:t>
+      </w:r>
+      <w:r>
+        <w:rPr>
+          <w:b/>
+          <w:bCs/>
+          <w:color w:val="EE0000"/>
+        </w:rPr>
+        <w:t xml:space="preserve">even with their default </w:t>
+      </w:r>
+      <w:r>
+        <w:rPr>
+          <w:b/>
+          <w:bCs/>
+          <w:color w:val="EE0000"/>
+        </w:rPr>
+        <w:t>values.</w:t>
+      </w:r>
+      <w:r>
+        <w:rPr>
+          <w:b/>
+          <w:bCs/>
+          <w:color w:val="EE0000"/>
+        </w:rPr>
+        <w:t xml:space="preserve"> </w:t>
+      </w:r>
+      <w:r>
+        <w:rPr>
+          <w:b/>
+          <w:bCs/>
+          <w:color w:val="EE0000"/>
+        </w:rPr>
+        <w:t xml:space="preserve">But when we restarted the server </w:t>
+      </w:r>
+      <w:r>
+        <w:rPr>
+          <w:b/>
+          <w:bCs/>
+          <w:color w:val="EE0000"/>
+        </w:rPr>
+        <w:t>then document start appearing with their default values</w:t>
+      </w:r>
+      <w:r>
+        <w:rPr>
+          <w:b/>
+          <w:bCs/>
+          <w:color w:val="EE0000"/>
+        </w:rPr>
+        <w:t xml:space="preserve"> in the console but they will not be present in the </w:t>
+      </w:r>
+      <w:proofErr w:type="spellStart"/>
+      <w:r>
+        <w:rPr>
+          <w:b/>
+          <w:bCs/>
+          <w:color w:val="EE0000"/>
+        </w:rPr>
+        <w:t>M</w:t>
+      </w:r>
+      <w:r>
+        <w:rPr>
+          <w:b/>
+          <w:bCs/>
+          <w:color w:val="EE0000"/>
+        </w:rPr>
+        <w:t>ongdb</w:t>
+      </w:r>
+      <w:proofErr w:type="spellEnd"/>
+      <w:r>
+        <w:rPr>
+          <w:b/>
+          <w:bCs/>
+          <w:color w:val="EE0000"/>
+        </w:rPr>
+        <w:t xml:space="preserve"> data as the struct</w:t>
+      </w:r>
+      <w:r>
+        <w:rPr>
+          <w:b/>
+          <w:bCs/>
+          <w:color w:val="EE0000"/>
+        </w:rPr>
+        <w:t>u</w:t>
+      </w:r>
+      <w:r>
+        <w:rPr>
+          <w:b/>
+          <w:bCs/>
+          <w:color w:val="EE0000"/>
+        </w:rPr>
+        <w:t>r</w:t>
+      </w:r>
+      <w:r>
+        <w:rPr>
+          <w:b/>
+          <w:bCs/>
+          <w:color w:val="EE0000"/>
+        </w:rPr>
+        <w:t>e</w:t>
+      </w:r>
+      <w:r>
+        <w:rPr>
+          <w:b/>
+          <w:bCs/>
+          <w:color w:val="EE0000"/>
+        </w:rPr>
+        <w:t xml:space="preserve"> is old as comp</w:t>
+      </w:r>
+      <w:r>
+        <w:rPr>
+          <w:b/>
+          <w:bCs/>
+          <w:color w:val="EE0000"/>
+        </w:rPr>
+        <w:t>a</w:t>
+      </w:r>
+      <w:r>
+        <w:rPr>
+          <w:b/>
+          <w:bCs/>
+          <w:color w:val="EE0000"/>
+        </w:rPr>
+        <w:t>red to our new structure.</w:t>
+      </w:r>
+      <w:r>
+        <w:rPr>
+          <w:b/>
+          <w:bCs/>
+          <w:color w:val="EE0000"/>
+        </w:rPr>
+        <w:t xml:space="preserve"> And later</w:t>
+      </w:r>
+      <w:r>
+        <w:rPr>
+          <w:b/>
+          <w:bCs/>
+          <w:color w:val="EE0000"/>
+        </w:rPr>
+        <w:t xml:space="preserve"> </w:t>
+      </w:r>
+      <w:r>
+        <w:rPr>
+          <w:b/>
+          <w:bCs/>
+          <w:color w:val="EE0000"/>
+        </w:rPr>
+        <w:t>if we update the old docum</w:t>
+      </w:r>
+      <w:r>
+        <w:rPr>
+          <w:b/>
+          <w:bCs/>
+          <w:color w:val="EE0000"/>
+        </w:rPr>
+        <w:t>e</w:t>
+      </w:r>
+      <w:r>
+        <w:rPr>
+          <w:b/>
+          <w:bCs/>
+          <w:color w:val="EE0000"/>
+        </w:rPr>
+        <w:t>nts with newer fi</w:t>
+      </w:r>
+      <w:r>
+        <w:rPr>
+          <w:b/>
+          <w:bCs/>
+          <w:color w:val="EE0000"/>
+        </w:rPr>
+        <w:t>e</w:t>
+      </w:r>
+      <w:r>
+        <w:rPr>
+          <w:b/>
+          <w:bCs/>
+          <w:color w:val="EE0000"/>
+        </w:rPr>
+        <w:t>ld then they will be updated</w:t>
+      </w:r>
+      <w:r>
+        <w:rPr>
+          <w:b/>
+          <w:bCs/>
+          <w:color w:val="EE0000"/>
+        </w:rPr>
+        <w:t xml:space="preserve"> as the newer fields are </w:t>
+      </w:r>
+      <w:r>
+        <w:rPr>
+          <w:b/>
+          <w:bCs/>
+          <w:color w:val="EE0000"/>
+        </w:rPr>
+        <w:t xml:space="preserve">mentioned in the </w:t>
+      </w:r>
+      <w:r>
+        <w:rPr>
+          <w:b/>
+          <w:bCs/>
+          <w:color w:val="EE0000"/>
+        </w:rPr>
+        <w:t>new Schema.</w:t>
+      </w:r>
+    </w:p>
+    <w:p>
+      <w:pPr>
+        <w:rPr>
+          <w:b/>
+          <w:bCs/>
+          <w:color w:val="EE0000"/>
+        </w:rPr>
+      </w:pPr>
+      <w:r>
+        <w:rPr>
+          <w:b/>
+          <w:bCs/>
+          <w:color w:val="EE0000"/>
+        </w:rPr>
+        <w:t>As we know state gets update</w:t>
+      </w:r>
+      <w:r>
+        <w:rPr>
+          <w:b/>
+          <w:bCs/>
+          <w:color w:val="EE0000"/>
+        </w:rPr>
+        <w:t>d</w:t>
+      </w:r>
+      <w:r>
+        <w:rPr>
+          <w:b/>
+          <w:bCs/>
+          <w:color w:val="EE0000"/>
+        </w:rPr>
+        <w:t xml:space="preserve"> as the calling stack is empty </w:t>
+      </w:r>
+      <w:r>
+        <w:rPr>
+          <w:b/>
+          <w:bCs/>
+          <w:color w:val="EE0000"/>
+        </w:rPr>
+        <w:t xml:space="preserve">so the current value will be given to state only </w:t>
+      </w:r>
+      <w:r>
+        <w:rPr>
+          <w:b/>
+          <w:bCs/>
+          <w:color w:val="EE0000"/>
+        </w:rPr>
+        <w:t>after there is no calling stack or not fun</w:t>
+      </w:r>
+      <w:r>
+        <w:rPr>
+          <w:b/>
+          <w:bCs/>
+          <w:color w:val="EE0000"/>
+        </w:rPr>
+        <w:t>c</w:t>
+      </w:r>
+      <w:r>
+        <w:rPr>
+          <w:b/>
+          <w:bCs/>
+          <w:color w:val="EE0000"/>
+        </w:rPr>
+        <w:t>tio</w:t>
+      </w:r>
+      <w:r>
+        <w:rPr>
+          <w:b/>
+          <w:bCs/>
+          <w:color w:val="EE0000"/>
+        </w:rPr>
+        <w:t>n</w:t>
+      </w:r>
+      <w:r>
+        <w:rPr>
+          <w:b/>
+          <w:bCs/>
+          <w:color w:val="EE0000"/>
+        </w:rPr>
+        <w:t xml:space="preserve"> to r</w:t>
+      </w:r>
+      <w:r>
+        <w:rPr>
+          <w:b/>
+          <w:bCs/>
+          <w:color w:val="EE0000"/>
+        </w:rPr>
+        <w:t>u</w:t>
+      </w:r>
+      <w:r>
+        <w:rPr>
+          <w:b/>
+          <w:bCs/>
+          <w:color w:val="EE0000"/>
+        </w:rPr>
+        <w:t xml:space="preserve">n on stack so if we use a function in side a useEffect then pass it the </w:t>
+      </w:r>
+      <w:r>
+        <w:rPr>
+          <w:b/>
+          <w:bCs/>
+          <w:color w:val="EE0000"/>
+        </w:rPr>
+        <w:t xml:space="preserve">new </w:t>
+      </w:r>
+      <w:r>
+        <w:rPr>
+          <w:b/>
+          <w:bCs/>
+          <w:color w:val="EE0000"/>
+        </w:rPr>
+        <w:t>value as an argument</w:t>
+      </w:r>
+      <w:r>
+        <w:rPr>
+          <w:b/>
+          <w:bCs/>
+          <w:color w:val="EE0000"/>
+        </w:rPr>
+        <w:t xml:space="preserve"> i</w:t>
+      </w:r>
+      <w:r>
+        <w:rPr>
+          <w:b/>
+          <w:bCs/>
+          <w:color w:val="EE0000"/>
+        </w:rPr>
+        <w:t>nstead o</w:t>
+      </w:r>
+      <w:r>
+        <w:rPr>
+          <w:b/>
+          <w:bCs/>
+          <w:color w:val="EE0000"/>
+        </w:rPr>
+        <w:t>f</w:t>
+      </w:r>
+      <w:r>
+        <w:rPr>
+          <w:b/>
+          <w:bCs/>
+          <w:color w:val="EE0000"/>
+        </w:rPr>
+        <w:t xml:space="preserve"> state as state contains previous value.</w:t>
       </w:r>
     </w:p>
     <w:p/>

</xml_diff>